<commit_message>
Safety report almost complete. A sketch of the experimental setup is needed.
</commit_message>
<xml_diff>
--- a/General Safety Induction/2023_StructuresLab_Safety_Template_final.docx
+++ b/General Safety Induction/2023_StructuresLab_Safety_Template_final.docx
@@ -1,6 +1,6 @@
 
 <file path=word/document.xml><?xml version="1.0" encoding="utf-8"?>
-<w:document xmlns:wpc="http://schemas.microsoft.com/office/word/2010/wordprocessingCanvas" xmlns:cx="http://schemas.microsoft.com/office/drawing/2014/chartex" xmlns:cx1="http://schemas.microsoft.com/office/drawing/2015/9/8/chartex" xmlns:cx2="http://schemas.microsoft.com/office/drawing/2015/10/21/chartex" xmlns:cx3="http://schemas.microsoft.com/office/drawing/2016/5/9/chartex" xmlns:cx4="http://schemas.microsoft.com/office/drawing/2016/5/10/chartex" xmlns:cx5="http://schemas.microsoft.com/office/drawing/2016/5/11/chartex" xmlns:cx6="http://schemas.microsoft.com/office/drawing/2016/5/12/chartex" xmlns:cx7="http://schemas.microsoft.com/office/drawing/2016/5/13/chartex" xmlns:cx8="http://schemas.microsoft.com/office/drawing/2016/5/14/chartex" xmlns:mc="http://schemas.openxmlformats.org/markup-compatibility/2006" xmlns:aink="http://schemas.microsoft.com/office/drawing/2016/ink" xmlns:am3d="http://schemas.microsoft.com/office/drawing/2017/model3d" xmlns:o="urn:schemas-microsoft-com:office:office" xmlns:oel="http://schemas.microsoft.com/office/2019/extlst" xmlns:r="http://schemas.openxmlformats.org/officeDocument/2006/relationships" xmlns:m="http://schemas.openxmlformats.org/officeDocument/2006/math" xmlns:v="urn:schemas-microsoft-com:vml" xmlns:wp14="http://schemas.microsoft.com/office/word/2010/wordprocessingDrawing" xmlns:wp="http://schemas.openxmlformats.org/drawingml/2006/wordprocessingDrawing" xmlns:w10="urn:schemas-microsoft-com:office:word" xmlns:w="http://schemas.openxmlformats.org/wordprocessingml/2006/main" xmlns:w14="http://schemas.microsoft.com/office/word/2010/wordml" xmlns:w15="http://schemas.microsoft.com/office/word/2012/wordml" xmlns:w16cex="http://schemas.microsoft.com/office/word/2018/wordml/cex" xmlns:w16cid="http://schemas.microsoft.com/office/word/2016/wordml/cid" xmlns:w16="http://schemas.microsoft.com/office/word/2018/wordml" xmlns:w16sdtdh="http://schemas.microsoft.com/office/word/2020/wordml/sdtdatahash" xmlns:w16se="http://schemas.microsoft.com/office/word/2015/wordml/symex" xmlns:wpg="http://schemas.microsoft.com/office/word/2010/wordprocessingGroup" xmlns:wpi="http://schemas.microsoft.com/office/word/2010/wordprocessingInk" xmlns:wne="http://schemas.microsoft.com/office/word/2006/wordml" xmlns:wps="http://schemas.microsoft.com/office/word/2010/wordprocessingShape" mc:Ignorable="w14 w15 w16se w16cid w16 w16cex w16sdtdh wp14">
+<w:document xmlns:wpc="http://schemas.microsoft.com/office/word/2010/wordprocessingCanvas" xmlns:cx="http://schemas.microsoft.com/office/drawing/2014/chartex" xmlns:cx1="http://schemas.microsoft.com/office/drawing/2015/9/8/chartex" xmlns:cx2="http://schemas.microsoft.com/office/drawing/2015/10/21/chartex" xmlns:cx3="http://schemas.microsoft.com/office/drawing/2016/5/9/chartex" xmlns:cx4="http://schemas.microsoft.com/office/drawing/2016/5/10/chartex" xmlns:cx5="http://schemas.microsoft.com/office/drawing/2016/5/11/chartex" xmlns:cx6="http://schemas.microsoft.com/office/drawing/2016/5/12/chartex" xmlns:cx7="http://schemas.microsoft.com/office/drawing/2016/5/13/chartex" xmlns:cx8="http://schemas.microsoft.com/office/drawing/2016/5/14/chartex" xmlns:mc="http://schemas.openxmlformats.org/markup-compatibility/2006" xmlns:aink="http://schemas.microsoft.com/office/drawing/2016/ink" xmlns:am3d="http://schemas.microsoft.com/office/drawing/2017/model3d" xmlns:o="urn:schemas-microsoft-com:office:office" xmlns:oel="http://schemas.microsoft.com/office/2019/extlst" xmlns:r="http://schemas.openxmlformats.org/officeDocument/2006/relationships" xmlns:m="http://schemas.openxmlformats.org/officeDocument/2006/math" xmlns:v="urn:schemas-microsoft-com:vml" xmlns:wp14="http://schemas.microsoft.com/office/word/2010/wordprocessingDrawing" xmlns:wp="http://schemas.openxmlformats.org/drawingml/2006/wordprocessingDrawing" xmlns:w10="urn:schemas-microsoft-com:office:word" xmlns:w="http://schemas.openxmlformats.org/wordprocessingml/2006/main" xmlns:w14="http://schemas.microsoft.com/office/word/2010/wordml" xmlns:w15="http://schemas.microsoft.com/office/word/2012/wordml" xmlns:w16cex="http://schemas.microsoft.com/office/word/2018/wordml/cex" xmlns:w16cid="http://schemas.microsoft.com/office/word/2016/wordml/cid" xmlns:w16="http://schemas.microsoft.com/office/word/2018/wordml" xmlns:w16du="http://schemas.microsoft.com/office/word/2023/wordml/word16du" xmlns:w16sdtdh="http://schemas.microsoft.com/office/word/2020/wordml/sdtdatahash" xmlns:w16sdtfl="http://schemas.microsoft.com/office/word/2024/wordml/sdtformatlock" xmlns:w16se="http://schemas.microsoft.com/office/word/2015/wordml/symex" xmlns:wpg="http://schemas.microsoft.com/office/word/2010/wordprocessingGroup" xmlns:wpi="http://schemas.microsoft.com/office/word/2010/wordprocessingInk" xmlns:wne="http://schemas.microsoft.com/office/word/2006/wordml" xmlns:wps="http://schemas.microsoft.com/office/word/2010/wordprocessingShape" mc:Ignorable="w14 w15 w16se w16cid w16 w16cex w16sdtdh w16sdtfl w16du wp14">
   <w:body>
     <w:p>
       <w:pPr>
@@ -20,7 +20,7 @@
         <mc:AlternateContent>
           <mc:Choice Requires="wps">
             <w:drawing>
-              <wp:anchor distT="45720" distB="45720" distL="114300" distR="114300" simplePos="0" relativeHeight="251665408" behindDoc="0" locked="0" layoutInCell="1" allowOverlap="1" wp14:anchorId="4B85D3C5" wp14:editId="43AD3E00">
+              <wp:anchor distT="45720" distB="45720" distL="114300" distR="114300" simplePos="0" relativeHeight="251658240" behindDoc="0" locked="0" layoutInCell="1" allowOverlap="1" wp14:anchorId="4B85D3C5" wp14:editId="43AD3E00">
                 <wp:simplePos x="0" y="0"/>
                 <wp:positionH relativeFrom="margin">
                   <wp:posOffset>289560</wp:posOffset>
@@ -820,18 +820,8 @@
                                       <w:sz w:val="24"/>
                                       <w:szCs w:val="24"/>
                                     </w:rPr>
-                                    <w:t xml:space="preserve"> </w:t>
+                                    <w:t xml:space="preserve"> Zietsman</w:t>
                                   </w:r>
-                                  <w:proofErr w:type="spellStart"/>
-                                  <w:r>
-                                    <w:rPr>
-                                      <w:rFonts w:ascii="Arial" w:eastAsia="Arial" w:hAnsi="Arial"/>
-                                      <w:sz w:val="24"/>
-                                      <w:szCs w:val="24"/>
-                                    </w:rPr>
-                                    <w:t>Zietsman</w:t>
-                                  </w:r>
-                                  <w:proofErr w:type="spellEnd"/>
                                   <w:r>
                                     <w:rPr>
                                       <w:rFonts w:ascii="Arial" w:eastAsia="Arial" w:hAnsi="Arial"/>
@@ -1713,7 +1703,6 @@
                                   <w14:uncheckedState w14:val="2610" w14:font="MS Gothic"/>
                                 </w14:checkbox>
                               </w:sdtPr>
-                              <w:sdtEndPr/>
                               <w:sdtContent>
                                 <w:r>
                                   <w:rPr>
@@ -1772,7 +1761,6 @@
                                   <w14:uncheckedState w14:val="2610" w14:font="MS Gothic"/>
                                 </w14:checkbox>
                               </w:sdtPr>
-                              <w:sdtEndPr/>
                               <w:sdtContent>
                                 <w:r>
                                   <w:rPr>
@@ -1968,7 +1956,6 @@
                                   <w14:uncheckedState w14:val="2610" w14:font="MS Gothic"/>
                                 </w14:checkbox>
                               </w:sdtPr>
-                              <w:sdtEndPr/>
                               <w:sdtContent>
                                 <w:r>
                                   <w:rPr>
@@ -2020,7 +2007,6 @@
                                   <w14:uncheckedState w14:val="2610" w14:font="MS Gothic"/>
                                 </w14:checkbox>
                               </w:sdtPr>
-                              <w:sdtEndPr/>
                               <w:sdtContent>
                                 <w:r>
                                   <w:rPr>
@@ -2096,7 +2082,7 @@
                 <v:stroke joinstyle="miter"/>
                 <v:path gradientshapeok="t" o:connecttype="rect"/>
               </v:shapetype>
-              <v:shape id="Text Box 2" o:spid="_x0000_s1026" type="#_x0000_t202" style="position:absolute;margin-left:22.8pt;margin-top:0;width:420.6pt;height:664.8pt;z-index:251665408;visibility:visible;mso-wrap-style:square;mso-width-percent:0;mso-height-percent:0;mso-wrap-distance-left:9pt;mso-wrap-distance-top:3.6pt;mso-wrap-distance-right:9pt;mso-wrap-distance-bottom:3.6pt;mso-position-horizontal:absolute;mso-position-horizontal-relative:margin;mso-position-vertical:absolute;mso-position-vertical-relative:text;mso-width-percent:0;mso-height-percent:0;mso-width-relative:margin;mso-height-relative:margin;v-text-anchor:top" o:gfxdata="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" strokecolor="black [3213]">
+              <v:shape id="Text Box 2" o:spid="_x0000_s1026" type="#_x0000_t202" style="position:absolute;margin-left:22.8pt;margin-top:0;width:420.6pt;height:664.8pt;z-index:251658240;visibility:visible;mso-wrap-style:square;mso-width-percent:0;mso-height-percent:0;mso-wrap-distance-left:9pt;mso-wrap-distance-top:3.6pt;mso-wrap-distance-right:9pt;mso-wrap-distance-bottom:3.6pt;mso-position-horizontal:absolute;mso-position-horizontal-relative:margin;mso-position-vertical:absolute;mso-position-vertical-relative:text;mso-width-percent:0;mso-height-percent:0;mso-width-relative:margin;mso-height-relative:margin;v-text-anchor:top" o:gfxdata="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" strokecolor="black [3213]">
                 <v:textbox>
                   <w:txbxContent>
                     <w:p>
@@ -2856,18 +2842,8 @@
                                 <w:sz w:val="24"/>
                                 <w:szCs w:val="24"/>
                               </w:rPr>
-                              <w:t xml:space="preserve"> </w:t>
+                              <w:t xml:space="preserve"> Zietsman</w:t>
                             </w:r>
-                            <w:proofErr w:type="spellStart"/>
-                            <w:r>
-                              <w:rPr>
-                                <w:rFonts w:ascii="Arial" w:eastAsia="Arial" w:hAnsi="Arial"/>
-                                <w:sz w:val="24"/>
-                                <w:szCs w:val="24"/>
-                              </w:rPr>
-                              <w:t>Zietsman</w:t>
-                            </w:r>
-                            <w:proofErr w:type="spellEnd"/>
                             <w:r>
                               <w:rPr>
                                 <w:rFonts w:ascii="Arial" w:eastAsia="Arial" w:hAnsi="Arial"/>
@@ -3749,7 +3725,6 @@
                             <w14:uncheckedState w14:val="2610" w14:font="MS Gothic"/>
                           </w14:checkbox>
                         </w:sdtPr>
-                        <w:sdtEndPr/>
                         <w:sdtContent>
                           <w:r>
                             <w:rPr>
@@ -3808,7 +3783,6 @@
                             <w14:uncheckedState w14:val="2610" w14:font="MS Gothic"/>
                           </w14:checkbox>
                         </w:sdtPr>
-                        <w:sdtEndPr/>
                         <w:sdtContent>
                           <w:r>
                             <w:rPr>
@@ -4004,7 +3978,6 @@
                             <w14:uncheckedState w14:val="2610" w14:font="MS Gothic"/>
                           </w14:checkbox>
                         </w:sdtPr>
-                        <w:sdtEndPr/>
                         <w:sdtContent>
                           <w:r>
                             <w:rPr>
@@ -4056,7 +4029,6 @@
                             <w14:uncheckedState w14:val="2610" w14:font="MS Gothic"/>
                           </w14:checkbox>
                         </w:sdtPr>
-                        <w:sdtEndPr/>
                         <w:sdtContent>
                           <w:r>
                             <w:rPr>
@@ -4139,7 +4111,6 @@
           <w:sz w:val="28"/>
           <w:szCs w:val="16"/>
         </w:rPr>
-        <w:lastRenderedPageBreak/>
         <w:t>Overview of Testing</w:t>
       </w:r>
     </w:p>
@@ -4274,7 +4245,23 @@
                 <w:sz w:val="22"/>
                 <w:szCs w:val="22"/>
               </w:rPr>
-              <w:t>Starin gauge and deflection measurement of an electromagnet</w:t>
+              <w:t>St</w:t>
+            </w:r>
+            <w:r>
+              <w:rPr>
+                <w:rFonts w:ascii="Arial" w:eastAsia="Arial" w:hAnsi="Arial"/>
+                <w:sz w:val="22"/>
+                <w:szCs w:val="22"/>
+              </w:rPr>
+              <w:t>rai</w:t>
+            </w:r>
+            <w:r>
+              <w:rPr>
+                <w:rFonts w:ascii="Arial" w:eastAsia="Arial" w:hAnsi="Arial"/>
+                <w:sz w:val="22"/>
+                <w:szCs w:val="22"/>
+              </w:rPr>
+              <w:t>n gauge and deflection measurement of an electromagnet</w:t>
             </w:r>
           </w:p>
         </w:tc>
@@ -4599,7 +4586,15 @@
                 <w:sz w:val="22"/>
                 <w:szCs w:val="22"/>
               </w:rPr>
-              <w:t xml:space="preserve">Max </w:t>
+              <w:t>Max</w:t>
+            </w:r>
+            <w:r>
+              <w:rPr>
+                <w:rFonts w:ascii="Arial" w:eastAsia="Arial" w:hAnsi="Arial"/>
+                <w:sz w:val="22"/>
+                <w:szCs w:val="22"/>
+              </w:rPr>
+              <w:t xml:space="preserve"> </w:t>
             </w:r>
             <m:oMath>
               <m:r>
@@ -4608,7 +4603,7 @@
                   <w:sz w:val="22"/>
                   <w:szCs w:val="22"/>
                 </w:rPr>
-                <m:t>36</m:t>
+                <m:t>12</m:t>
               </m:r>
               <m:sSub>
                 <m:sSubPr>
@@ -4651,6 +4646,14 @@
               </w:rPr>
               <w:t xml:space="preserve">, </w:t>
             </w:r>
+            <w:r>
+              <w:rPr>
+                <w:rFonts w:ascii="Arial" w:eastAsia="Arial" w:hAnsi="Arial"/>
+                <w:sz w:val="22"/>
+                <w:szCs w:val="22"/>
+              </w:rPr>
+              <w:t>6</w:t>
+            </w:r>
             <m:oMath>
               <m:r>
                 <w:rPr>
@@ -4658,7 +4661,7 @@
                   <w:sz w:val="22"/>
                   <w:szCs w:val="22"/>
                 </w:rPr>
-                <m:t>10 A</m:t>
+                <m:t xml:space="preserve"> A</m:t>
               </m:r>
             </m:oMath>
           </w:p>
@@ -4708,39 +4711,7 @@
                 <w:sz w:val="22"/>
                 <w:szCs w:val="22"/>
               </w:rPr>
-              <w:t xml:space="preserve">Data </w:t>
-            </w:r>
-            <w:r>
-              <w:rPr>
-                <w:rFonts w:ascii="Arial" w:eastAsia="Arial" w:hAnsi="Arial"/>
-                <w:sz w:val="22"/>
-                <w:szCs w:val="22"/>
-              </w:rPr>
-              <w:t>a</w:t>
-            </w:r>
-            <w:r>
-              <w:rPr>
-                <w:rFonts w:ascii="Arial" w:eastAsia="Arial" w:hAnsi="Arial"/>
-                <w:sz w:val="22"/>
-                <w:szCs w:val="22"/>
-              </w:rPr>
-              <w:t xml:space="preserve">cquisition </w:t>
-            </w:r>
-            <w:r>
-              <w:rPr>
-                <w:rFonts w:ascii="Arial" w:eastAsia="Arial" w:hAnsi="Arial"/>
-                <w:sz w:val="22"/>
-                <w:szCs w:val="22"/>
-              </w:rPr>
-              <w:t>s</w:t>
-            </w:r>
-            <w:r>
-              <w:rPr>
-                <w:rFonts w:ascii="Arial" w:eastAsia="Arial" w:hAnsi="Arial"/>
-                <w:sz w:val="22"/>
-                <w:szCs w:val="22"/>
-              </w:rPr>
-              <w:t>ystem</w:t>
+              <w:t>Emergency Stop Button</w:t>
             </w:r>
           </w:p>
         </w:tc>
@@ -4764,25 +4735,1167 @@
                 <w:sz w:val="22"/>
                 <w:szCs w:val="22"/>
               </w:rPr>
-              <w:t xml:space="preserve">HBM </w:t>
-            </w:r>
-            <w:proofErr w:type="spellStart"/>
-            <w:r>
-              <w:rPr>
-                <w:rFonts w:ascii="Arial" w:eastAsia="Arial" w:hAnsi="Arial"/>
-                <w:sz w:val="22"/>
-                <w:szCs w:val="22"/>
-              </w:rPr>
-              <w:t>QuantumX</w:t>
-            </w:r>
-            <w:proofErr w:type="spellEnd"/>
-            <w:r>
-              <w:rPr>
-                <w:rFonts w:ascii="Arial" w:eastAsia="Arial" w:hAnsi="Arial"/>
-                <w:sz w:val="22"/>
-                <w:szCs w:val="22"/>
-              </w:rPr>
-              <w:t xml:space="preserve"> (801433534)</w:t>
+              <w:t>NC Latching Push Button</w:t>
+            </w:r>
+          </w:p>
+        </w:tc>
+        <w:tc>
+          <w:tcPr>
+            <w:tcW w:w="2254" w:type="dxa"/>
+          </w:tcPr>
+          <w:p>
+            <w:pPr>
+              <w:spacing w:line="0" w:lineRule="atLeast"/>
+              <w:rPr>
+                <w:rFonts w:ascii="Arial" w:eastAsia="Arial" w:hAnsi="Arial"/>
+                <w:sz w:val="22"/>
+                <w:szCs w:val="22"/>
+              </w:rPr>
+            </w:pPr>
+            <w:r>
+              <w:rPr>
+                <w:rFonts w:ascii="Arial" w:eastAsia="Arial" w:hAnsi="Arial"/>
+                <w:sz w:val="22"/>
+                <w:szCs w:val="22"/>
+              </w:rPr>
+              <w:t>Max</w:t>
+            </w:r>
+            <w:r>
+              <w:rPr>
+                <w:rFonts w:ascii="Arial" w:eastAsia="Arial" w:hAnsi="Arial"/>
+                <w:sz w:val="22"/>
+                <w:szCs w:val="22"/>
+              </w:rPr>
+              <w:t xml:space="preserve"> 24</w:t>
+            </w:r>
+            <m:oMath>
+              <m:sSub>
+                <m:sSubPr>
+                  <m:ctrlPr>
+                    <w:rPr>
+                      <w:rFonts w:ascii="Cambria Math" w:eastAsia="Arial" w:hAnsi="Cambria Math"/>
+                      <w:i/>
+                      <w:sz w:val="22"/>
+                      <w:szCs w:val="22"/>
+                    </w:rPr>
+                  </m:ctrlPr>
+                </m:sSubPr>
+                <m:e>
+                  <m:r>
+                    <w:rPr>
+                      <w:rFonts w:ascii="Cambria Math" w:eastAsia="Arial" w:hAnsi="Cambria Math"/>
+                      <w:sz w:val="22"/>
+                      <w:szCs w:val="22"/>
+                    </w:rPr>
+                    <m:t xml:space="preserve"> V</m:t>
+                  </m:r>
+                </m:e>
+                <m:sub>
+                  <m:r>
+                    <w:rPr>
+                      <w:rFonts w:ascii="Cambria Math" w:eastAsia="Arial" w:hAnsi="Cambria Math"/>
+                      <w:sz w:val="22"/>
+                      <w:szCs w:val="22"/>
+                    </w:rPr>
+                    <m:t>DC</m:t>
+                  </m:r>
+                </m:sub>
+              </m:sSub>
+            </m:oMath>
+            <w:r>
+              <w:rPr>
+                <w:rFonts w:ascii="Arial" w:eastAsia="Arial" w:hAnsi="Arial"/>
+                <w:sz w:val="22"/>
+                <w:szCs w:val="22"/>
+              </w:rPr>
+              <w:t>,</w:t>
+            </w:r>
+            <w:r>
+              <w:rPr>
+                <w:rFonts w:ascii="Arial" w:eastAsia="Arial" w:hAnsi="Arial"/>
+                <w:sz w:val="22"/>
+                <w:szCs w:val="22"/>
+              </w:rPr>
+              <w:t xml:space="preserve"> </w:t>
+            </w:r>
+            <m:oMath>
+              <m:r>
+                <w:rPr>
+                  <w:rFonts w:ascii="Cambria Math" w:eastAsia="Arial" w:hAnsi="Cambria Math"/>
+                  <w:sz w:val="22"/>
+                  <w:szCs w:val="22"/>
+                </w:rPr>
+                <m:t>10 A</m:t>
+              </m:r>
+            </m:oMath>
+          </w:p>
+          <w:p>
+            <w:pPr>
+              <w:spacing w:line="0" w:lineRule="atLeast"/>
+              <w:rPr>
+                <w:rFonts w:ascii="Arial" w:eastAsia="Arial" w:hAnsi="Arial"/>
+                <w:sz w:val="22"/>
+                <w:szCs w:val="22"/>
+              </w:rPr>
+            </w:pPr>
+            <w:r>
+              <w:rPr>
+                <w:rFonts w:ascii="Arial" w:eastAsia="Arial" w:hAnsi="Arial"/>
+                <w:sz w:val="22"/>
+                <w:szCs w:val="22"/>
+              </w:rPr>
+              <w:t xml:space="preserve">Max </w:t>
+            </w:r>
+            <m:oMath>
+              <m:r>
+                <w:rPr>
+                  <w:rFonts w:ascii="Cambria Math" w:eastAsia="Arial" w:hAnsi="Cambria Math"/>
+                  <w:sz w:val="22"/>
+                  <w:szCs w:val="22"/>
+                </w:rPr>
+                <m:t xml:space="preserve">24 </m:t>
+              </m:r>
+            </m:oMath>
+          </w:p>
+        </w:tc>
+        <w:tc>
+          <w:tcPr>
+            <w:tcW w:w="2254" w:type="dxa"/>
+          </w:tcPr>
+          <w:p>
+            <w:pPr>
+              <w:spacing w:line="0" w:lineRule="atLeast"/>
+              <w:rPr>
+                <w:rFonts w:ascii="Arial" w:eastAsia="Arial" w:hAnsi="Arial"/>
+                <w:sz w:val="22"/>
+                <w:szCs w:val="22"/>
+              </w:rPr>
+            </w:pPr>
+            <w:r>
+              <w:rPr>
+                <w:rFonts w:ascii="Arial" w:eastAsia="Arial" w:hAnsi="Arial"/>
+                <w:sz w:val="22"/>
+                <w:szCs w:val="22"/>
+              </w:rPr>
+              <w:t>-</w:t>
+            </w:r>
+          </w:p>
+        </w:tc>
+      </w:tr>
+      <w:tr>
+        <w:tc>
+          <w:tcPr>
+            <w:tcW w:w="2254" w:type="dxa"/>
+            <w:vAlign w:val="center"/>
+          </w:tcPr>
+          <w:p>
+            <w:pPr>
+              <w:spacing w:line="0" w:lineRule="atLeast"/>
+              <w:rPr>
+                <w:rFonts w:ascii="Arial" w:eastAsia="Arial" w:hAnsi="Arial"/>
+                <w:sz w:val="22"/>
+                <w:szCs w:val="22"/>
+              </w:rPr>
+            </w:pPr>
+            <w:r>
+              <w:rPr>
+                <w:rFonts w:ascii="Arial" w:eastAsia="Arial" w:hAnsi="Arial"/>
+                <w:sz w:val="22"/>
+                <w:szCs w:val="22"/>
+              </w:rPr>
+              <w:t>Microcontroller</w:t>
+            </w:r>
+          </w:p>
+        </w:tc>
+        <w:tc>
+          <w:tcPr>
+            <w:tcW w:w="2254" w:type="dxa"/>
+            <w:vAlign w:val="center"/>
+          </w:tcPr>
+          <w:p>
+            <w:pPr>
+              <w:spacing w:line="0" w:lineRule="atLeast"/>
+              <w:rPr>
+                <w:rFonts w:ascii="Arial" w:eastAsia="Arial" w:hAnsi="Arial"/>
+                <w:sz w:val="22"/>
+                <w:szCs w:val="22"/>
+              </w:rPr>
+            </w:pPr>
+            <w:r>
+              <w:rPr>
+                <w:rFonts w:ascii="Arial" w:eastAsia="Arial" w:hAnsi="Arial"/>
+                <w:sz w:val="22"/>
+                <w:szCs w:val="22"/>
+              </w:rPr>
+              <w:t>STM32 Nucleo F11</w:t>
+            </w:r>
+            <w:r>
+              <w:rPr>
+                <w:rFonts w:ascii="Arial" w:eastAsia="Arial" w:hAnsi="Arial"/>
+                <w:sz w:val="22"/>
+                <w:szCs w:val="22"/>
+              </w:rPr>
+              <w:t>4RE</w:t>
+            </w:r>
+          </w:p>
+        </w:tc>
+        <w:tc>
+          <w:tcPr>
+            <w:tcW w:w="2254" w:type="dxa"/>
+          </w:tcPr>
+          <w:p>
+            <w:pPr>
+              <w:spacing w:line="0" w:lineRule="atLeast"/>
+              <w:rPr>
+                <w:rFonts w:ascii="Arial" w:eastAsia="Arial" w:hAnsi="Arial"/>
+                <w:sz w:val="22"/>
+                <w:szCs w:val="22"/>
+              </w:rPr>
+            </w:pPr>
+            <m:oMath>
+              <m:r>
+                <w:rPr>
+                  <w:rFonts w:ascii="Cambria Math" w:eastAsia="Arial" w:hAnsi="Cambria Math"/>
+                  <w:sz w:val="22"/>
+                  <w:szCs w:val="22"/>
+                </w:rPr>
+                <m:t>3-3.6</m:t>
+              </m:r>
+              <m:sSub>
+                <m:sSubPr>
+                  <m:ctrlPr>
+                    <w:rPr>
+                      <w:rFonts w:ascii="Cambria Math" w:eastAsia="Arial" w:hAnsi="Cambria Math"/>
+                      <w:i/>
+                      <w:sz w:val="22"/>
+                      <w:szCs w:val="22"/>
+                    </w:rPr>
+                  </m:ctrlPr>
+                </m:sSubPr>
+                <m:e>
+                  <m:r>
+                    <w:rPr>
+                      <w:rFonts w:ascii="Cambria Math" w:eastAsia="Arial" w:hAnsi="Cambria Math"/>
+                      <w:sz w:val="22"/>
+                      <w:szCs w:val="22"/>
+                    </w:rPr>
+                    <m:t xml:space="preserve"> V</m:t>
+                  </m:r>
+                </m:e>
+                <m:sub>
+                  <m:r>
+                    <w:rPr>
+                      <w:rFonts w:ascii="Cambria Math" w:eastAsia="Arial" w:hAnsi="Cambria Math"/>
+                      <w:sz w:val="22"/>
+                      <w:szCs w:val="22"/>
+                    </w:rPr>
+                    <m:t>DC</m:t>
+                  </m:r>
+                </m:sub>
+              </m:sSub>
+            </m:oMath>
+            <w:r>
+              <w:rPr>
+                <w:rFonts w:ascii="Arial" w:eastAsia="Arial" w:hAnsi="Arial"/>
+                <w:sz w:val="22"/>
+                <w:szCs w:val="22"/>
+              </w:rPr>
+              <w:t xml:space="preserve">, </w:t>
+            </w:r>
+            <m:oMath>
+              <m:r>
+                <w:rPr>
+                  <w:rFonts w:ascii="Cambria Math" w:eastAsia="Arial" w:hAnsi="Cambria Math"/>
+                  <w:sz w:val="22"/>
+                  <w:szCs w:val="22"/>
+                </w:rPr>
+                <m:t>0.8 A</m:t>
+              </m:r>
+            </m:oMath>
+          </w:p>
+        </w:tc>
+        <w:tc>
+          <w:tcPr>
+            <w:tcW w:w="2254" w:type="dxa"/>
+          </w:tcPr>
+          <w:p>
+            <w:pPr>
+              <w:spacing w:line="0" w:lineRule="atLeast"/>
+              <w:rPr>
+                <w:rFonts w:ascii="Arial" w:eastAsia="Arial" w:hAnsi="Arial"/>
+                <w:sz w:val="22"/>
+                <w:szCs w:val="22"/>
+              </w:rPr>
+            </w:pPr>
+            <w:r>
+              <w:rPr>
+                <w:rFonts w:ascii="Arial" w:eastAsia="Arial" w:hAnsi="Arial"/>
+                <w:sz w:val="22"/>
+                <w:szCs w:val="22"/>
+              </w:rPr>
+              <w:t>-</w:t>
+            </w:r>
+          </w:p>
+        </w:tc>
+      </w:tr>
+      <w:tr>
+        <w:tc>
+          <w:tcPr>
+            <w:tcW w:w="2254" w:type="dxa"/>
+            <w:vAlign w:val="center"/>
+          </w:tcPr>
+          <w:p>
+            <w:pPr>
+              <w:spacing w:line="0" w:lineRule="atLeast"/>
+              <w:rPr>
+                <w:rFonts w:ascii="Arial" w:eastAsia="Arial" w:hAnsi="Arial"/>
+                <w:sz w:val="22"/>
+                <w:szCs w:val="22"/>
+              </w:rPr>
+            </w:pPr>
+            <w:r>
+              <w:rPr>
+                <w:rFonts w:ascii="Arial" w:eastAsia="Arial" w:hAnsi="Arial"/>
+                <w:sz w:val="22"/>
+                <w:szCs w:val="22"/>
+              </w:rPr>
+              <w:t>MOSFET</w:t>
+            </w:r>
+          </w:p>
+        </w:tc>
+        <w:tc>
+          <w:tcPr>
+            <w:tcW w:w="2254" w:type="dxa"/>
+            <w:vAlign w:val="center"/>
+          </w:tcPr>
+          <w:p>
+            <w:pPr>
+              <w:spacing w:line="0" w:lineRule="atLeast"/>
+              <w:rPr>
+                <w:rFonts w:ascii="Arial" w:eastAsia="Arial" w:hAnsi="Arial"/>
+                <w:sz w:val="22"/>
+                <w:szCs w:val="22"/>
+              </w:rPr>
+            </w:pPr>
+            <w:r>
+              <w:rPr>
+                <w:rFonts w:ascii="Arial" w:eastAsia="Arial" w:hAnsi="Arial"/>
+                <w:sz w:val="22"/>
+                <w:szCs w:val="22"/>
+              </w:rPr>
+              <w:t>Infineon IRF640N</w:t>
+            </w:r>
+            <w:r>
+              <w:rPr>
+                <w:rFonts w:ascii="Arial" w:eastAsia="Arial" w:hAnsi="Arial"/>
+                <w:sz w:val="22"/>
+                <w:szCs w:val="22"/>
+              </w:rPr>
+              <w:t>P</w:t>
+            </w:r>
+            <w:r>
+              <w:rPr>
+                <w:rFonts w:ascii="Arial" w:eastAsia="Arial" w:hAnsi="Arial"/>
+                <w:sz w:val="22"/>
+                <w:szCs w:val="22"/>
+              </w:rPr>
+              <w:t>BF</w:t>
+            </w:r>
+          </w:p>
+        </w:tc>
+        <w:tc>
+          <w:tcPr>
+            <w:tcW w:w="2254" w:type="dxa"/>
+          </w:tcPr>
+          <w:p>
+            <w:pPr>
+              <w:spacing w:line="0" w:lineRule="atLeast"/>
+              <w:rPr>
+                <w:rFonts w:ascii="Arial" w:eastAsia="Arial" w:hAnsi="Arial"/>
+                <w:sz w:val="22"/>
+                <w:szCs w:val="22"/>
+              </w:rPr>
+            </w:pPr>
+            <m:oMath>
+              <m:sSub>
+                <m:sSubPr>
+                  <m:ctrlPr>
+                    <w:rPr>
+                      <w:rFonts w:ascii="Cambria Math" w:eastAsia="Arial" w:hAnsi="Cambria Math"/>
+                      <w:i/>
+                      <w:sz w:val="22"/>
+                      <w:szCs w:val="22"/>
+                    </w:rPr>
+                  </m:ctrlPr>
+                </m:sSubPr>
+                <m:e>
+                  <m:r>
+                    <w:rPr>
+                      <w:rFonts w:ascii="Cambria Math" w:eastAsia="Arial" w:hAnsi="Cambria Math"/>
+                      <w:sz w:val="22"/>
+                      <w:szCs w:val="22"/>
+                    </w:rPr>
+                    <m:t>20 V</m:t>
+                  </m:r>
+                </m:e>
+                <m:sub>
+                  <m:r>
+                    <w:rPr>
+                      <w:rFonts w:ascii="Cambria Math" w:eastAsia="Arial" w:hAnsi="Cambria Math"/>
+                      <w:sz w:val="22"/>
+                      <w:szCs w:val="22"/>
+                    </w:rPr>
+                    <m:t>DC</m:t>
+                  </m:r>
+                </m:sub>
+              </m:sSub>
+            </m:oMath>
+            <w:r>
+              <w:rPr>
+                <w:rFonts w:ascii="Arial" w:eastAsia="Arial" w:hAnsi="Arial"/>
+                <w:sz w:val="22"/>
+                <w:szCs w:val="22"/>
+              </w:rPr>
+              <w:t xml:space="preserve">, </w:t>
+            </w:r>
+            <m:oMath>
+              <m:r>
+                <w:rPr>
+                  <w:rFonts w:ascii="Cambria Math" w:eastAsia="Arial" w:hAnsi="Cambria Math"/>
+                  <w:sz w:val="22"/>
+                  <w:szCs w:val="22"/>
+                </w:rPr>
+                <m:t>18 A</m:t>
+              </m:r>
+            </m:oMath>
+          </w:p>
+        </w:tc>
+        <w:tc>
+          <w:tcPr>
+            <w:tcW w:w="2254" w:type="dxa"/>
+          </w:tcPr>
+          <w:p>
+            <w:pPr>
+              <w:spacing w:line="0" w:lineRule="atLeast"/>
+              <w:rPr>
+                <w:rFonts w:ascii="Arial" w:eastAsia="Arial" w:hAnsi="Arial"/>
+                <w:sz w:val="22"/>
+                <w:szCs w:val="22"/>
+              </w:rPr>
+            </w:pPr>
+            <w:r>
+              <w:rPr>
+                <w:rFonts w:ascii="Arial" w:eastAsia="Arial" w:hAnsi="Arial"/>
+                <w:sz w:val="22"/>
+                <w:szCs w:val="22"/>
+              </w:rPr>
+              <w:t>-</w:t>
+            </w:r>
+          </w:p>
+        </w:tc>
+      </w:tr>
+      <w:tr>
+        <w:tc>
+          <w:tcPr>
+            <w:tcW w:w="2254" w:type="dxa"/>
+            <w:vAlign w:val="center"/>
+          </w:tcPr>
+          <w:p>
+            <w:pPr>
+              <w:spacing w:line="0" w:lineRule="atLeast"/>
+              <w:rPr>
+                <w:rFonts w:ascii="Arial" w:eastAsia="Arial" w:hAnsi="Arial"/>
+                <w:sz w:val="22"/>
+                <w:szCs w:val="22"/>
+              </w:rPr>
+            </w:pPr>
+            <w:r>
+              <w:rPr>
+                <w:rFonts w:ascii="Arial" w:eastAsia="Arial" w:hAnsi="Arial"/>
+                <w:sz w:val="22"/>
+                <w:szCs w:val="22"/>
+              </w:rPr>
+              <w:t xml:space="preserve">Voltage </w:t>
+            </w:r>
+            <w:r>
+              <w:rPr>
+                <w:rFonts w:ascii="Arial" w:eastAsia="Arial" w:hAnsi="Arial"/>
+                <w:sz w:val="22"/>
+                <w:szCs w:val="22"/>
+              </w:rPr>
+              <w:t>Buck Converter</w:t>
+            </w:r>
+          </w:p>
+        </w:tc>
+        <w:tc>
+          <w:tcPr>
+            <w:tcW w:w="2254" w:type="dxa"/>
+            <w:vAlign w:val="center"/>
+          </w:tcPr>
+          <w:p>
+            <w:pPr>
+              <w:spacing w:line="0" w:lineRule="atLeast"/>
+              <w:rPr>
+                <w:rFonts w:ascii="Arial" w:eastAsia="Arial" w:hAnsi="Arial"/>
+                <w:sz w:val="22"/>
+                <w:szCs w:val="22"/>
+              </w:rPr>
+            </w:pPr>
+            <w:r>
+              <w:rPr>
+                <w:rFonts w:ascii="Arial" w:eastAsia="Arial" w:hAnsi="Arial"/>
+                <w:sz w:val="22"/>
+                <w:szCs w:val="22"/>
+              </w:rPr>
+              <w:t>XL7015</w:t>
+            </w:r>
+            <w:r>
+              <w:rPr>
+                <w:rFonts w:ascii="Arial" w:eastAsia="Arial" w:hAnsi="Arial"/>
+                <w:sz w:val="22"/>
+                <w:szCs w:val="22"/>
+              </w:rPr>
+              <w:t xml:space="preserve"> Step-Down Buck Regulator</w:t>
+            </w:r>
+          </w:p>
+        </w:tc>
+        <w:tc>
+          <w:tcPr>
+            <w:tcW w:w="2254" w:type="dxa"/>
+          </w:tcPr>
+          <w:p>
+            <w:pPr>
+              <w:spacing w:line="0" w:lineRule="atLeast"/>
+              <w:rPr>
+                <w:rFonts w:ascii="Arial" w:eastAsia="Arial" w:hAnsi="Arial"/>
+                <w:sz w:val="22"/>
+                <w:szCs w:val="22"/>
+              </w:rPr>
+            </w:pPr>
+            <m:oMath>
+              <m:sSub>
+                <m:sSubPr>
+                  <m:ctrlPr>
+                    <w:rPr>
+                      <w:rFonts w:ascii="Cambria Math" w:eastAsia="Arial" w:hAnsi="Cambria Math"/>
+                      <w:i/>
+                      <w:sz w:val="22"/>
+                      <w:szCs w:val="22"/>
+                    </w:rPr>
+                  </m:ctrlPr>
+                </m:sSubPr>
+                <m:e>
+                  <m:r>
+                    <w:rPr>
+                      <w:rFonts w:ascii="Cambria Math" w:eastAsia="Arial" w:hAnsi="Cambria Math"/>
+                      <w:sz w:val="22"/>
+                      <w:szCs w:val="22"/>
+                    </w:rPr>
+                    <m:t>V</m:t>
+                  </m:r>
+                </m:e>
+                <m:sub>
+                  <m:r>
+                    <w:rPr>
+                      <w:rFonts w:ascii="Cambria Math" w:eastAsia="Arial" w:hAnsi="Cambria Math"/>
+                      <w:sz w:val="22"/>
+                      <w:szCs w:val="22"/>
+                    </w:rPr>
+                    <m:t>in</m:t>
+                  </m:r>
+                </m:sub>
+              </m:sSub>
+            </m:oMath>
+            <w:r>
+              <w:rPr>
+                <w:rFonts w:ascii="Arial" w:eastAsia="Arial" w:hAnsi="Arial"/>
+                <w:sz w:val="22"/>
+                <w:szCs w:val="22"/>
+              </w:rPr>
+              <w:t xml:space="preserve">: </w:t>
+            </w:r>
+            <m:oMath>
+              <m:r>
+                <w:rPr>
+                  <w:rFonts w:ascii="Cambria Math" w:eastAsia="Arial" w:hAnsi="Cambria Math"/>
+                  <w:sz w:val="22"/>
+                  <w:szCs w:val="22"/>
+                </w:rPr>
+                <m:t>5-80 V</m:t>
+              </m:r>
+            </m:oMath>
+            <w:r>
+              <w:rPr>
+                <w:rFonts w:ascii="Arial" w:eastAsia="Arial" w:hAnsi="Arial"/>
+                <w:sz w:val="22"/>
+                <w:szCs w:val="22"/>
+              </w:rPr>
+              <w:t xml:space="preserve">, </w:t>
+            </w:r>
+            <m:oMath>
+              <m:sSub>
+                <m:sSubPr>
+                  <m:ctrlPr>
+                    <w:rPr>
+                      <w:rFonts w:ascii="Cambria Math" w:eastAsia="Arial" w:hAnsi="Cambria Math"/>
+                      <w:i/>
+                      <w:sz w:val="22"/>
+                      <w:szCs w:val="22"/>
+                    </w:rPr>
+                  </m:ctrlPr>
+                </m:sSubPr>
+                <m:e>
+                  <m:r>
+                    <w:rPr>
+                      <w:rFonts w:ascii="Cambria Math" w:eastAsia="Arial" w:hAnsi="Cambria Math"/>
+                      <w:sz w:val="22"/>
+                      <w:szCs w:val="22"/>
+                    </w:rPr>
+                    <m:t>V</m:t>
+                  </m:r>
+                </m:e>
+                <m:sub>
+                  <m:r>
+                    <w:rPr>
+                      <w:rFonts w:ascii="Cambria Math" w:eastAsia="Arial" w:hAnsi="Cambria Math"/>
+                      <w:sz w:val="22"/>
+                      <w:szCs w:val="22"/>
+                    </w:rPr>
+                    <m:t>out</m:t>
+                  </m:r>
+                </m:sub>
+              </m:sSub>
+            </m:oMath>
+            <w:r>
+              <w:rPr>
+                <w:rFonts w:ascii="Arial" w:eastAsia="Arial" w:hAnsi="Arial"/>
+                <w:sz w:val="22"/>
+                <w:szCs w:val="22"/>
+              </w:rPr>
+              <w:t xml:space="preserve">: </w:t>
+            </w:r>
+            <m:oMath>
+              <m:r>
+                <w:rPr>
+                  <w:rFonts w:ascii="Cambria Math" w:eastAsia="Arial" w:hAnsi="Cambria Math"/>
+                  <w:sz w:val="22"/>
+                  <w:szCs w:val="22"/>
+                </w:rPr>
+                <m:t>5-20 V</m:t>
+              </m:r>
+            </m:oMath>
+            <w:r>
+              <w:rPr>
+                <w:rFonts w:ascii="Arial" w:eastAsia="Arial" w:hAnsi="Arial"/>
+                <w:sz w:val="22"/>
+                <w:szCs w:val="22"/>
+              </w:rPr>
+              <w:t xml:space="preserve"> @ </w:t>
+            </w:r>
+            <m:oMath>
+              <m:r>
+                <w:rPr>
+                  <w:rFonts w:ascii="Cambria Math" w:eastAsia="Arial" w:hAnsi="Cambria Math"/>
+                  <w:sz w:val="22"/>
+                  <w:szCs w:val="22"/>
+                </w:rPr>
+                <m:t>0.8 A</m:t>
+              </m:r>
+            </m:oMath>
+          </w:p>
+        </w:tc>
+        <w:tc>
+          <w:tcPr>
+            <w:tcW w:w="2254" w:type="dxa"/>
+          </w:tcPr>
+          <w:p>
+            <w:pPr>
+              <w:spacing w:line="0" w:lineRule="atLeast"/>
+              <w:rPr>
+                <w:rFonts w:ascii="Arial" w:eastAsia="Arial" w:hAnsi="Arial"/>
+                <w:sz w:val="22"/>
+                <w:szCs w:val="22"/>
+              </w:rPr>
+            </w:pPr>
+            <w:r>
+              <w:rPr>
+                <w:rFonts w:ascii="Arial" w:eastAsia="Arial" w:hAnsi="Arial"/>
+                <w:sz w:val="22"/>
+                <w:szCs w:val="22"/>
+              </w:rPr>
+              <w:t>-</w:t>
+            </w:r>
+          </w:p>
+        </w:tc>
+      </w:tr>
+      <w:tr>
+        <w:tc>
+          <w:tcPr>
+            <w:tcW w:w="2254" w:type="dxa"/>
+            <w:vAlign w:val="center"/>
+          </w:tcPr>
+          <w:p>
+            <w:pPr>
+              <w:spacing w:line="0" w:lineRule="atLeast"/>
+              <w:rPr>
+                <w:rFonts w:ascii="Arial" w:eastAsia="Arial" w:hAnsi="Arial"/>
+                <w:sz w:val="22"/>
+                <w:szCs w:val="22"/>
+              </w:rPr>
+            </w:pPr>
+            <w:r>
+              <w:rPr>
+                <w:rFonts w:ascii="Arial" w:eastAsia="Arial" w:hAnsi="Arial"/>
+                <w:sz w:val="22"/>
+                <w:szCs w:val="22"/>
+              </w:rPr>
+              <w:t>Flyback Diode</w:t>
+            </w:r>
+          </w:p>
+        </w:tc>
+        <w:tc>
+          <w:tcPr>
+            <w:tcW w:w="2254" w:type="dxa"/>
+            <w:vAlign w:val="center"/>
+          </w:tcPr>
+          <w:p>
+            <w:pPr>
+              <w:spacing w:line="0" w:lineRule="atLeast"/>
+              <w:rPr>
+                <w:rFonts w:ascii="Arial" w:eastAsia="Arial" w:hAnsi="Arial"/>
+                <w:sz w:val="22"/>
+                <w:szCs w:val="22"/>
+              </w:rPr>
+            </w:pPr>
+            <w:r>
+              <w:rPr>
+                <w:rFonts w:ascii="Arial" w:eastAsia="Arial" w:hAnsi="Arial"/>
+                <w:sz w:val="22"/>
+                <w:szCs w:val="22"/>
+              </w:rPr>
+              <w:t>STMicroelectronics STPS20H100CT</w:t>
+            </w:r>
+          </w:p>
+        </w:tc>
+        <w:tc>
+          <w:tcPr>
+            <w:tcW w:w="2254" w:type="dxa"/>
+          </w:tcPr>
+          <w:p>
+            <w:pPr>
+              <w:spacing w:line="0" w:lineRule="atLeast"/>
+              <w:rPr>
+                <w:rFonts w:ascii="Arial" w:eastAsia="Arial" w:hAnsi="Arial"/>
+                <w:sz w:val="22"/>
+                <w:szCs w:val="22"/>
+              </w:rPr>
+            </w:pPr>
+            <w:r>
+              <w:rPr>
+                <w:rFonts w:ascii="Arial" w:eastAsia="Arial" w:hAnsi="Arial"/>
+                <w:sz w:val="22"/>
+                <w:szCs w:val="22"/>
+              </w:rPr>
+              <w:t>Max 100</w:t>
+            </w:r>
+            <m:oMath>
+              <m:sSub>
+                <m:sSubPr>
+                  <m:ctrlPr>
+                    <w:rPr>
+                      <w:rFonts w:ascii="Cambria Math" w:eastAsia="Arial" w:hAnsi="Cambria Math"/>
+                      <w:i/>
+                      <w:sz w:val="22"/>
+                      <w:szCs w:val="22"/>
+                    </w:rPr>
+                  </m:ctrlPr>
+                </m:sSubPr>
+                <m:e>
+                  <m:r>
+                    <w:rPr>
+                      <w:rFonts w:ascii="Cambria Math" w:eastAsia="Arial" w:hAnsi="Cambria Math"/>
+                      <w:sz w:val="22"/>
+                      <w:szCs w:val="22"/>
+                    </w:rPr>
+                    <m:t xml:space="preserve"> V</m:t>
+                  </m:r>
+                </m:e>
+                <m:sub>
+                  <m:r>
+                    <w:rPr>
+                      <w:rFonts w:ascii="Cambria Math" w:eastAsia="Arial" w:hAnsi="Cambria Math"/>
+                      <w:sz w:val="22"/>
+                      <w:szCs w:val="22"/>
+                    </w:rPr>
+                    <m:t>DC</m:t>
+                  </m:r>
+                </m:sub>
+              </m:sSub>
+            </m:oMath>
+            <w:r>
+              <w:rPr>
+                <w:rFonts w:ascii="Arial" w:eastAsia="Arial" w:hAnsi="Arial"/>
+                <w:sz w:val="22"/>
+                <w:szCs w:val="22"/>
+              </w:rPr>
+              <w:t>, 2</w:t>
+            </w:r>
+            <m:oMath>
+              <m:r>
+                <w:rPr>
+                  <w:rFonts w:ascii="Cambria Math" w:eastAsia="Arial" w:hAnsi="Cambria Math"/>
+                  <w:sz w:val="22"/>
+                  <w:szCs w:val="22"/>
+                </w:rPr>
+                <m:t>0 A</m:t>
+              </m:r>
+            </m:oMath>
+          </w:p>
+        </w:tc>
+        <w:tc>
+          <w:tcPr>
+            <w:tcW w:w="2254" w:type="dxa"/>
+          </w:tcPr>
+          <w:p>
+            <w:pPr>
+              <w:spacing w:line="0" w:lineRule="atLeast"/>
+              <w:rPr>
+                <w:rFonts w:ascii="Arial" w:eastAsia="Arial" w:hAnsi="Arial"/>
+                <w:sz w:val="22"/>
+                <w:szCs w:val="22"/>
+              </w:rPr>
+            </w:pPr>
+            <w:r>
+              <w:rPr>
+                <w:rFonts w:ascii="Arial" w:eastAsia="Arial" w:hAnsi="Arial"/>
+                <w:sz w:val="22"/>
+                <w:szCs w:val="22"/>
+              </w:rPr>
+              <w:t>-</w:t>
+            </w:r>
+          </w:p>
+        </w:tc>
+      </w:tr>
+      <w:tr>
+        <w:tc>
+          <w:tcPr>
+            <w:tcW w:w="2254" w:type="dxa"/>
+            <w:vAlign w:val="center"/>
+          </w:tcPr>
+          <w:p>
+            <w:pPr>
+              <w:spacing w:line="0" w:lineRule="atLeast"/>
+              <w:rPr>
+                <w:rFonts w:ascii="Arial" w:eastAsia="Arial" w:hAnsi="Arial"/>
+                <w:sz w:val="22"/>
+                <w:szCs w:val="22"/>
+              </w:rPr>
+            </w:pPr>
+            <w:r>
+              <w:rPr>
+                <w:rFonts w:ascii="Arial" w:eastAsia="Arial" w:hAnsi="Arial"/>
+                <w:sz w:val="22"/>
+                <w:szCs w:val="22"/>
+              </w:rPr>
+              <w:t>Gate Resistor</w:t>
+            </w:r>
+          </w:p>
+        </w:tc>
+        <w:tc>
+          <w:tcPr>
+            <w:tcW w:w="2254" w:type="dxa"/>
+            <w:vAlign w:val="center"/>
+          </w:tcPr>
+          <w:p>
+            <w:pPr>
+              <w:spacing w:line="0" w:lineRule="atLeast"/>
+              <w:rPr>
+                <w:rFonts w:ascii="Arial" w:eastAsia="Arial" w:hAnsi="Arial"/>
+                <w:sz w:val="22"/>
+                <w:szCs w:val="22"/>
+              </w:rPr>
+            </w:pPr>
+            <w:r>
+              <w:rPr>
+                <w:rFonts w:ascii="Arial" w:eastAsia="Arial" w:hAnsi="Arial"/>
+                <w:sz w:val="22"/>
+                <w:szCs w:val="22"/>
+              </w:rPr>
+              <w:t>-</w:t>
+            </w:r>
+          </w:p>
+        </w:tc>
+        <w:tc>
+          <w:tcPr>
+            <w:tcW w:w="2254" w:type="dxa"/>
+          </w:tcPr>
+          <w:p>
+            <w:pPr>
+              <w:spacing w:line="0" w:lineRule="atLeast"/>
+              <w:rPr>
+                <w:rFonts w:ascii="Arial" w:eastAsia="Arial" w:hAnsi="Arial"/>
+                <w:sz w:val="22"/>
+                <w:szCs w:val="22"/>
+              </w:rPr>
+            </w:pPr>
+            <m:oMath>
+              <m:r>
+                <w:rPr>
+                  <w:rFonts w:ascii="Cambria Math" w:eastAsia="Arial" w:hAnsi="Cambria Math"/>
+                  <w:sz w:val="22"/>
+                  <w:szCs w:val="22"/>
+                </w:rPr>
+                <m:t xml:space="preserve">330 </m:t>
+              </m:r>
+              <m:r>
+                <m:rPr>
+                  <m:sty m:val="p"/>
+                </m:rPr>
+                <w:rPr>
+                  <w:rFonts w:ascii="Cambria Math" w:eastAsia="Arial" w:hAnsi="Cambria Math"/>
+                  <w:sz w:val="22"/>
+                  <w:szCs w:val="22"/>
+                </w:rPr>
+                <m:t>Ω</m:t>
+              </m:r>
+            </m:oMath>
+            <w:r>
+              <w:rPr>
+                <w:rFonts w:ascii="Arial" w:eastAsia="Arial" w:hAnsi="Arial"/>
+                <w:sz w:val="22"/>
+                <w:szCs w:val="22"/>
+              </w:rPr>
+              <w:t xml:space="preserve"> </w:t>
+            </w:r>
+          </w:p>
+        </w:tc>
+        <w:tc>
+          <w:tcPr>
+            <w:tcW w:w="2254" w:type="dxa"/>
+          </w:tcPr>
+          <w:p>
+            <w:pPr>
+              <w:spacing w:line="0" w:lineRule="atLeast"/>
+              <w:rPr>
+                <w:rFonts w:ascii="Arial" w:eastAsia="Arial" w:hAnsi="Arial"/>
+                <w:sz w:val="22"/>
+                <w:szCs w:val="22"/>
+              </w:rPr>
+            </w:pPr>
+            <w:r>
+              <w:rPr>
+                <w:rFonts w:ascii="Arial" w:eastAsia="Arial" w:hAnsi="Arial"/>
+                <w:sz w:val="22"/>
+                <w:szCs w:val="22"/>
+              </w:rPr>
+              <w:t>-</w:t>
+            </w:r>
+          </w:p>
+        </w:tc>
+      </w:tr>
+      <w:tr>
+        <w:tc>
+          <w:tcPr>
+            <w:tcW w:w="2254" w:type="dxa"/>
+            <w:vAlign w:val="center"/>
+          </w:tcPr>
+          <w:p>
+            <w:pPr>
+              <w:spacing w:line="0" w:lineRule="atLeast"/>
+              <w:rPr>
+                <w:rFonts w:ascii="Arial" w:eastAsia="Arial" w:hAnsi="Arial"/>
+                <w:sz w:val="22"/>
+                <w:szCs w:val="22"/>
+              </w:rPr>
+            </w:pPr>
+            <w:r>
+              <w:rPr>
+                <w:rFonts w:ascii="Arial" w:eastAsia="Arial" w:hAnsi="Arial"/>
+                <w:sz w:val="22"/>
+                <w:szCs w:val="22"/>
+              </w:rPr>
+              <w:t>Pull</w:t>
+            </w:r>
+            <w:r>
+              <w:rPr>
+                <w:rFonts w:ascii="Arial" w:eastAsia="Arial" w:hAnsi="Arial"/>
+                <w:sz w:val="22"/>
+                <w:szCs w:val="22"/>
+              </w:rPr>
+              <w:t>-down Resistor</w:t>
+            </w:r>
+          </w:p>
+        </w:tc>
+        <w:tc>
+          <w:tcPr>
+            <w:tcW w:w="2254" w:type="dxa"/>
+            <w:vAlign w:val="center"/>
+          </w:tcPr>
+          <w:p>
+            <w:pPr>
+              <w:spacing w:line="0" w:lineRule="atLeast"/>
+              <w:rPr>
+                <w:rFonts w:ascii="Arial" w:eastAsia="Arial" w:hAnsi="Arial"/>
+                <w:sz w:val="22"/>
+                <w:szCs w:val="22"/>
+              </w:rPr>
+            </w:pPr>
+            <w:r>
+              <w:rPr>
+                <w:rFonts w:ascii="Arial" w:eastAsia="Arial" w:hAnsi="Arial"/>
+                <w:sz w:val="22"/>
+                <w:szCs w:val="22"/>
+              </w:rPr>
+              <w:t>-</w:t>
+            </w:r>
+          </w:p>
+        </w:tc>
+        <w:tc>
+          <w:tcPr>
+            <w:tcW w:w="2254" w:type="dxa"/>
+          </w:tcPr>
+          <w:p>
+            <w:pPr>
+              <w:spacing w:line="0" w:lineRule="atLeast"/>
+              <w:rPr>
+                <w:rFonts w:ascii="Arial" w:eastAsia="Arial" w:hAnsi="Arial"/>
+                <w:sz w:val="22"/>
+                <w:szCs w:val="22"/>
+              </w:rPr>
+            </w:pPr>
+            <m:oMath>
+              <m:r>
+                <w:rPr>
+                  <w:rFonts w:ascii="Cambria Math" w:eastAsia="Arial" w:hAnsi="Cambria Math"/>
+                  <w:sz w:val="22"/>
+                  <w:szCs w:val="22"/>
+                </w:rPr>
+                <m:t>10 k</m:t>
+              </m:r>
+              <m:r>
+                <m:rPr>
+                  <m:sty m:val="p"/>
+                </m:rPr>
+                <w:rPr>
+                  <w:rFonts w:ascii="Cambria Math" w:eastAsia="Arial" w:hAnsi="Cambria Math"/>
+                  <w:sz w:val="22"/>
+                  <w:szCs w:val="22"/>
+                </w:rPr>
+                <m:t>Ω</m:t>
+              </m:r>
+            </m:oMath>
+            <w:r>
+              <w:rPr>
+                <w:rFonts w:ascii="Arial" w:eastAsia="Arial" w:hAnsi="Arial"/>
+                <w:sz w:val="22"/>
+                <w:szCs w:val="22"/>
+              </w:rPr>
+              <w:t xml:space="preserve"> </w:t>
+            </w:r>
+          </w:p>
+        </w:tc>
+        <w:tc>
+          <w:tcPr>
+            <w:tcW w:w="2254" w:type="dxa"/>
+          </w:tcPr>
+          <w:p>
+            <w:pPr>
+              <w:spacing w:line="0" w:lineRule="atLeast"/>
+              <w:rPr>
+                <w:rFonts w:ascii="Arial" w:eastAsia="Arial" w:hAnsi="Arial"/>
+                <w:sz w:val="22"/>
+                <w:szCs w:val="22"/>
+              </w:rPr>
+            </w:pPr>
+            <w:r>
+              <w:rPr>
+                <w:rFonts w:ascii="Arial" w:eastAsia="Arial" w:hAnsi="Arial"/>
+                <w:sz w:val="22"/>
+                <w:szCs w:val="22"/>
+              </w:rPr>
+              <w:t>-</w:t>
+            </w:r>
+          </w:p>
+        </w:tc>
+      </w:tr>
+      <w:tr>
+        <w:tc>
+          <w:tcPr>
+            <w:tcW w:w="2254" w:type="dxa"/>
+            <w:vAlign w:val="center"/>
+          </w:tcPr>
+          <w:p>
+            <w:pPr>
+              <w:spacing w:line="0" w:lineRule="atLeast"/>
+              <w:rPr>
+                <w:rFonts w:ascii="Arial" w:eastAsia="Arial" w:hAnsi="Arial"/>
+                <w:sz w:val="22"/>
+                <w:szCs w:val="22"/>
+              </w:rPr>
+            </w:pPr>
+            <w:r>
+              <w:rPr>
+                <w:rFonts w:ascii="Arial" w:eastAsia="Arial" w:hAnsi="Arial"/>
+                <w:sz w:val="22"/>
+                <w:szCs w:val="22"/>
+              </w:rPr>
+              <w:t xml:space="preserve">Data </w:t>
+            </w:r>
+            <w:r>
+              <w:rPr>
+                <w:rFonts w:ascii="Arial" w:eastAsia="Arial" w:hAnsi="Arial"/>
+                <w:sz w:val="22"/>
+                <w:szCs w:val="22"/>
+              </w:rPr>
+              <w:t>a</w:t>
+            </w:r>
+            <w:r>
+              <w:rPr>
+                <w:rFonts w:ascii="Arial" w:eastAsia="Arial" w:hAnsi="Arial"/>
+                <w:sz w:val="22"/>
+                <w:szCs w:val="22"/>
+              </w:rPr>
+              <w:t xml:space="preserve">cquisition </w:t>
+            </w:r>
+            <w:r>
+              <w:rPr>
+                <w:rFonts w:ascii="Arial" w:eastAsia="Arial" w:hAnsi="Arial"/>
+                <w:sz w:val="22"/>
+                <w:szCs w:val="22"/>
+              </w:rPr>
+              <w:t>s</w:t>
+            </w:r>
+            <w:r>
+              <w:rPr>
+                <w:rFonts w:ascii="Arial" w:eastAsia="Arial" w:hAnsi="Arial"/>
+                <w:sz w:val="22"/>
+                <w:szCs w:val="22"/>
+              </w:rPr>
+              <w:t>ystem</w:t>
+            </w:r>
+          </w:p>
+        </w:tc>
+        <w:tc>
+          <w:tcPr>
+            <w:tcW w:w="2254" w:type="dxa"/>
+            <w:vAlign w:val="center"/>
+          </w:tcPr>
+          <w:p>
+            <w:pPr>
+              <w:spacing w:line="0" w:lineRule="atLeast"/>
+              <w:rPr>
+                <w:rFonts w:ascii="Arial" w:eastAsia="Arial" w:hAnsi="Arial"/>
+                <w:sz w:val="22"/>
+                <w:szCs w:val="22"/>
+              </w:rPr>
+            </w:pPr>
+            <w:r>
+              <w:rPr>
+                <w:rFonts w:ascii="Arial" w:eastAsia="Arial" w:hAnsi="Arial"/>
+                <w:sz w:val="22"/>
+                <w:szCs w:val="22"/>
+              </w:rPr>
+              <w:t>HBM QuantumX (801433534)</w:t>
             </w:r>
           </w:p>
         </w:tc>
@@ -5433,6 +6546,26 @@
     </w:p>
     <w:p>
       <w:pPr>
+        <w:pStyle w:val="Heading2"/>
+        <w:rPr>
+          <w:rFonts w:ascii="Arial" w:eastAsia="Arial" w:hAnsi="Arial" w:cs="Arial"/>
+          <w:b/>
+          <w:bCs/>
+          <w:color w:val="000000" w:themeColor="text1"/>
+        </w:rPr>
+      </w:pPr>
+      <w:r>
+        <w:rPr>
+          <w:rFonts w:ascii="Arial" w:eastAsia="Arial" w:hAnsi="Arial" w:cs="Arial"/>
+          <w:b/>
+          <w:bCs/>
+          <w:color w:val="000000" w:themeColor="text1"/>
+        </w:rPr>
+        <w:t>Introduction</w:t>
+      </w:r>
+    </w:p>
+    <w:p>
+      <w:pPr>
         <w:spacing w:line="0" w:lineRule="atLeast"/>
         <w:rPr>
           <w:rFonts w:ascii="Arial" w:eastAsia="Arial" w:hAnsi="Arial"/>
@@ -5470,7 +6603,23 @@
           <w:sz w:val="22"/>
           <w:szCs w:val="22"/>
         </w:rPr>
-        <w:t>on the pressure platform where strain is the highest to calculated the holding torque</w:t>
+        <w:t xml:space="preserve">on the pressure platform where strain is the highest to </w:t>
+      </w:r>
+      <w:r>
+        <w:rPr>
+          <w:rFonts w:ascii="Arial" w:eastAsia="Arial" w:hAnsi="Arial"/>
+          <w:sz w:val="22"/>
+          <w:szCs w:val="22"/>
+        </w:rPr>
+        <w:t>calculate</w:t>
+      </w:r>
+      <w:r>
+        <w:rPr>
+          <w:rFonts w:ascii="Arial" w:eastAsia="Arial" w:hAnsi="Arial"/>
+          <w:sz w:val="22"/>
+          <w:szCs w:val="22"/>
+        </w:rPr>
+        <w:t xml:space="preserve"> the holding torque</w:t>
       </w:r>
       <w:r>
         <w:rPr>
@@ -5519,6 +6668,70 @@
     </w:p>
     <w:p>
       <w:pPr>
+        <w:pStyle w:val="Heading2"/>
+        <w:rPr>
+          <w:rFonts w:ascii="Arial" w:eastAsia="Arial" w:hAnsi="Arial" w:cs="Arial"/>
+          <w:b/>
+          <w:bCs/>
+          <w:color w:val="000000" w:themeColor="text1"/>
+        </w:rPr>
+      </w:pPr>
+      <w:r>
+        <w:rPr>
+          <w:rFonts w:ascii="Arial" w:eastAsia="Arial" w:hAnsi="Arial" w:cs="Arial"/>
+          <w:b/>
+          <w:bCs/>
+          <w:color w:val="000000" w:themeColor="text1"/>
+        </w:rPr>
+        <w:t>PPE Required</w:t>
+      </w:r>
+    </w:p>
+    <w:p>
+      <w:pPr>
+        <w:pStyle w:val="ListParagraph"/>
+        <w:numPr>
+          <w:ilvl w:val="0"/>
+          <w:numId w:val="11"/>
+        </w:numPr>
+      </w:pPr>
+      <w:r>
+        <w:rPr>
+          <w:rFonts w:ascii="Arial" w:hAnsi="Arial"/>
+          <w:sz w:val="22"/>
+          <w:szCs w:val="22"/>
+        </w:rPr>
+        <w:t>Safety glasses</w:t>
+      </w:r>
+    </w:p>
+    <w:p>
+      <w:pPr>
+        <w:pStyle w:val="ListParagraph"/>
+        <w:numPr>
+          <w:ilvl w:val="0"/>
+          <w:numId w:val="11"/>
+        </w:numPr>
+      </w:pPr>
+      <w:r>
+        <w:rPr>
+          <w:rFonts w:ascii="Arial" w:hAnsi="Arial"/>
+          <w:sz w:val="22"/>
+          <w:szCs w:val="22"/>
+        </w:rPr>
+        <w:t>Protective gloves</w:t>
+      </w:r>
+    </w:p>
+    <w:p>
+      <w:pPr>
+        <w:spacing w:line="0" w:lineRule="atLeast"/>
+        <w:rPr>
+          <w:rFonts w:ascii="Arial" w:eastAsia="Arial" w:hAnsi="Arial"/>
+          <w:sz w:val="22"/>
+          <w:szCs w:val="22"/>
+        </w:rPr>
+      </w:pPr>
+    </w:p>
+    <w:p>
+      <w:pPr>
         <w:spacing w:line="0" w:lineRule="atLeast"/>
         <w:rPr>
           <w:rFonts w:ascii="Arial" w:eastAsia="Arial" w:hAnsi="Arial"/>
@@ -5551,13 +6764,40 @@
     </w:p>
     <w:p>
       <w:pPr>
-        <w:spacing w:line="0" w:lineRule="atLeast"/>
-        <w:rPr>
-          <w:rFonts w:ascii="Arial" w:eastAsia="Arial" w:hAnsi="Arial"/>
+        <w:pStyle w:val="Heading2"/>
+        <w:rPr>
+          <w:rFonts w:ascii="Arial" w:eastAsia="Arial" w:hAnsi="Arial" w:cs="Arial"/>
           <w:b/>
           <w:bCs/>
-          <w:sz w:val="28"/>
-          <w:szCs w:val="28"/>
+          <w:color w:val="000000" w:themeColor="text1"/>
+        </w:rPr>
+      </w:pPr>
+      <w:r>
+        <w:rPr>
+          <w:rFonts w:ascii="Arial" w:eastAsia="Arial" w:hAnsi="Arial" w:cs="Arial"/>
+          <w:b/>
+          <w:bCs/>
+          <w:color w:val="000000" w:themeColor="text1"/>
+        </w:rPr>
+        <w:t xml:space="preserve">Setup </w:t>
+      </w:r>
+      <w:r>
+        <w:rPr>
+          <w:rFonts w:ascii="Arial" w:eastAsia="Arial" w:hAnsi="Arial" w:cs="Arial"/>
+          <w:b/>
+          <w:bCs/>
+          <w:color w:val="000000" w:themeColor="text1"/>
+        </w:rPr>
+        <w:t>Procedure</w:t>
+      </w:r>
+    </w:p>
+    <w:p>
+      <w:pPr>
+        <w:spacing w:line="0" w:lineRule="atLeast"/>
+        <w:rPr>
+          <w:rFonts w:ascii="Arial" w:eastAsia="Arial" w:hAnsi="Arial"/>
+          <w:sz w:val="22"/>
+          <w:szCs w:val="22"/>
         </w:rPr>
       </w:pPr>
     </w:p>
@@ -5589,15 +6829,119 @@
           <w:sz w:val="22"/>
           <w:szCs w:val="22"/>
         </w:rPr>
-        <w:t>circuit and connect it to the fabricated electromagnet and the Manson HCS-3202 power supply.</w:t>
-      </w:r>
+        <w:t>circuit</w:t>
+      </w:r>
+      <w:r>
+        <w:rPr>
+          <w:rFonts w:ascii="Arial" w:eastAsia="Arial" w:hAnsi="Arial"/>
+          <w:sz w:val="22"/>
+          <w:szCs w:val="22"/>
+        </w:rPr>
+        <w:t xml:space="preserve">, wiring the </w:t>
+      </w:r>
+      <w:r>
+        <w:rPr>
+          <w:rFonts w:ascii="Arial" w:eastAsia="Arial" w:hAnsi="Arial"/>
+          <w:sz w:val="22"/>
+          <w:szCs w:val="22"/>
+        </w:rPr>
+        <w:t>normally closed (NC) emergency stop button in series with the DC power supply</w:t>
+      </w:r>
+      <w:r>
+        <w:rPr>
+          <w:rFonts w:ascii="Arial" w:eastAsia="Arial" w:hAnsi="Arial"/>
+          <w:sz w:val="22"/>
+          <w:szCs w:val="22"/>
+        </w:rPr>
+        <w:t>.</w:t>
+      </w:r>
+      <w:r>
+        <w:rPr>
+          <w:rFonts w:ascii="Arial" w:eastAsia="Arial" w:hAnsi="Arial"/>
+          <w:sz w:val="22"/>
+          <w:szCs w:val="22"/>
+        </w:rPr>
+        <w:t xml:space="preserve"> </w:t>
+      </w:r>
+      <w:r>
+        <w:rPr>
+          <w:rFonts w:ascii="Arial" w:eastAsia="Arial" w:hAnsi="Arial"/>
+          <w:sz w:val="22"/>
+          <w:szCs w:val="22"/>
+        </w:rPr>
+        <w:t>C</w:t>
+      </w:r>
+      <w:r>
+        <w:rPr>
+          <w:rFonts w:ascii="Arial" w:eastAsia="Arial" w:hAnsi="Arial"/>
+          <w:sz w:val="22"/>
+          <w:szCs w:val="22"/>
+        </w:rPr>
+        <w:t xml:space="preserve">onnect </w:t>
+      </w:r>
+      <w:r>
+        <w:rPr>
+          <w:rFonts w:ascii="Arial" w:eastAsia="Arial" w:hAnsi="Arial"/>
+          <w:sz w:val="22"/>
+          <w:szCs w:val="22"/>
+        </w:rPr>
+        <w:t>the circuit</w:t>
+      </w:r>
+      <w:r>
+        <w:rPr>
+          <w:rFonts w:ascii="Arial" w:eastAsia="Arial" w:hAnsi="Arial"/>
+          <w:sz w:val="22"/>
+          <w:szCs w:val="22"/>
+        </w:rPr>
+        <w:t xml:space="preserve"> to the fabricated electromagnet.</w:t>
+      </w:r>
+    </w:p>
+    <w:p>
+      <w:pPr>
+        <w:spacing w:line="0" w:lineRule="atLeast"/>
+        <w:rPr>
+          <w:rFonts w:ascii="Arial" w:eastAsia="Arial" w:hAnsi="Arial"/>
+          <w:sz w:val="22"/>
+          <w:szCs w:val="22"/>
+        </w:rPr>
+      </w:pPr>
+    </w:p>
+    <w:p>
+      <w:pPr>
+        <w:pStyle w:val="Heading2"/>
+        <w:rPr>
+          <w:rFonts w:ascii="Arial" w:eastAsia="Arial" w:hAnsi="Arial" w:cs="Arial"/>
+          <w:b/>
+          <w:bCs/>
+          <w:color w:val="000000" w:themeColor="text1"/>
+        </w:rPr>
+      </w:pPr>
+      <w:r>
+        <w:rPr>
+          <w:rFonts w:ascii="Arial" w:eastAsia="Arial" w:hAnsi="Arial" w:cs="Arial"/>
+          <w:b/>
+          <w:bCs/>
+          <w:color w:val="000000" w:themeColor="text1"/>
+        </w:rPr>
+        <w:t>Safety Checks</w:t>
+      </w:r>
+    </w:p>
+    <w:p>
+      <w:pPr>
+        <w:spacing w:line="0" w:lineRule="atLeast"/>
+        <w:rPr>
+          <w:rFonts w:ascii="Arial" w:eastAsia="Arial" w:hAnsi="Arial"/>
+          <w:sz w:val="22"/>
+          <w:szCs w:val="22"/>
+        </w:rPr>
+      </w:pPr>
     </w:p>
     <w:p>
       <w:pPr>
         <w:pStyle w:val="ListParagraph"/>
         <w:numPr>
           <w:ilvl w:val="0"/>
-          <w:numId w:val="7"/>
+          <w:numId w:val="12"/>
         </w:numPr>
         <w:spacing w:line="0" w:lineRule="atLeast"/>
         <w:rPr>
@@ -5612,15 +6956,23 @@
           <w:sz w:val="22"/>
           <w:szCs w:val="22"/>
         </w:rPr>
-        <w:t xml:space="preserve">Clean the pressure platform surface </w:t>
-      </w:r>
-      <w:r>
-        <w:rPr>
-          <w:rFonts w:ascii="Arial" w:eastAsia="Arial" w:hAnsi="Arial"/>
-          <w:sz w:val="22"/>
-          <w:szCs w:val="22"/>
-        </w:rPr>
-        <w:t>thoroughly using RMS 1 spray ad cleaning pads to remove grease or oil prior to sanding</w:t>
+        <w:t xml:space="preserve">Verify the functionality of the emergency stop button by engaging it before </w:t>
+      </w:r>
+      <w:r>
+        <w:rPr>
+          <w:rFonts w:ascii="Arial" w:eastAsia="Arial" w:hAnsi="Arial"/>
+          <w:sz w:val="22"/>
+          <w:szCs w:val="22"/>
+        </w:rPr>
+        <w:t xml:space="preserve">running </w:t>
+      </w:r>
+      <w:r>
+        <w:rPr>
+          <w:rFonts w:ascii="Arial" w:eastAsia="Arial" w:hAnsi="Arial"/>
+          <w:sz w:val="22"/>
+          <w:szCs w:val="22"/>
+        </w:rPr>
+        <w:t>full power through the electromagnet</w:t>
       </w:r>
       <w:r>
         <w:rPr>
@@ -5630,13 +6982,92 @@
         </w:rPr>
         <w:t>.</w:t>
       </w:r>
+    </w:p>
+    <w:p>
+      <w:pPr>
+        <w:spacing w:line="0" w:lineRule="atLeast"/>
+        <w:rPr>
+          <w:rFonts w:ascii="Arial" w:eastAsia="Arial" w:hAnsi="Arial"/>
+          <w:sz w:val="22"/>
+          <w:szCs w:val="22"/>
+        </w:rPr>
+      </w:pPr>
+    </w:p>
+    <w:p>
+      <w:pPr>
+        <w:pStyle w:val="Heading2"/>
+        <w:rPr>
+          <w:rFonts w:ascii="Arial" w:eastAsia="Arial" w:hAnsi="Arial" w:cs="Arial"/>
+          <w:b/>
+          <w:bCs/>
+          <w:color w:val="000000" w:themeColor="text1"/>
+        </w:rPr>
+      </w:pPr>
+      <w:r>
+        <w:rPr>
+          <w:rFonts w:ascii="Arial" w:eastAsia="Arial" w:hAnsi="Arial" w:cs="Arial"/>
+          <w:b/>
+          <w:bCs/>
+          <w:color w:val="000000" w:themeColor="text1"/>
+        </w:rPr>
+        <w:t>Connections and Loading</w:t>
+      </w:r>
+    </w:p>
+    <w:p>
+      <w:pPr>
+        <w:spacing w:line="0" w:lineRule="atLeast"/>
+        <w:rPr>
+          <w:rFonts w:ascii="Arial" w:eastAsia="Arial" w:hAnsi="Arial"/>
+          <w:sz w:val="22"/>
+          <w:szCs w:val="22"/>
+        </w:rPr>
+      </w:pPr>
     </w:p>
     <w:p>
       <w:pPr>
         <w:pStyle w:val="ListParagraph"/>
         <w:numPr>
           <w:ilvl w:val="0"/>
-          <w:numId w:val="7"/>
+          <w:numId w:val="13"/>
+        </w:numPr>
+        <w:spacing w:line="0" w:lineRule="atLeast"/>
+        <w:rPr>
+          <w:rFonts w:ascii="Arial" w:eastAsia="Arial" w:hAnsi="Arial"/>
+          <w:sz w:val="22"/>
+          <w:szCs w:val="22"/>
+        </w:rPr>
+      </w:pPr>
+      <w:r>
+        <w:rPr>
+          <w:rFonts w:ascii="Arial" w:eastAsia="Arial" w:hAnsi="Arial"/>
+          <w:sz w:val="22"/>
+          <w:szCs w:val="22"/>
+        </w:rPr>
+        <w:t xml:space="preserve">Clean the pressure platform surface </w:t>
+      </w:r>
+      <w:r>
+        <w:rPr>
+          <w:rFonts w:ascii="Arial" w:eastAsia="Arial" w:hAnsi="Arial"/>
+          <w:sz w:val="22"/>
+          <w:szCs w:val="22"/>
+        </w:rPr>
+        <w:t>thoroughly using RMS 1 spray ad cleaning pads to remove grease or oil prior to sanding</w:t>
+      </w:r>
+      <w:r>
+        <w:rPr>
+          <w:rFonts w:ascii="Arial" w:eastAsia="Arial" w:hAnsi="Arial"/>
+          <w:sz w:val="22"/>
+          <w:szCs w:val="22"/>
+        </w:rPr>
+        <w:t>.</w:t>
+      </w:r>
+    </w:p>
+    <w:p>
+      <w:pPr>
+        <w:pStyle w:val="ListParagraph"/>
+        <w:numPr>
+          <w:ilvl w:val="0"/>
+          <w:numId w:val="13"/>
         </w:numPr>
         <w:spacing w:line="0" w:lineRule="atLeast"/>
         <w:rPr>
@@ -5717,7 +7148,7 @@
         <w:pStyle w:val="ListParagraph"/>
         <w:numPr>
           <w:ilvl w:val="0"/>
-          <w:numId w:val="7"/>
+          <w:numId w:val="13"/>
         </w:numPr>
         <w:spacing w:line="0" w:lineRule="atLeast"/>
         <w:rPr>
@@ -5756,7 +7187,7 @@
         <w:pStyle w:val="ListParagraph"/>
         <w:numPr>
           <w:ilvl w:val="0"/>
-          <w:numId w:val="7"/>
+          <w:numId w:val="13"/>
         </w:numPr>
         <w:spacing w:line="0" w:lineRule="atLeast"/>
         <w:rPr>
@@ -5819,7 +7250,7 @@
         <w:pStyle w:val="ListParagraph"/>
         <w:numPr>
           <w:ilvl w:val="0"/>
-          <w:numId w:val="7"/>
+          <w:numId w:val="13"/>
         </w:numPr>
         <w:spacing w:line="0" w:lineRule="atLeast"/>
         <w:rPr>
@@ -5858,7 +7289,7 @@
         <w:pStyle w:val="ListParagraph"/>
         <w:numPr>
           <w:ilvl w:val="0"/>
-          <w:numId w:val="7"/>
+          <w:numId w:val="13"/>
         </w:numPr>
         <w:spacing w:line="0" w:lineRule="atLeast"/>
         <w:rPr>
@@ -5945,7 +7376,7 @@
         <w:pStyle w:val="ListParagraph"/>
         <w:numPr>
           <w:ilvl w:val="0"/>
-          <w:numId w:val="7"/>
+          <w:numId w:val="13"/>
         </w:numPr>
         <w:spacing w:line="0" w:lineRule="atLeast"/>
         <w:rPr>
@@ -5976,7 +7407,7 @@
         <w:pStyle w:val="ListParagraph"/>
         <w:numPr>
           <w:ilvl w:val="0"/>
-          <w:numId w:val="7"/>
+          <w:numId w:val="13"/>
         </w:numPr>
         <w:spacing w:line="0" w:lineRule="atLeast"/>
         <w:rPr>
@@ -5991,7 +7422,6 @@
           <w:sz w:val="22"/>
           <w:szCs w:val="22"/>
         </w:rPr>
-        <w:lastRenderedPageBreak/>
         <w:t xml:space="preserve">Apply protective covering </w:t>
       </w:r>
       <w:r>
@@ -6003,6 +7433,394 @@
         <w:t>over the soldering connections.</w:t>
       </w:r>
     </w:p>
+    <w:p>
+      <w:pPr>
+        <w:spacing w:line="0" w:lineRule="atLeast"/>
+        <w:rPr>
+          <w:rFonts w:ascii="Arial" w:eastAsia="Arial" w:hAnsi="Arial"/>
+          <w:b/>
+          <w:bCs/>
+          <w:sz w:val="28"/>
+          <w:szCs w:val="28"/>
+        </w:rPr>
+      </w:pPr>
+    </w:p>
+    <w:p>
+      <w:pPr>
+        <w:spacing w:line="0" w:lineRule="atLeast"/>
+        <w:jc w:val="center"/>
+        <w:rPr>
+          <w:rFonts w:ascii="Arial" w:eastAsia="Arial" w:hAnsi="Arial"/>
+          <w:sz w:val="24"/>
+          <w:szCs w:val="24"/>
+          <w:u w:val="single"/>
+        </w:rPr>
+      </w:pPr>
+      <w:r>
+        <w:rPr>
+          <w:rFonts w:ascii="Arial" w:eastAsia="Arial" w:hAnsi="Arial"/>
+          <w:sz w:val="24"/>
+          <w:szCs w:val="24"/>
+          <w:u w:val="single"/>
+        </w:rPr>
+        <w:t>Signatures:</w:t>
+      </w:r>
+    </w:p>
+    <w:p>
+      <w:pPr>
+        <w:spacing w:line="0" w:lineRule="atLeast"/>
+        <w:jc w:val="center"/>
+        <w:rPr>
+          <w:rFonts w:ascii="Arial" w:eastAsia="Arial" w:hAnsi="Arial"/>
+          <w:sz w:val="24"/>
+          <w:szCs w:val="24"/>
+          <w:u w:val="single"/>
+        </w:rPr>
+      </w:pPr>
+    </w:p>
+    <w:tbl>
+      <w:tblPr>
+        <w:tblStyle w:val="TableGrid"/>
+        <w:tblW w:w="0" w:type="auto"/>
+        <w:tblLook w:val="04A0" w:firstRow="1" w:lastRow="0" w:firstColumn="1" w:lastColumn="0" w:noHBand="0" w:noVBand="1"/>
+      </w:tblPr>
+      <w:tblGrid>
+        <w:gridCol w:w="3964"/>
+        <w:gridCol w:w="4136"/>
+      </w:tblGrid>
+      <w:tr>
+        <w:tc>
+          <w:tcPr>
+            <w:tcW w:w="3964" w:type="dxa"/>
+            <w:tcBorders>
+              <w:top w:val="single" w:sz="4" w:space="0" w:color="FFFFFF" w:themeColor="background1"/>
+              <w:left w:val="single" w:sz="4" w:space="0" w:color="FFFFFF" w:themeColor="background1"/>
+              <w:bottom w:val="single" w:sz="4" w:space="0" w:color="FFFFFF" w:themeColor="background1"/>
+              <w:right w:val="single" w:sz="4" w:space="0" w:color="FFFFFF" w:themeColor="background1"/>
+            </w:tcBorders>
+          </w:tcPr>
+          <w:p>
+            <w:pPr>
+              <w:spacing w:line="276" w:lineRule="auto"/>
+              <w:rPr>
+                <w:rFonts w:ascii="Arial" w:eastAsia="Arial" w:hAnsi="Arial"/>
+                <w:sz w:val="22"/>
+                <w:szCs w:val="22"/>
+              </w:rPr>
+            </w:pPr>
+            <w:r>
+              <w:rPr>
+                <w:rFonts w:ascii="Arial" w:eastAsia="Arial" w:hAnsi="Arial"/>
+                <w:sz w:val="22"/>
+                <w:szCs w:val="22"/>
+              </w:rPr>
+              <w:t>Student:</w:t>
+            </w:r>
+          </w:p>
+          <w:p>
+            <w:pPr>
+              <w:spacing w:line="276" w:lineRule="auto"/>
+              <w:rPr>
+                <w:rFonts w:ascii="Arial" w:eastAsia="Arial" w:hAnsi="Arial"/>
+                <w:sz w:val="22"/>
+                <w:szCs w:val="22"/>
+                <w:u w:val="single"/>
+              </w:rPr>
+            </w:pPr>
+            <w:r>
+              <w:rPr>
+                <w:rFonts w:ascii="Arial" w:eastAsia="Arial" w:hAnsi="Arial"/>
+                <w:sz w:val="22"/>
+                <w:szCs w:val="22"/>
+              </w:rPr>
+              <w:t>(</w:t>
+            </w:r>
+            <w:r>
+              <w:rPr>
+                <w:rFonts w:ascii="Arial" w:eastAsia="Arial" w:hAnsi="Arial"/>
+                <w:sz w:val="22"/>
+                <w:szCs w:val="22"/>
+              </w:rPr>
+              <w:t>Lena Matota</w:t>
+            </w:r>
+            <w:r>
+              <w:rPr>
+                <w:rFonts w:ascii="Arial" w:eastAsia="Arial" w:hAnsi="Arial"/>
+                <w:sz w:val="22"/>
+                <w:szCs w:val="22"/>
+              </w:rPr>
+              <w:t>)</w:t>
+            </w:r>
+          </w:p>
+        </w:tc>
+        <w:tc>
+          <w:tcPr>
+            <w:tcW w:w="4136" w:type="dxa"/>
+            <w:tcBorders>
+              <w:top w:val="single" w:sz="4" w:space="0" w:color="FFFFFF" w:themeColor="background1"/>
+              <w:left w:val="single" w:sz="4" w:space="0" w:color="FFFFFF" w:themeColor="background1"/>
+              <w:right w:val="single" w:sz="4" w:space="0" w:color="FFFFFF" w:themeColor="background1"/>
+            </w:tcBorders>
+          </w:tcPr>
+          <w:p>
+            <w:pPr>
+              <w:spacing w:line="0" w:lineRule="atLeast"/>
+              <w:jc w:val="center"/>
+              <w:rPr>
+                <w:rFonts w:ascii="Arial" w:eastAsia="Arial" w:hAnsi="Arial"/>
+                <w:sz w:val="24"/>
+                <w:szCs w:val="24"/>
+                <w:u w:val="single"/>
+              </w:rPr>
+            </w:pPr>
+          </w:p>
+        </w:tc>
+      </w:tr>
+      <w:tr>
+        <w:tc>
+          <w:tcPr>
+            <w:tcW w:w="3964" w:type="dxa"/>
+            <w:tcBorders>
+              <w:top w:val="single" w:sz="4" w:space="0" w:color="FFFFFF" w:themeColor="background1"/>
+              <w:left w:val="single" w:sz="4" w:space="0" w:color="FFFFFF" w:themeColor="background1"/>
+              <w:bottom w:val="single" w:sz="4" w:space="0" w:color="FFFFFF" w:themeColor="background1"/>
+              <w:right w:val="single" w:sz="4" w:space="0" w:color="FFFFFF" w:themeColor="background1"/>
+            </w:tcBorders>
+          </w:tcPr>
+          <w:p>
+            <w:pPr>
+              <w:spacing w:line="276" w:lineRule="auto"/>
+              <w:rPr>
+                <w:rFonts w:ascii="Arial" w:eastAsia="Arial" w:hAnsi="Arial"/>
+                <w:sz w:val="22"/>
+                <w:szCs w:val="22"/>
+              </w:rPr>
+            </w:pPr>
+            <w:r>
+              <w:rPr>
+                <w:rFonts w:ascii="Arial" w:eastAsia="Arial" w:hAnsi="Arial"/>
+                <w:sz w:val="22"/>
+                <w:szCs w:val="22"/>
+              </w:rPr>
+              <w:t>Supervisor:</w:t>
+            </w:r>
+          </w:p>
+          <w:p>
+            <w:pPr>
+              <w:spacing w:line="276" w:lineRule="auto"/>
+              <w:rPr>
+                <w:rFonts w:ascii="Arial" w:eastAsia="Arial" w:hAnsi="Arial"/>
+                <w:sz w:val="22"/>
+                <w:szCs w:val="22"/>
+                <w:u w:val="single"/>
+              </w:rPr>
+            </w:pPr>
+            <w:r>
+              <w:rPr>
+                <w:rFonts w:ascii="Arial" w:eastAsia="Arial" w:hAnsi="Arial"/>
+                <w:sz w:val="22"/>
+                <w:szCs w:val="22"/>
+              </w:rPr>
+              <w:t>(</w:t>
+            </w:r>
+            <w:r>
+              <w:rPr>
+                <w:rFonts w:ascii="Arial" w:eastAsia="Arial" w:hAnsi="Arial"/>
+                <w:sz w:val="22"/>
+                <w:szCs w:val="22"/>
+              </w:rPr>
+              <w:t>Kristiaan Schreve</w:t>
+            </w:r>
+            <w:r>
+              <w:rPr>
+                <w:rFonts w:ascii="Arial" w:eastAsia="Arial" w:hAnsi="Arial"/>
+                <w:sz w:val="22"/>
+                <w:szCs w:val="22"/>
+              </w:rPr>
+              <w:t>)</w:t>
+            </w:r>
+          </w:p>
+        </w:tc>
+        <w:tc>
+          <w:tcPr>
+            <w:tcW w:w="4136" w:type="dxa"/>
+            <w:tcBorders>
+              <w:left w:val="single" w:sz="4" w:space="0" w:color="FFFFFF" w:themeColor="background1"/>
+              <w:right w:val="single" w:sz="4" w:space="0" w:color="FFFFFF" w:themeColor="background1"/>
+            </w:tcBorders>
+          </w:tcPr>
+          <w:p>
+            <w:pPr>
+              <w:spacing w:line="0" w:lineRule="atLeast"/>
+              <w:jc w:val="center"/>
+              <w:rPr>
+                <w:rFonts w:ascii="Arial" w:eastAsia="Arial" w:hAnsi="Arial"/>
+                <w:sz w:val="24"/>
+                <w:szCs w:val="24"/>
+                <w:u w:val="single"/>
+              </w:rPr>
+            </w:pPr>
+          </w:p>
+        </w:tc>
+      </w:tr>
+      <w:tr>
+        <w:tc>
+          <w:tcPr>
+            <w:tcW w:w="3964" w:type="dxa"/>
+            <w:tcBorders>
+              <w:top w:val="single" w:sz="4" w:space="0" w:color="FFFFFF" w:themeColor="background1"/>
+              <w:left w:val="single" w:sz="4" w:space="0" w:color="FFFFFF" w:themeColor="background1"/>
+              <w:bottom w:val="single" w:sz="4" w:space="0" w:color="FFFFFF" w:themeColor="background1"/>
+              <w:right w:val="single" w:sz="4" w:space="0" w:color="FFFFFF" w:themeColor="background1"/>
+            </w:tcBorders>
+          </w:tcPr>
+          <w:p>
+            <w:pPr>
+              <w:spacing w:line="276" w:lineRule="auto"/>
+              <w:rPr>
+                <w:rFonts w:ascii="Arial" w:eastAsia="Arial" w:hAnsi="Arial"/>
+                <w:sz w:val="22"/>
+                <w:szCs w:val="22"/>
+              </w:rPr>
+            </w:pPr>
+            <w:r>
+              <w:rPr>
+                <w:rFonts w:ascii="Arial" w:eastAsia="Arial" w:hAnsi="Arial"/>
+                <w:sz w:val="22"/>
+                <w:szCs w:val="22"/>
+              </w:rPr>
+              <w:t>Lab Engineer:</w:t>
+            </w:r>
+          </w:p>
+          <w:p>
+            <w:pPr>
+              <w:spacing w:line="276" w:lineRule="auto"/>
+              <w:rPr>
+                <w:rFonts w:ascii="Arial" w:eastAsia="Arial" w:hAnsi="Arial"/>
+                <w:sz w:val="22"/>
+                <w:szCs w:val="22"/>
+                <w:u w:val="single"/>
+              </w:rPr>
+            </w:pPr>
+            <w:r>
+              <w:rPr>
+                <w:rFonts w:ascii="Arial" w:eastAsia="Arial" w:hAnsi="Arial"/>
+                <w:sz w:val="22"/>
+                <w:szCs w:val="22"/>
+              </w:rPr>
+              <w:t>(</w:t>
+            </w:r>
+            <w:r>
+              <w:rPr>
+                <w:rFonts w:ascii="Arial" w:eastAsia="Arial" w:hAnsi="Arial"/>
+                <w:sz w:val="22"/>
+                <w:szCs w:val="22"/>
+              </w:rPr>
+              <w:t>Karl Zapke</w:t>
+            </w:r>
+            <w:r>
+              <w:rPr>
+                <w:rFonts w:ascii="Arial" w:eastAsia="Arial" w:hAnsi="Arial"/>
+                <w:sz w:val="22"/>
+                <w:szCs w:val="22"/>
+              </w:rPr>
+              <w:t>)</w:t>
+            </w:r>
+          </w:p>
+        </w:tc>
+        <w:tc>
+          <w:tcPr>
+            <w:tcW w:w="4136" w:type="dxa"/>
+            <w:tcBorders>
+              <w:left w:val="single" w:sz="4" w:space="0" w:color="FFFFFF" w:themeColor="background1"/>
+              <w:right w:val="single" w:sz="4" w:space="0" w:color="FFFFFF" w:themeColor="background1"/>
+            </w:tcBorders>
+          </w:tcPr>
+          <w:p>
+            <w:pPr>
+              <w:spacing w:line="0" w:lineRule="atLeast"/>
+              <w:jc w:val="center"/>
+              <w:rPr>
+                <w:rFonts w:ascii="Arial" w:eastAsia="Arial" w:hAnsi="Arial"/>
+                <w:sz w:val="24"/>
+                <w:szCs w:val="24"/>
+                <w:u w:val="single"/>
+              </w:rPr>
+            </w:pPr>
+          </w:p>
+        </w:tc>
+      </w:tr>
+      <w:tr>
+        <w:tc>
+          <w:tcPr>
+            <w:tcW w:w="3964" w:type="dxa"/>
+            <w:tcBorders>
+              <w:top w:val="single" w:sz="4" w:space="0" w:color="FFFFFF" w:themeColor="background1"/>
+              <w:left w:val="single" w:sz="4" w:space="0" w:color="FFFFFF" w:themeColor="background1"/>
+              <w:bottom w:val="single" w:sz="4" w:space="0" w:color="FFFFFF" w:themeColor="background1"/>
+              <w:right w:val="single" w:sz="4" w:space="0" w:color="FFFFFF" w:themeColor="background1"/>
+            </w:tcBorders>
+          </w:tcPr>
+          <w:p>
+            <w:pPr>
+              <w:spacing w:line="276" w:lineRule="auto"/>
+              <w:rPr>
+                <w:rFonts w:ascii="Arial" w:eastAsia="Arial" w:hAnsi="Arial"/>
+                <w:sz w:val="22"/>
+                <w:szCs w:val="22"/>
+              </w:rPr>
+            </w:pPr>
+            <w:r>
+              <w:rPr>
+                <w:rFonts w:ascii="Arial" w:eastAsia="Arial" w:hAnsi="Arial"/>
+                <w:sz w:val="22"/>
+                <w:szCs w:val="22"/>
+              </w:rPr>
+              <w:t>Head of Safety:</w:t>
+            </w:r>
+          </w:p>
+          <w:p>
+            <w:pPr>
+              <w:spacing w:line="276" w:lineRule="auto"/>
+              <w:rPr>
+                <w:rFonts w:ascii="Arial" w:eastAsia="Arial" w:hAnsi="Arial"/>
+                <w:sz w:val="22"/>
+                <w:szCs w:val="22"/>
+              </w:rPr>
+            </w:pPr>
+            <w:r>
+              <w:rPr>
+                <w:rFonts w:ascii="Arial" w:eastAsia="Arial" w:hAnsi="Arial"/>
+                <w:sz w:val="22"/>
+                <w:szCs w:val="22"/>
+              </w:rPr>
+              <w:t>(C Zietsman)</w:t>
+            </w:r>
+          </w:p>
+        </w:tc>
+        <w:tc>
+          <w:tcPr>
+            <w:tcW w:w="4136" w:type="dxa"/>
+            <w:tcBorders>
+              <w:left w:val="single" w:sz="4" w:space="0" w:color="FFFFFF" w:themeColor="background1"/>
+              <w:right w:val="single" w:sz="4" w:space="0" w:color="FFFFFF" w:themeColor="background1"/>
+            </w:tcBorders>
+          </w:tcPr>
+          <w:p>
+            <w:pPr>
+              <w:spacing w:line="0" w:lineRule="atLeast"/>
+              <w:jc w:val="center"/>
+              <w:rPr>
+                <w:rFonts w:ascii="Arial" w:eastAsia="Arial" w:hAnsi="Arial"/>
+                <w:sz w:val="24"/>
+                <w:szCs w:val="24"/>
+                <w:u w:val="single"/>
+              </w:rPr>
+            </w:pPr>
+          </w:p>
+        </w:tc>
+      </w:tr>
+    </w:tbl>
     <w:p>
       <w:pPr>
         <w:spacing w:line="0" w:lineRule="atLeast"/>
@@ -6108,25 +7926,7 @@
           <w:sz w:val="22"/>
           <w:szCs w:val="22"/>
         </w:rPr>
-        <w:t xml:space="preserve">Connect the installed strain gauges to the HBM </w:t>
-      </w:r>
-      <w:proofErr w:type="spellStart"/>
-      <w:r>
-        <w:rPr>
-          <w:rFonts w:ascii="Arial" w:eastAsia="Arial" w:hAnsi="Arial"/>
-          <w:sz w:val="22"/>
-          <w:szCs w:val="22"/>
-        </w:rPr>
-        <w:t>QuantumX</w:t>
-      </w:r>
-      <w:proofErr w:type="spellEnd"/>
-      <w:r>
-        <w:rPr>
-          <w:rFonts w:ascii="Arial" w:eastAsia="Arial" w:hAnsi="Arial"/>
-          <w:sz w:val="22"/>
-          <w:szCs w:val="22"/>
-        </w:rPr>
-        <w:t xml:space="preserve"> DAQ.</w:t>
+        <w:t>Connect the installed strain gauges to the HBM QuantumX DAQ.</w:t>
       </w:r>
     </w:p>
     <w:p>
@@ -6235,6 +8035,134 @@
           <w:szCs w:val="22"/>
         </w:rPr>
         <w:t>Deactivate the switching circuit and verify the components return to their resting state.</w:t>
+      </w:r>
+    </w:p>
+    <w:p>
+      <w:pPr>
+        <w:pStyle w:val="Heading2"/>
+        <w:rPr>
+          <w:rFonts w:ascii="Arial" w:eastAsia="Arial" w:hAnsi="Arial" w:cs="Arial"/>
+          <w:b/>
+          <w:bCs/>
+          <w:color w:val="000000" w:themeColor="text1"/>
+        </w:rPr>
+      </w:pPr>
+      <w:r>
+        <w:rPr>
+          <w:rFonts w:ascii="Arial" w:eastAsia="Arial" w:hAnsi="Arial" w:cs="Arial"/>
+          <w:b/>
+          <w:bCs/>
+          <w:color w:val="000000" w:themeColor="text1"/>
+        </w:rPr>
+        <w:t>Data Handling</w:t>
+      </w:r>
+    </w:p>
+    <w:p>
+      <w:pPr>
+        <w:pStyle w:val="ListParagraph"/>
+        <w:numPr>
+          <w:ilvl w:val="0"/>
+          <w:numId w:val="14"/>
+        </w:numPr>
+        <w:rPr>
+          <w:rFonts w:ascii="Arial" w:hAnsi="Arial"/>
+          <w:sz w:val="22"/>
+          <w:szCs w:val="22"/>
+        </w:rPr>
+      </w:pPr>
+      <w:r>
+        <w:rPr>
+          <w:rFonts w:ascii="Arial" w:hAnsi="Arial"/>
+          <w:sz w:val="22"/>
+          <w:szCs w:val="22"/>
+        </w:rPr>
+        <w:t>Save the recorded strain</w:t>
+      </w:r>
+      <w:r>
+        <w:rPr>
+          <w:rFonts w:ascii="Arial" w:hAnsi="Arial"/>
+          <w:sz w:val="22"/>
+          <w:szCs w:val="22"/>
+        </w:rPr>
+        <w:t xml:space="preserve"> and deflection data from the HBM QuantumX to </w:t>
+      </w:r>
+      <w:r>
+        <w:rPr>
+          <w:rFonts w:ascii="Arial" w:hAnsi="Arial"/>
+          <w:sz w:val="22"/>
+          <w:szCs w:val="22"/>
+        </w:rPr>
+        <w:t xml:space="preserve">a </w:t>
+      </w:r>
+      <w:r>
+        <w:rPr>
+          <w:rFonts w:ascii="Arial" w:hAnsi="Arial"/>
+          <w:sz w:val="22"/>
+          <w:szCs w:val="22"/>
+        </w:rPr>
+        <w:t>de</w:t>
+      </w:r>
+      <w:r>
+        <w:rPr>
+          <w:rFonts w:ascii="Arial" w:hAnsi="Arial"/>
+          <w:sz w:val="22"/>
+          <w:szCs w:val="22"/>
+        </w:rPr>
+        <w:t xml:space="preserve">signated folder using a consistent naming </w:t>
+      </w:r>
+      <w:r>
+        <w:rPr>
+          <w:rFonts w:ascii="Arial" w:hAnsi="Arial"/>
+          <w:sz w:val="22"/>
+          <w:szCs w:val="22"/>
+        </w:rPr>
+        <w:t>convention (e.g. “Sample#_Date</w:t>
+      </w:r>
+      <w:r>
+        <w:rPr>
+          <w:rFonts w:ascii="Arial" w:hAnsi="Arial"/>
+          <w:sz w:val="22"/>
+          <w:szCs w:val="22"/>
+        </w:rPr>
+        <w:t>_Test#</w:t>
+      </w:r>
+      <w:r>
+        <w:rPr>
+          <w:rFonts w:ascii="Arial" w:hAnsi="Arial"/>
+          <w:sz w:val="22"/>
+          <w:szCs w:val="22"/>
+        </w:rPr>
+        <w:t>”)</w:t>
+      </w:r>
+      <w:r>
+        <w:rPr>
+          <w:rFonts w:ascii="Arial" w:hAnsi="Arial"/>
+          <w:sz w:val="22"/>
+          <w:szCs w:val="22"/>
+        </w:rPr>
+        <w:t>.</w:t>
+      </w:r>
+    </w:p>
+    <w:p>
+      <w:pPr>
+        <w:pStyle w:val="ListParagraph"/>
+        <w:numPr>
+          <w:ilvl w:val="0"/>
+          <w:numId w:val="14"/>
+        </w:numPr>
+        <w:rPr>
+          <w:rFonts w:ascii="Arial" w:hAnsi="Arial"/>
+          <w:sz w:val="22"/>
+          <w:szCs w:val="22"/>
+        </w:rPr>
+      </w:pPr>
+      <w:r>
+        <w:rPr>
+          <w:rFonts w:ascii="Arial" w:hAnsi="Arial"/>
+          <w:sz w:val="22"/>
+          <w:szCs w:val="22"/>
+        </w:rPr>
+        <w:t>Transfer the data to an external drive or cloud storage before powering down.</w:t>
       </w:r>
     </w:p>
     <w:p>
@@ -6463,7 +8391,7 @@
                 <w:noProof/>
               </w:rPr>
               <w:drawing>
-                <wp:anchor distT="0" distB="0" distL="114300" distR="114300" simplePos="0" relativeHeight="251666432" behindDoc="0" locked="0" layoutInCell="1" allowOverlap="1" wp14:anchorId="2CE8ADBE" wp14:editId="4C2A48A5">
+                <wp:anchor distT="0" distB="0" distL="114300" distR="114300" simplePos="0" relativeHeight="251658241" behindDoc="0" locked="0" layoutInCell="1" allowOverlap="1" wp14:anchorId="2CE8ADBE" wp14:editId="4C2A48A5">
                   <wp:simplePos x="0" y="0"/>
                   <wp:positionH relativeFrom="column">
                     <wp:posOffset>13970</wp:posOffset>
@@ -6565,7 +8493,7 @@
                 <w:noProof/>
               </w:rPr>
               <w:drawing>
-                <wp:anchor distT="0" distB="0" distL="114300" distR="114300" simplePos="0" relativeHeight="251667456" behindDoc="0" locked="0" layoutInCell="1" allowOverlap="1" wp14:anchorId="1DEE5F60" wp14:editId="4F5A4DFF">
+                <wp:anchor distT="0" distB="0" distL="114300" distR="114300" simplePos="0" relativeHeight="251658242" behindDoc="0" locked="0" layoutInCell="1" allowOverlap="1" wp14:anchorId="1DEE5F60" wp14:editId="4F5A4DFF">
                   <wp:simplePos x="0" y="0"/>
                   <wp:positionH relativeFrom="column">
                     <wp:posOffset>48260</wp:posOffset>
@@ -6665,7 +8593,7 @@
                 <w:noProof/>
               </w:rPr>
               <w:drawing>
-                <wp:anchor distT="0" distB="0" distL="114300" distR="114300" simplePos="0" relativeHeight="251668480" behindDoc="0" locked="0" layoutInCell="1" allowOverlap="1" wp14:anchorId="1FA167BD" wp14:editId="7C1D8046">
+                <wp:anchor distT="0" distB="0" distL="114300" distR="114300" simplePos="0" relativeHeight="251658243" behindDoc="0" locked="0" layoutInCell="1" allowOverlap="1" wp14:anchorId="1FA167BD" wp14:editId="7C1D8046">
                   <wp:simplePos x="0" y="0"/>
                   <wp:positionH relativeFrom="column">
                     <wp:posOffset>17145</wp:posOffset>
@@ -6769,7 +8697,7 @@
                 <w:noProof/>
               </w:rPr>
               <w:drawing>
-                <wp:anchor distT="0" distB="0" distL="114300" distR="114300" simplePos="0" relativeHeight="251669504" behindDoc="0" locked="0" layoutInCell="1" allowOverlap="1" wp14:anchorId="5F300DA7" wp14:editId="7EA5E993">
+                <wp:anchor distT="0" distB="0" distL="114300" distR="114300" simplePos="0" relativeHeight="251658244" behindDoc="0" locked="0" layoutInCell="1" allowOverlap="1" wp14:anchorId="5F300DA7" wp14:editId="7EA5E993">
                   <wp:simplePos x="0" y="0"/>
                   <wp:positionH relativeFrom="column">
                     <wp:posOffset>509270</wp:posOffset>
@@ -6876,7 +8804,7 @@
                 <w:noProof/>
               </w:rPr>
               <w:drawing>
-                <wp:anchor distT="0" distB="0" distL="114300" distR="114300" simplePos="0" relativeHeight="251670528" behindDoc="0" locked="0" layoutInCell="1" allowOverlap="1" wp14:anchorId="044C59C2" wp14:editId="1D7185A4">
+                <wp:anchor distT="0" distB="0" distL="114300" distR="114300" simplePos="0" relativeHeight="251658245" behindDoc="0" locked="0" layoutInCell="1" allowOverlap="1" wp14:anchorId="044C59C2" wp14:editId="1D7185A4">
                   <wp:simplePos x="0" y="0"/>
                   <wp:positionH relativeFrom="column">
                     <wp:posOffset>439420</wp:posOffset>
@@ -7126,7 +9054,6 @@
           <w:sz w:val="22"/>
           <w:szCs w:val="22"/>
         </w:rPr>
-        <w:lastRenderedPageBreak/>
         <w:t>No afterhours testing may be performed without the necessary permissions</w:t>
       </w:r>
       <w:r>
@@ -8129,8 +10056,7 @@
                 <w:sz w:val="22"/>
                 <w:szCs w:val="22"/>
               </w:rPr>
-              <w:lastRenderedPageBreak/>
-              <w:t>Manual surface prep</w:t>
+              <w:t>Moving around the lab</w:t>
             </w:r>
           </w:p>
         </w:tc>
@@ -8153,15 +10079,23 @@
                 <w:sz w:val="22"/>
                 <w:szCs w:val="22"/>
               </w:rPr>
-              <w:t xml:space="preserve">Minor abrasions / </w:t>
-            </w:r>
-            <w:r>
-              <w:rPr>
-                <w:rFonts w:ascii="Arial" w:eastAsia="Arial" w:hAnsi="Arial"/>
-                <w:sz w:val="22"/>
-                <w:szCs w:val="22"/>
-              </w:rPr>
-              <w:t>Dust</w:t>
+              <w:t xml:space="preserve">Tripping over cables or knocking equipment </w:t>
+            </w:r>
+            <w:r>
+              <w:rPr>
+                <w:rFonts w:ascii="Arial" w:eastAsia="Arial" w:hAnsi="Arial"/>
+                <w:sz w:val="22"/>
+                <w:szCs w:val="22"/>
+              </w:rPr>
+              <w:t>over</w:t>
+            </w:r>
+            <w:r>
+              <w:rPr>
+                <w:rFonts w:ascii="Arial" w:eastAsia="Arial" w:hAnsi="Arial"/>
+                <w:sz w:val="22"/>
+                <w:szCs w:val="22"/>
+              </w:rPr>
+              <w:t xml:space="preserve"> </w:t>
             </w:r>
           </w:p>
         </w:tc>
@@ -8207,7 +10141,15 @@
                 <w:sz w:val="22"/>
                 <w:szCs w:val="22"/>
               </w:rPr>
-              <w:t>Sand carefully away from the body and wipe away dust. Wear safety glasses.</w:t>
+              <w:t>Do not use a cell phone when moving through th</w:t>
+            </w:r>
+            <w:r>
+              <w:rPr>
+                <w:rFonts w:ascii="Arial" w:eastAsia="Arial" w:hAnsi="Arial"/>
+                <w:sz w:val="22"/>
+                <w:szCs w:val="22"/>
+              </w:rPr>
+              <w:t>e lab and be aware of your surroundings.</w:t>
             </w:r>
           </w:p>
         </w:tc>
@@ -8230,15 +10172,7 @@
                 <w:sz w:val="22"/>
                 <w:szCs w:val="22"/>
               </w:rPr>
-              <w:t>Accep</w:t>
-            </w:r>
-            <w:r>
-              <w:rPr>
-                <w:rFonts w:ascii="Arial" w:eastAsia="Arial" w:hAnsi="Arial"/>
-                <w:sz w:val="22"/>
-                <w:szCs w:val="22"/>
-              </w:rPr>
-              <w:t>table risk</w:t>
+              <w:t>Acceptable risk</w:t>
             </w:r>
           </w:p>
         </w:tc>
@@ -8266,7 +10200,7 @@
                 <w:sz w:val="22"/>
                 <w:szCs w:val="22"/>
               </w:rPr>
-              <w:t>Using RMS 1 spray and adhesives</w:t>
+              <w:t>Manual surface prep</w:t>
             </w:r>
           </w:p>
         </w:tc>
@@ -8289,7 +10223,15 @@
                 <w:sz w:val="22"/>
                 <w:szCs w:val="22"/>
               </w:rPr>
-              <w:t>Skin irritation, inhalation</w:t>
+              <w:t xml:space="preserve">Minor abrasions / </w:t>
+            </w:r>
+            <w:r>
+              <w:rPr>
+                <w:rFonts w:ascii="Arial" w:eastAsia="Arial" w:hAnsi="Arial"/>
+                <w:sz w:val="22"/>
+                <w:szCs w:val="22"/>
+              </w:rPr>
+              <w:t>Dust</w:t>
             </w:r>
           </w:p>
         </w:tc>
@@ -8335,15 +10277,7 @@
                 <w:sz w:val="22"/>
                 <w:szCs w:val="22"/>
               </w:rPr>
-              <w:t xml:space="preserve">Ensure </w:t>
-            </w:r>
-            <w:r>
-              <w:rPr>
-                <w:rFonts w:ascii="Arial" w:eastAsia="Arial" w:hAnsi="Arial"/>
-                <w:sz w:val="22"/>
-                <w:szCs w:val="22"/>
-              </w:rPr>
-              <w:t>adequate ventilation. Avoid breathing vapours and wear gloves.</w:t>
+              <w:t>Sand carefully away from the body and wipe away dust. Wear safety glasses.</w:t>
             </w:r>
           </w:p>
         </w:tc>
@@ -8366,7 +10300,15 @@
                 <w:sz w:val="22"/>
                 <w:szCs w:val="22"/>
               </w:rPr>
-              <w:t>Possible risk</w:t>
+              <w:t>Accep</w:t>
+            </w:r>
+            <w:r>
+              <w:rPr>
+                <w:rFonts w:ascii="Arial" w:eastAsia="Arial" w:hAnsi="Arial"/>
+                <w:sz w:val="22"/>
+                <w:szCs w:val="22"/>
+              </w:rPr>
+              <w:t>table risk</w:t>
             </w:r>
           </w:p>
         </w:tc>
@@ -8394,7 +10336,7 @@
                 <w:sz w:val="22"/>
                 <w:szCs w:val="22"/>
               </w:rPr>
-              <w:t>Soldering strain gauges</w:t>
+              <w:t>Using RMS 1 spray and adhesives</w:t>
             </w:r>
           </w:p>
         </w:tc>
@@ -8417,7 +10359,7 @@
                 <w:sz w:val="22"/>
                 <w:szCs w:val="22"/>
               </w:rPr>
-              <w:t>Burns to skin, fire hazard</w:t>
+              <w:t>Skin irritation, inhalation</w:t>
             </w:r>
           </w:p>
         </w:tc>
@@ -8440,7 +10382,7 @@
                 <w:sz w:val="22"/>
                 <w:szCs w:val="22"/>
               </w:rPr>
-              <w:t>P/E</w:t>
+              <w:t>P</w:t>
             </w:r>
           </w:p>
         </w:tc>
@@ -8463,15 +10405,15 @@
                 <w:sz w:val="22"/>
                 <w:szCs w:val="22"/>
               </w:rPr>
-              <w:t xml:space="preserve">Use a soldering iron stand. Keep flammable liquids away. Never </w:t>
-            </w:r>
-            <w:r>
-              <w:rPr>
-                <w:rFonts w:ascii="Arial" w:eastAsia="Arial" w:hAnsi="Arial"/>
-                <w:sz w:val="22"/>
-                <w:szCs w:val="22"/>
-              </w:rPr>
-              <w:t>leave iron unattended.</w:t>
+              <w:t xml:space="preserve">Ensure </w:t>
+            </w:r>
+            <w:r>
+              <w:rPr>
+                <w:rFonts w:ascii="Arial" w:eastAsia="Arial" w:hAnsi="Arial"/>
+                <w:sz w:val="22"/>
+                <w:szCs w:val="22"/>
+              </w:rPr>
+              <w:t>adequate ventilation. Avoid breathing vapours and wear gloves.</w:t>
             </w:r>
           </w:p>
         </w:tc>
@@ -8494,7 +10436,7 @@
                 <w:sz w:val="22"/>
                 <w:szCs w:val="22"/>
               </w:rPr>
-              <w:t>High risk</w:t>
+              <w:t>Possible risk</w:t>
             </w:r>
           </w:p>
         </w:tc>
@@ -8522,7 +10464,7 @@
                 <w:sz w:val="22"/>
                 <w:szCs w:val="22"/>
               </w:rPr>
-              <w:t>Testing the switching circuit</w:t>
+              <w:t>Soldering strain gauges</w:t>
             </w:r>
           </w:p>
         </w:tc>
@@ -8545,7 +10487,7 @@
                 <w:sz w:val="22"/>
                 <w:szCs w:val="22"/>
               </w:rPr>
-              <w:t>Electric shock</w:t>
+              <w:t>Burns to skin, fire hazard</w:t>
             </w:r>
           </w:p>
         </w:tc>
@@ -8568,7 +10510,7 @@
                 <w:sz w:val="22"/>
                 <w:szCs w:val="22"/>
               </w:rPr>
-              <w:t>P</w:t>
+              <w:t>P/E</w:t>
             </w:r>
           </w:p>
         </w:tc>
@@ -8591,15 +10533,15 @@
                 <w:sz w:val="22"/>
                 <w:szCs w:val="22"/>
               </w:rPr>
-              <w:t xml:space="preserve">Inspect all cable insulation before turning </w:t>
-            </w:r>
-            <w:r>
-              <w:rPr>
-                <w:rFonts w:ascii="Arial" w:eastAsia="Arial" w:hAnsi="Arial"/>
-                <w:sz w:val="22"/>
-                <w:szCs w:val="22"/>
-              </w:rPr>
-              <w:t>on the power.</w:t>
+              <w:t xml:space="preserve">Use a soldering iron stand. Keep flammable liquids away. Never </w:t>
+            </w:r>
+            <w:r>
+              <w:rPr>
+                <w:rFonts w:ascii="Arial" w:eastAsia="Arial" w:hAnsi="Arial"/>
+                <w:sz w:val="22"/>
+                <w:szCs w:val="22"/>
+              </w:rPr>
+              <w:t>leave iron unattended.</w:t>
             </w:r>
           </w:p>
         </w:tc>
@@ -8622,7 +10564,7 @@
                 <w:sz w:val="22"/>
                 <w:szCs w:val="22"/>
               </w:rPr>
-              <w:t>Substantial risk</w:t>
+              <w:t>High risk</w:t>
             </w:r>
           </w:p>
         </w:tc>
@@ -8650,7 +10592,7 @@
                 <w:sz w:val="22"/>
                 <w:szCs w:val="22"/>
               </w:rPr>
-              <w:t>Actuating the electromagnet</w:t>
+              <w:t>Testing the switching circuit</w:t>
             </w:r>
           </w:p>
         </w:tc>
@@ -8673,7 +10615,7 @@
                 <w:sz w:val="22"/>
                 <w:szCs w:val="22"/>
               </w:rPr>
-              <w:t>Crushing fingers / Pinch point</w:t>
+              <w:t>Electric shock</w:t>
             </w:r>
           </w:p>
         </w:tc>
@@ -8719,7 +10661,105 @@
                 <w:sz w:val="22"/>
                 <w:szCs w:val="22"/>
               </w:rPr>
-              <w:t>Keep hands clear of moving parts</w:t>
+              <w:t xml:space="preserve">Inspect all cable insulation before turning </w:t>
+            </w:r>
+            <w:r>
+              <w:rPr>
+                <w:rFonts w:ascii="Arial" w:eastAsia="Arial" w:hAnsi="Arial"/>
+                <w:sz w:val="22"/>
+                <w:szCs w:val="22"/>
+              </w:rPr>
+              <w:t>on the power</w:t>
+            </w:r>
+            <w:r>
+              <w:rPr>
+                <w:rFonts w:ascii="Arial" w:eastAsia="Arial" w:hAnsi="Arial"/>
+                <w:sz w:val="22"/>
+                <w:szCs w:val="22"/>
+              </w:rPr>
+              <w:t xml:space="preserve"> and ensure </w:t>
+            </w:r>
+            <w:r>
+              <w:rPr>
+                <w:rFonts w:ascii="Arial" w:eastAsia="Arial" w:hAnsi="Arial"/>
+                <w:sz w:val="22"/>
+                <w:szCs w:val="22"/>
+              </w:rPr>
+              <w:t xml:space="preserve">wire gauges can handle </w:t>
+            </w:r>
+            <m:oMath>
+              <m:r>
+                <w:rPr>
+                  <w:rFonts w:ascii="Cambria Math" w:eastAsia="Arial" w:hAnsi="Cambria Math"/>
+                  <w:sz w:val="22"/>
+                  <w:szCs w:val="22"/>
+                </w:rPr>
+                <m:t>6 A</m:t>
+              </m:r>
+            </m:oMath>
+            <w:r>
+              <w:rPr>
+                <w:rFonts w:ascii="Arial" w:eastAsia="Arial" w:hAnsi="Arial"/>
+                <w:sz w:val="22"/>
+                <w:szCs w:val="22"/>
+              </w:rPr>
+              <w:t xml:space="preserve"> safely </w:t>
+            </w:r>
+            <w:r>
+              <w:rPr>
+                <w:rFonts w:ascii="Arial" w:eastAsia="Arial" w:hAnsi="Arial"/>
+                <w:sz w:val="22"/>
+                <w:szCs w:val="22"/>
+              </w:rPr>
+              <w:t xml:space="preserve">before turning on </w:t>
+            </w:r>
+            <w:r>
+              <w:rPr>
+                <w:rFonts w:ascii="Arial" w:eastAsia="Arial" w:hAnsi="Arial"/>
+                <w:sz w:val="22"/>
+                <w:szCs w:val="22"/>
+              </w:rPr>
+              <w:t>the power</w:t>
+            </w:r>
+            <w:r>
+              <w:rPr>
+                <w:rFonts w:ascii="Arial" w:eastAsia="Arial" w:hAnsi="Arial"/>
+                <w:sz w:val="22"/>
+                <w:szCs w:val="22"/>
+              </w:rPr>
+              <w:t>.</w:t>
+            </w:r>
+            <w:r>
+              <w:rPr>
+                <w:rFonts w:ascii="Arial" w:eastAsia="Arial" w:hAnsi="Arial"/>
+                <w:sz w:val="22"/>
+                <w:szCs w:val="22"/>
+              </w:rPr>
+              <w:t xml:space="preserve"> Ensure the dedicated </w:t>
+            </w:r>
+            <w:r>
+              <w:rPr>
+                <w:rFonts w:ascii="Arial" w:eastAsia="Arial" w:hAnsi="Arial"/>
+                <w:sz w:val="22"/>
+                <w:szCs w:val="22"/>
+              </w:rPr>
+              <w:t xml:space="preserve">normally closed (NC) emergency stop button is </w:t>
+            </w:r>
+            <w:r>
+              <w:rPr>
+                <w:rFonts w:ascii="Arial" w:eastAsia="Arial" w:hAnsi="Arial"/>
+                <w:sz w:val="22"/>
+                <w:szCs w:val="22"/>
+              </w:rPr>
+              <w:t>within immediate reach and tested before</w:t>
+            </w:r>
+            <w:r>
+              <w:rPr>
+                <w:rFonts w:ascii="Arial" w:eastAsia="Arial" w:hAnsi="Arial"/>
+                <w:sz w:val="22"/>
+                <w:szCs w:val="22"/>
+              </w:rPr>
+              <w:t xml:space="preserve"> full operation</w:t>
             </w:r>
             <w:r>
               <w:rPr>
@@ -8750,7 +10790,7 @@
                 <w:sz w:val="22"/>
                 <w:szCs w:val="22"/>
               </w:rPr>
-              <w:t>Possible risk</w:t>
+              <w:t>Substantial risk</w:t>
             </w:r>
           </w:p>
         </w:tc>
@@ -8778,7 +10818,7 @@
                 <w:sz w:val="22"/>
                 <w:szCs w:val="22"/>
               </w:rPr>
-              <w:t>Operating the electromagnet</w:t>
+              <w:t>Actuating the electromagnet</w:t>
             </w:r>
           </w:p>
         </w:tc>
@@ -8801,7 +10841,7 @@
                 <w:sz w:val="22"/>
                 <w:szCs w:val="22"/>
               </w:rPr>
-              <w:t>Magnetic interference</w:t>
+              <w:t>Crushing fingers / Pinch point</w:t>
             </w:r>
           </w:p>
         </w:tc>
@@ -8824,7 +10864,7 @@
                 <w:sz w:val="22"/>
                 <w:szCs w:val="22"/>
               </w:rPr>
-              <w:t>P/E</w:t>
+              <w:t>P</w:t>
             </w:r>
           </w:p>
         </w:tc>
@@ -8847,7 +10887,7 @@
                 <w:sz w:val="22"/>
                 <w:szCs w:val="22"/>
               </w:rPr>
-              <w:t>Keep sensitive electronics away</w:t>
+              <w:t>Keep hands clear of moving parts</w:t>
             </w:r>
             <w:r>
               <w:rPr>
@@ -8856,6 +10896,38 @@
                 <w:szCs w:val="22"/>
               </w:rPr>
               <w:t>.</w:t>
+            </w:r>
+            <w:r>
+              <w:rPr>
+                <w:rFonts w:ascii="Arial" w:eastAsia="Arial" w:hAnsi="Arial"/>
+                <w:sz w:val="22"/>
+                <w:szCs w:val="22"/>
+              </w:rPr>
+              <w:t xml:space="preserve"> Keep one hand</w:t>
+            </w:r>
+            <w:r>
+              <w:rPr>
+                <w:rFonts w:ascii="Arial" w:eastAsia="Arial" w:hAnsi="Arial"/>
+                <w:sz w:val="22"/>
+                <w:szCs w:val="22"/>
+              </w:rPr>
+              <w:t xml:space="preserve"> hovering near the emergency stop button durin</w:t>
+            </w:r>
+            <w:r>
+              <w:rPr>
+                <w:rFonts w:ascii="Arial" w:eastAsia="Arial" w:hAnsi="Arial"/>
+                <w:sz w:val="22"/>
+                <w:szCs w:val="22"/>
+              </w:rPr>
+              <w:t>g</w:t>
+            </w:r>
+            <w:r>
+              <w:rPr>
+                <w:rFonts w:ascii="Arial" w:eastAsia="Arial" w:hAnsi="Arial"/>
+                <w:sz w:val="22"/>
+                <w:szCs w:val="22"/>
+              </w:rPr>
+              <w:t xml:space="preserve"> actuation.</w:t>
             </w:r>
           </w:p>
         </w:tc>
@@ -8878,15 +10950,7 @@
                 <w:sz w:val="22"/>
                 <w:szCs w:val="22"/>
               </w:rPr>
-              <w:t xml:space="preserve">Substantial </w:t>
-            </w:r>
-            <w:r>
-              <w:rPr>
-                <w:rFonts w:ascii="Arial" w:eastAsia="Arial" w:hAnsi="Arial"/>
-                <w:sz w:val="22"/>
-                <w:szCs w:val="22"/>
-              </w:rPr>
-              <w:t>risk</w:t>
+              <w:t>Possible risk</w:t>
             </w:r>
           </w:p>
         </w:tc>
@@ -8914,7 +10978,7 @@
                 <w:sz w:val="22"/>
                 <w:szCs w:val="22"/>
               </w:rPr>
-              <w:t>Applying excessive load</w:t>
+              <w:t>Operating the electromagnet</w:t>
             </w:r>
           </w:p>
         </w:tc>
@@ -8937,7 +11001,39 @@
                 <w:sz w:val="22"/>
                 <w:szCs w:val="22"/>
               </w:rPr>
-              <w:t>Damaging strain gauges</w:t>
+              <w:t xml:space="preserve">Strong </w:t>
+            </w:r>
+            <w:r>
+              <w:rPr>
+                <w:rFonts w:ascii="Arial" w:eastAsia="Arial" w:hAnsi="Arial"/>
+                <w:sz w:val="22"/>
+                <w:szCs w:val="22"/>
+              </w:rPr>
+              <w:t>m</w:t>
+            </w:r>
+            <w:r>
+              <w:rPr>
+                <w:rFonts w:ascii="Arial" w:eastAsia="Arial" w:hAnsi="Arial"/>
+                <w:sz w:val="22"/>
+                <w:szCs w:val="22"/>
+              </w:rPr>
+              <w:t xml:space="preserve">agnetic </w:t>
+            </w:r>
+            <w:r>
+              <w:rPr>
+                <w:rFonts w:ascii="Arial" w:eastAsia="Arial" w:hAnsi="Arial"/>
+                <w:sz w:val="22"/>
+                <w:szCs w:val="22"/>
+              </w:rPr>
+              <w:t xml:space="preserve">field hazard / </w:t>
+            </w:r>
+            <w:r>
+              <w:rPr>
+                <w:rFonts w:ascii="Arial" w:eastAsia="Arial" w:hAnsi="Arial"/>
+                <w:sz w:val="22"/>
+                <w:szCs w:val="22"/>
+              </w:rPr>
+              <w:t>Magnetic interference</w:t>
             </w:r>
           </w:p>
         </w:tc>
@@ -8954,6 +11050,14 @@
                 <w:szCs w:val="22"/>
               </w:rPr>
             </w:pPr>
+            <w:r>
+              <w:rPr>
+                <w:rFonts w:ascii="Arial" w:eastAsia="Arial" w:hAnsi="Arial"/>
+                <w:sz w:val="22"/>
+                <w:szCs w:val="22"/>
+              </w:rPr>
+              <w:t>P/E</w:t>
+            </w:r>
           </w:p>
         </w:tc>
         <w:tc>
@@ -8975,7 +11079,39 @@
                 <w:sz w:val="22"/>
                 <w:szCs w:val="22"/>
               </w:rPr>
-              <w:t>Verify all circuit limits before testing. Monitor data carefully.</w:t>
+              <w:t xml:space="preserve">Strictly enforce an exclusion zone for individuals with </w:t>
+            </w:r>
+            <w:r>
+              <w:rPr>
+                <w:rFonts w:ascii="Arial" w:eastAsia="Arial" w:hAnsi="Arial"/>
+                <w:sz w:val="22"/>
+                <w:szCs w:val="22"/>
+              </w:rPr>
+              <w:t>pacemakers or metallic implants. U</w:t>
+            </w:r>
+            <w:r>
+              <w:rPr>
+                <w:rFonts w:ascii="Arial" w:eastAsia="Arial" w:hAnsi="Arial"/>
+                <w:sz w:val="22"/>
+                <w:szCs w:val="22"/>
+              </w:rPr>
+              <w:t>se the emergence stop immediately if unauthorised personnel enter the testing</w:t>
+            </w:r>
+            <w:r>
+              <w:rPr>
+                <w:rFonts w:ascii="Arial" w:eastAsia="Arial" w:hAnsi="Arial"/>
+                <w:sz w:val="22"/>
+                <w:szCs w:val="22"/>
+              </w:rPr>
+              <w:t xml:space="preserve"> area.</w:t>
+            </w:r>
+            <w:r>
+              <w:rPr>
+                <w:rFonts w:ascii="Arial" w:eastAsia="Arial" w:hAnsi="Arial"/>
+                <w:sz w:val="22"/>
+                <w:szCs w:val="22"/>
+              </w:rPr>
+              <w:t xml:space="preserve">                 </w:t>
             </w:r>
           </w:p>
         </w:tc>
@@ -8998,6 +11134,134 @@
                 <w:sz w:val="22"/>
                 <w:szCs w:val="22"/>
               </w:rPr>
+              <w:t xml:space="preserve">Substantial </w:t>
+            </w:r>
+            <w:r>
+              <w:rPr>
+                <w:rFonts w:ascii="Arial" w:eastAsia="Arial" w:hAnsi="Arial"/>
+                <w:sz w:val="22"/>
+                <w:szCs w:val="22"/>
+              </w:rPr>
+              <w:t>risk</w:t>
+            </w:r>
+          </w:p>
+        </w:tc>
+      </w:tr>
+      <w:tr>
+        <w:trPr>
+          <w:jc w:val="center"/>
+        </w:trPr>
+        <w:tc>
+          <w:tcPr>
+            <w:tcW w:w="943" w:type="pct"/>
+          </w:tcPr>
+          <w:p>
+            <w:pPr>
+              <w:spacing w:line="0" w:lineRule="atLeast"/>
+              <w:rPr>
+                <w:rFonts w:ascii="Arial" w:eastAsia="Arial" w:hAnsi="Arial"/>
+                <w:sz w:val="22"/>
+                <w:szCs w:val="22"/>
+              </w:rPr>
+            </w:pPr>
+            <w:r>
+              <w:rPr>
+                <w:rFonts w:ascii="Arial" w:eastAsia="Arial" w:hAnsi="Arial"/>
+                <w:sz w:val="22"/>
+                <w:szCs w:val="22"/>
+              </w:rPr>
+              <w:t>Applying excessive load</w:t>
+            </w:r>
+          </w:p>
+        </w:tc>
+        <w:tc>
+          <w:tcPr>
+            <w:tcW w:w="785" w:type="pct"/>
+          </w:tcPr>
+          <w:p>
+            <w:pPr>
+              <w:spacing w:line="0" w:lineRule="atLeast"/>
+              <w:rPr>
+                <w:rFonts w:ascii="Arial" w:eastAsia="Arial" w:hAnsi="Arial"/>
+                <w:sz w:val="22"/>
+                <w:szCs w:val="22"/>
+              </w:rPr>
+            </w:pPr>
+            <w:r>
+              <w:rPr>
+                <w:rFonts w:ascii="Arial" w:eastAsia="Arial" w:hAnsi="Arial"/>
+                <w:sz w:val="22"/>
+                <w:szCs w:val="22"/>
+              </w:rPr>
+              <w:t>Damaging strain gauges</w:t>
+            </w:r>
+          </w:p>
+        </w:tc>
+        <w:tc>
+          <w:tcPr>
+            <w:tcW w:w="471" w:type="pct"/>
+          </w:tcPr>
+          <w:p>
+            <w:pPr>
+              <w:spacing w:line="0" w:lineRule="atLeast"/>
+              <w:rPr>
+                <w:rFonts w:ascii="Arial" w:eastAsia="Arial" w:hAnsi="Arial"/>
+                <w:sz w:val="22"/>
+                <w:szCs w:val="22"/>
+              </w:rPr>
+            </w:pPr>
+            <w:r>
+              <w:rPr>
+                <w:rFonts w:ascii="Arial" w:eastAsia="Arial" w:hAnsi="Arial"/>
+                <w:sz w:val="22"/>
+                <w:szCs w:val="22"/>
+              </w:rPr>
+              <w:t>E</w:t>
+            </w:r>
+          </w:p>
+        </w:tc>
+        <w:tc>
+          <w:tcPr>
+            <w:tcW w:w="1417" w:type="pct"/>
+          </w:tcPr>
+          <w:p>
+            <w:pPr>
+              <w:spacing w:line="0" w:lineRule="atLeast"/>
+              <w:rPr>
+                <w:rFonts w:ascii="Arial" w:eastAsia="Arial" w:hAnsi="Arial"/>
+                <w:sz w:val="22"/>
+                <w:szCs w:val="22"/>
+              </w:rPr>
+            </w:pPr>
+            <w:r>
+              <w:rPr>
+                <w:rFonts w:ascii="Arial" w:eastAsia="Arial" w:hAnsi="Arial"/>
+                <w:sz w:val="22"/>
+                <w:szCs w:val="22"/>
+              </w:rPr>
+              <w:t>Verify all circuit limits before testing. Monitor data carefully.</w:t>
+            </w:r>
+          </w:p>
+        </w:tc>
+        <w:tc>
+          <w:tcPr>
+            <w:tcW w:w="1384" w:type="pct"/>
+          </w:tcPr>
+          <w:p>
+            <w:pPr>
+              <w:spacing w:line="0" w:lineRule="atLeast"/>
+              <w:rPr>
+                <w:rFonts w:ascii="Arial" w:eastAsia="Arial" w:hAnsi="Arial"/>
+                <w:sz w:val="22"/>
+                <w:szCs w:val="22"/>
+              </w:rPr>
+            </w:pPr>
+            <w:r>
+              <w:rPr>
+                <w:rFonts w:ascii="Arial" w:eastAsia="Arial" w:hAnsi="Arial"/>
+                <w:sz w:val="22"/>
+                <w:szCs w:val="22"/>
+              </w:rPr>
               <w:t>Possible risk</w:t>
             </w:r>
           </w:p>
@@ -9140,126 +11404,6 @@
     <w:p>
       <w:pPr>
         <w:spacing w:line="0" w:lineRule="atLeast"/>
-      </w:pPr>
-    </w:p>
-    <w:p>
-      <w:pPr>
-        <w:spacing w:line="0" w:lineRule="atLeast"/>
-      </w:pPr>
-    </w:p>
-    <w:p>
-      <w:pPr>
-        <w:spacing w:line="0" w:lineRule="atLeast"/>
-      </w:pPr>
-    </w:p>
-    <w:p>
-      <w:pPr>
-        <w:spacing w:line="0" w:lineRule="atLeast"/>
-      </w:pPr>
-    </w:p>
-    <w:p>
-      <w:pPr>
-        <w:spacing w:line="0" w:lineRule="atLeast"/>
-      </w:pPr>
-    </w:p>
-    <w:p>
-      <w:pPr>
-        <w:spacing w:line="0" w:lineRule="atLeast"/>
-      </w:pPr>
-    </w:p>
-    <w:p>
-      <w:pPr>
-        <w:spacing w:line="0" w:lineRule="atLeast"/>
-      </w:pPr>
-    </w:p>
-    <w:p>
-      <w:pPr>
-        <w:spacing w:line="0" w:lineRule="atLeast"/>
-      </w:pPr>
-    </w:p>
-    <w:p>
-      <w:pPr>
-        <w:spacing w:line="0" w:lineRule="atLeast"/>
-        <w:rPr>
-          <w:rFonts w:ascii="Arial" w:eastAsia="Arial" w:hAnsi="Arial"/>
-          <w:sz w:val="24"/>
-          <w:szCs w:val="14"/>
-        </w:rPr>
-      </w:pPr>
-    </w:p>
-    <w:p>
-      <w:pPr>
-        <w:spacing w:line="0" w:lineRule="atLeast"/>
-        <w:rPr>
-          <w:rFonts w:ascii="Arial" w:eastAsia="Arial" w:hAnsi="Arial"/>
-          <w:sz w:val="24"/>
-          <w:szCs w:val="14"/>
-        </w:rPr>
-      </w:pPr>
-    </w:p>
-    <w:p>
-      <w:pPr>
-        <w:spacing w:line="0" w:lineRule="atLeast"/>
-        <w:rPr>
-          <w:rFonts w:ascii="Arial" w:eastAsia="Arial" w:hAnsi="Arial"/>
-          <w:sz w:val="24"/>
-          <w:szCs w:val="14"/>
-        </w:rPr>
-      </w:pPr>
-    </w:p>
-    <w:p>
-      <w:pPr>
-        <w:spacing w:line="0" w:lineRule="atLeast"/>
-        <w:rPr>
-          <w:rFonts w:ascii="Arial" w:eastAsia="Arial" w:hAnsi="Arial"/>
-          <w:sz w:val="24"/>
-          <w:szCs w:val="14"/>
-        </w:rPr>
-      </w:pPr>
-    </w:p>
-    <w:p>
-      <w:pPr>
-        <w:spacing w:line="0" w:lineRule="atLeast"/>
-        <w:rPr>
-          <w:rFonts w:ascii="Arial" w:eastAsia="Arial" w:hAnsi="Arial"/>
-          <w:sz w:val="24"/>
-          <w:szCs w:val="14"/>
-        </w:rPr>
-      </w:pPr>
-    </w:p>
-    <w:p>
-      <w:pPr>
-        <w:spacing w:line="0" w:lineRule="atLeast"/>
-        <w:rPr>
-          <w:rFonts w:ascii="Arial" w:eastAsia="Arial" w:hAnsi="Arial"/>
-          <w:sz w:val="24"/>
-          <w:szCs w:val="14"/>
-        </w:rPr>
-      </w:pPr>
-    </w:p>
-    <w:p>
-      <w:pPr>
-        <w:spacing w:line="0" w:lineRule="atLeast"/>
-        <w:rPr>
-          <w:rFonts w:ascii="Arial" w:eastAsia="Arial" w:hAnsi="Arial"/>
-          <w:sz w:val="24"/>
-          <w:szCs w:val="14"/>
-        </w:rPr>
-      </w:pPr>
-    </w:p>
-    <w:p>
-      <w:pPr>
-        <w:spacing w:line="0" w:lineRule="atLeast"/>
-        <w:rPr>
-          <w:rFonts w:ascii="Arial" w:eastAsia="Arial" w:hAnsi="Arial"/>
-          <w:sz w:val="24"/>
-          <w:szCs w:val="14"/>
-        </w:rPr>
-      </w:pPr>
-    </w:p>
-    <w:p>
-      <w:pPr>
-        <w:spacing w:line="0" w:lineRule="atLeast"/>
         <w:rPr>
           <w:rFonts w:ascii="Arial" w:eastAsia="Arial" w:hAnsi="Arial"/>
           <w:sz w:val="24"/>
@@ -9286,7 +11430,6 @@
           <w:sz w:val="28"/>
           <w:szCs w:val="16"/>
         </w:rPr>
-        <w:lastRenderedPageBreak/>
         <w:t xml:space="preserve">Appendix A: </w:t>
       </w:r>
       <w:r>
@@ -9337,7 +11480,7 @@
         <mc:AlternateContent>
           <mc:Choice Requires="wps">
             <w:drawing>
-              <wp:anchor distT="0" distB="0" distL="114300" distR="114300" simplePos="0" relativeHeight="251685888" behindDoc="0" locked="0" layoutInCell="1" allowOverlap="1" wp14:anchorId="6AC445A4" wp14:editId="675CC632">
+              <wp:anchor distT="0" distB="0" distL="114300" distR="114300" simplePos="0" relativeHeight="251658252" behindDoc="0" locked="0" layoutInCell="1" allowOverlap="1" wp14:anchorId="6AC445A4" wp14:editId="675CC632">
                 <wp:simplePos x="0" y="0"/>
                 <wp:positionH relativeFrom="column">
                   <wp:posOffset>2231720</wp:posOffset>
@@ -9403,7 +11546,7 @@
               </wp:anchor>
             </w:drawing>
           </mc:Choice>
-          <mc:Fallback>
+          <mc:Fallback xmlns:arto="http://schemas.microsoft.com/office/word/2006/arto">
             <w:pict>
               <v:oval w14:anchorId="3268FC6F" id="Oval 19" o:spid="_x0000_s1026" style="position:absolute;margin-left:175.75pt;margin-top:617.9pt;width:17.55pt;height:17.55pt;z-index:251685888;visibility:visible;mso-wrap-style:square;mso-width-percent:0;mso-height-percent:0;mso-wrap-distance-left:9pt;mso-wrap-distance-top:0;mso-wrap-distance-right:9pt;mso-wrap-distance-bottom:0;mso-position-horizontal:absolute;mso-position-horizontal-relative:text;mso-position-vertical:absolute;mso-position-vertical-relative:text;mso-width-percent:0;mso-height-percent:0;mso-width-relative:margin;mso-height-relative:margin;v-text-anchor:middle" o:gfxdata="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" filled="f" strokecolor="red" strokeweight="1pt">
                 <v:stroke joinstyle="miter"/>
@@ -9420,7 +11563,7 @@
         <mc:AlternateContent>
           <mc:Choice Requires="wps">
             <w:drawing>
-              <wp:anchor distT="0" distB="0" distL="114300" distR="114300" simplePos="0" relativeHeight="251681792" behindDoc="0" locked="0" layoutInCell="1" allowOverlap="1" wp14:anchorId="12336EE6" wp14:editId="236823AC">
+              <wp:anchor distT="0" distB="0" distL="114300" distR="114300" simplePos="0" relativeHeight="251658250" behindDoc="0" locked="0" layoutInCell="1" allowOverlap="1" wp14:anchorId="12336EE6" wp14:editId="236823AC">
                 <wp:simplePos x="0" y="0"/>
                 <wp:positionH relativeFrom="column">
                   <wp:posOffset>2397850</wp:posOffset>
@@ -9486,7 +11629,7 @@
               </wp:anchor>
             </w:drawing>
           </mc:Choice>
-          <mc:Fallback>
+          <mc:Fallback xmlns:arto="http://schemas.microsoft.com/office/word/2006/arto">
             <w:pict>
               <v:oval w14:anchorId="69D914DE" id="Oval 17" o:spid="_x0000_s1026" style="position:absolute;margin-left:188.8pt;margin-top:110.2pt;width:17.55pt;height:17.55pt;z-index:251681792;visibility:visible;mso-wrap-style:square;mso-width-percent:0;mso-height-percent:0;mso-wrap-distance-left:9pt;mso-wrap-distance-top:0;mso-wrap-distance-right:9pt;mso-wrap-distance-bottom:0;mso-position-horizontal:absolute;mso-position-horizontal-relative:text;mso-position-vertical:absolute;mso-position-vertical-relative:text;mso-width-percent:0;mso-height-percent:0;mso-width-relative:margin;mso-height-relative:margin;v-text-anchor:middle" o:gfxdata="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" filled="f" strokecolor="red" strokeweight="1pt">
                 <v:stroke joinstyle="miter"/>
@@ -9503,7 +11646,7 @@
         <mc:AlternateContent>
           <mc:Choice Requires="wps">
             <w:drawing>
-              <wp:anchor distT="0" distB="0" distL="114300" distR="114300" simplePos="0" relativeHeight="251683840" behindDoc="0" locked="0" layoutInCell="1" allowOverlap="1" wp14:anchorId="31FDB3C8" wp14:editId="0A66B2CD">
+              <wp:anchor distT="0" distB="0" distL="114300" distR="114300" simplePos="0" relativeHeight="251658251" behindDoc="0" locked="0" layoutInCell="1" allowOverlap="1" wp14:anchorId="31FDB3C8" wp14:editId="0A66B2CD">
                 <wp:simplePos x="0" y="0"/>
                 <wp:positionH relativeFrom="column">
                   <wp:posOffset>2390580</wp:posOffset>
@@ -9569,7 +11712,7 @@
               </wp:anchor>
             </w:drawing>
           </mc:Choice>
-          <mc:Fallback>
+          <mc:Fallback xmlns:arto="http://schemas.microsoft.com/office/word/2006/arto">
             <w:pict>
               <v:oval w14:anchorId="31277134" id="Oval 18" o:spid="_x0000_s1026" style="position:absolute;margin-left:188.25pt;margin-top:59.15pt;width:17.55pt;height:17.55pt;z-index:251683840;visibility:visible;mso-wrap-style:square;mso-width-percent:0;mso-height-percent:0;mso-wrap-distance-left:9pt;mso-wrap-distance-top:0;mso-wrap-distance-right:9pt;mso-wrap-distance-bottom:0;mso-position-horizontal:absolute;mso-position-horizontal-relative:text;mso-position-vertical:absolute;mso-position-vertical-relative:text;mso-width-percent:0;mso-height-percent:0;mso-width-relative:margin;mso-height-relative:margin;v-text-anchor:middle" o:gfxdata="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" filled="f" strokecolor="red" strokeweight="1pt">
                 <v:stroke joinstyle="miter"/>
@@ -9586,7 +11729,7 @@
         <mc:AlternateContent>
           <mc:Choice Requires="wps">
             <w:drawing>
-              <wp:anchor distT="0" distB="0" distL="114300" distR="114300" simplePos="0" relativeHeight="251677696" behindDoc="0" locked="0" layoutInCell="1" allowOverlap="1" wp14:anchorId="6F35B68F" wp14:editId="5E56C1FD">
+              <wp:anchor distT="0" distB="0" distL="114300" distR="114300" simplePos="0" relativeHeight="251658249" behindDoc="0" locked="0" layoutInCell="1" allowOverlap="1" wp14:anchorId="6F35B68F" wp14:editId="5E56C1FD">
                 <wp:simplePos x="0" y="0"/>
                 <wp:positionH relativeFrom="column">
                   <wp:posOffset>2173805</wp:posOffset>
@@ -9652,7 +11795,7 @@
               </wp:anchor>
             </w:drawing>
           </mc:Choice>
-          <mc:Fallback>
+          <mc:Fallback xmlns:arto="http://schemas.microsoft.com/office/word/2006/arto">
             <w:pict>
               <v:oval w14:anchorId="4C0AC569" id="Oval 15" o:spid="_x0000_s1026" style="position:absolute;margin-left:171.15pt;margin-top:358.8pt;width:17.55pt;height:17.55pt;z-index:251677696;visibility:visible;mso-wrap-style:square;mso-width-percent:0;mso-height-percent:0;mso-wrap-distance-left:9pt;mso-wrap-distance-top:0;mso-wrap-distance-right:9pt;mso-wrap-distance-bottom:0;mso-position-horizontal:absolute;mso-position-horizontal-relative:text;mso-position-vertical:absolute;mso-position-vertical-relative:text;mso-width-percent:0;mso-height-percent:0;mso-width-relative:margin;mso-height-relative:margin;v-text-anchor:middle" o:gfxdata="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" filled="f" strokecolor="red" strokeweight="1pt">
                 <v:stroke joinstyle="miter"/>
@@ -9669,7 +11812,7 @@
         <mc:AlternateContent>
           <mc:Choice Requires="wps">
             <w:drawing>
-              <wp:anchor distT="0" distB="0" distL="114300" distR="114300" simplePos="0" relativeHeight="251675648" behindDoc="0" locked="0" layoutInCell="1" allowOverlap="1" wp14:anchorId="10D65C35" wp14:editId="1F5391E5">
+              <wp:anchor distT="0" distB="0" distL="114300" distR="114300" simplePos="0" relativeHeight="251658248" behindDoc="0" locked="0" layoutInCell="1" allowOverlap="1" wp14:anchorId="10D65C35" wp14:editId="1F5391E5">
                 <wp:simplePos x="0" y="0"/>
                 <wp:positionH relativeFrom="column">
                   <wp:posOffset>2167200</wp:posOffset>
@@ -9735,7 +11878,7 @@
               </wp:anchor>
             </w:drawing>
           </mc:Choice>
-          <mc:Fallback>
+          <mc:Fallback xmlns:arto="http://schemas.microsoft.com/office/word/2006/arto">
             <w:pict>
               <v:oval w14:anchorId="5A246988" id="Oval 14" o:spid="_x0000_s1026" style="position:absolute;margin-left:170.65pt;margin-top:337.85pt;width:17.55pt;height:17.55pt;z-index:251675648;visibility:visible;mso-wrap-style:square;mso-width-percent:0;mso-height-percent:0;mso-wrap-distance-left:9pt;mso-wrap-distance-top:0;mso-wrap-distance-right:9pt;mso-wrap-distance-bottom:0;mso-position-horizontal:absolute;mso-position-horizontal-relative:text;mso-position-vertical:absolute;mso-position-vertical-relative:text;mso-width-percent:0;mso-height-percent:0;mso-width-relative:margin;mso-height-relative:margin;v-text-anchor:middle" o:gfxdata="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" filled="f" strokecolor="red" strokeweight="1pt">
                 <v:stroke joinstyle="miter"/>
@@ -9752,7 +11895,7 @@
         <mc:AlternateContent>
           <mc:Choice Requires="wps">
             <w:drawing>
-              <wp:anchor distT="0" distB="0" distL="114300" distR="114300" simplePos="0" relativeHeight="251671552" behindDoc="0" locked="0" layoutInCell="1" allowOverlap="1" wp14:anchorId="76218029" wp14:editId="2A255E6F">
+              <wp:anchor distT="0" distB="0" distL="114300" distR="114300" simplePos="0" relativeHeight="251658246" behindDoc="0" locked="0" layoutInCell="1" allowOverlap="1" wp14:anchorId="76218029" wp14:editId="2A255E6F">
                 <wp:simplePos x="0" y="0"/>
                 <wp:positionH relativeFrom="column">
                   <wp:posOffset>2188800</wp:posOffset>
@@ -9818,7 +11961,7 @@
               </wp:anchor>
             </w:drawing>
           </mc:Choice>
-          <mc:Fallback>
+          <mc:Fallback xmlns:arto="http://schemas.microsoft.com/office/word/2006/arto">
             <w:pict>
               <v:oval w14:anchorId="47800510" id="Oval 12" o:spid="_x0000_s1026" style="position:absolute;margin-left:172.35pt;margin-top:592pt;width:17.55pt;height:17.55pt;z-index:251671552;visibility:visible;mso-wrap-style:square;mso-width-percent:0;mso-height-percent:0;mso-wrap-distance-left:9pt;mso-wrap-distance-top:0;mso-wrap-distance-right:9pt;mso-wrap-distance-bottom:0;mso-position-horizontal:absolute;mso-position-horizontal-relative:text;mso-position-vertical:absolute;mso-position-vertical-relative:text;mso-width-percent:0;mso-height-percent:0;mso-width-relative:margin;mso-height-relative:margin;v-text-anchor:middle" o:gfxdata="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" filled="f" strokecolor="red" strokeweight="1pt">
                 <v:stroke joinstyle="miter"/>
@@ -9849,7 +11992,7 @@
         <mc:AlternateContent>
           <mc:Choice Requires="wps">
             <w:drawing>
-              <wp:anchor distT="0" distB="0" distL="114300" distR="114300" simplePos="0" relativeHeight="251673600" behindDoc="0" locked="0" layoutInCell="1" allowOverlap="1" wp14:anchorId="1567CABC" wp14:editId="49D953D4">
+              <wp:anchor distT="0" distB="0" distL="114300" distR="114300" simplePos="0" relativeHeight="251658247" behindDoc="0" locked="0" layoutInCell="1" allowOverlap="1" wp14:anchorId="1567CABC" wp14:editId="49D953D4">
                 <wp:simplePos x="0" y="0"/>
                 <wp:positionH relativeFrom="column">
                   <wp:posOffset>-1353707</wp:posOffset>
@@ -9915,7 +12058,7 @@
               </wp:anchor>
             </w:drawing>
           </mc:Choice>
-          <mc:Fallback>
+          <mc:Fallback xmlns:arto="http://schemas.microsoft.com/office/word/2006/arto">
             <w:pict>
               <v:oval w14:anchorId="6E18F231" id="Oval 13" o:spid="_x0000_s1026" style="position:absolute;margin-left:-106.6pt;margin-top:271.65pt;width:17.55pt;height:17.55pt;z-index:251673600;visibility:visible;mso-wrap-style:square;mso-width-percent:0;mso-height-percent:0;mso-wrap-distance-left:9pt;mso-wrap-distance-top:0;mso-wrap-distance-right:9pt;mso-wrap-distance-bottom:0;mso-position-horizontal:absolute;mso-position-horizontal-relative:text;mso-position-vertical:absolute;mso-position-vertical-relative:text;mso-width-percent:0;mso-height-percent:0;mso-width-relative:margin;mso-height-relative:margin;v-text-anchor:middle" o:gfxdata="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" filled="f" strokecolor="red" strokeweight="1pt">
                 <v:stroke joinstyle="miter"/>
@@ -9930,9 +12073,9 @@
           <w:vertAlign w:val="subscript"/>
         </w:rPr>
         <w:drawing>
-          <wp:inline distT="0" distB="0" distL="0" distR="0" wp14:anchorId="34051F94" wp14:editId="08FD1D24">
-            <wp:extent cx="8429852" cy="1548492"/>
-            <wp:effectExtent l="0" t="7302" r="2222" b="2223"/>
+          <wp:inline distT="0" distB="0" distL="0" distR="0" wp14:anchorId="34051F94" wp14:editId="3AAB32C0">
+            <wp:extent cx="8358582" cy="1535401"/>
+            <wp:effectExtent l="1905" t="0" r="6350" b="6350"/>
             <wp:docPr id="11" name="Picture 11"/>
             <wp:cNvGraphicFramePr>
               <a:graphicFrameLocks xmlns:a="http://schemas.openxmlformats.org/drawingml/2006/main" noChangeAspect="1"/>
@@ -9953,7 +12096,7 @@
                   <pic:spPr>
                     <a:xfrm rot="16200000">
                       <a:off x="0" y="0"/>
-                      <a:ext cx="8537792" cy="1568320"/>
+                      <a:ext cx="8369436" cy="1537395"/>
                     </a:xfrm>
                     <a:prstGeom prst="rect">
                       <a:avLst/>
@@ -9984,7 +12127,7 @@
 </file>
 
 <file path=word/endnotes.xml><?xml version="1.0" encoding="utf-8"?>
-<w:endnotes xmlns:wpc="http://schemas.microsoft.com/office/word/2010/wordprocessingCanvas" xmlns:cx="http://schemas.microsoft.com/office/drawing/2014/chartex" xmlns:cx1="http://schemas.microsoft.com/office/drawing/2015/9/8/chartex" xmlns:cx2="http://schemas.microsoft.com/office/drawing/2015/10/21/chartex" xmlns:cx3="http://schemas.microsoft.com/office/drawing/2016/5/9/chartex" xmlns:cx4="http://schemas.microsoft.com/office/drawing/2016/5/10/chartex" xmlns:cx5="http://schemas.microsoft.com/office/drawing/2016/5/11/chartex" xmlns:cx6="http://schemas.microsoft.com/office/drawing/2016/5/12/chartex" xmlns:cx7="http://schemas.microsoft.com/office/drawing/2016/5/13/chartex" xmlns:cx8="http://schemas.microsoft.com/office/drawing/2016/5/14/chartex" xmlns:mc="http://schemas.openxmlformats.org/markup-compatibility/2006" xmlns:aink="http://schemas.microsoft.com/office/drawing/2016/ink" xmlns:am3d="http://schemas.microsoft.com/office/drawing/2017/model3d" xmlns:o="urn:schemas-microsoft-com:office:office" xmlns:oel="http://schemas.microsoft.com/office/2019/extlst" xmlns:r="http://schemas.openxmlformats.org/officeDocument/2006/relationships" xmlns:m="http://schemas.openxmlformats.org/officeDocument/2006/math" xmlns:v="urn:schemas-microsoft-com:vml" xmlns:wp14="http://schemas.microsoft.com/office/word/2010/wordprocessingDrawing" xmlns:wp="http://schemas.openxmlformats.org/drawingml/2006/wordprocessingDrawing" xmlns:w10="urn:schemas-microsoft-com:office:word" xmlns:w="http://schemas.openxmlformats.org/wordprocessingml/2006/main" xmlns:w14="http://schemas.microsoft.com/office/word/2010/wordml" xmlns:w15="http://schemas.microsoft.com/office/word/2012/wordml" xmlns:w16cex="http://schemas.microsoft.com/office/word/2018/wordml/cex" xmlns:w16cid="http://schemas.microsoft.com/office/word/2016/wordml/cid" xmlns:w16="http://schemas.microsoft.com/office/word/2018/wordml" xmlns:w16sdtdh="http://schemas.microsoft.com/office/word/2020/wordml/sdtdatahash" xmlns:w16se="http://schemas.microsoft.com/office/word/2015/wordml/symex" xmlns:wpg="http://schemas.microsoft.com/office/word/2010/wordprocessingGroup" xmlns:wpi="http://schemas.microsoft.com/office/word/2010/wordprocessingInk" xmlns:wne="http://schemas.microsoft.com/office/word/2006/wordml" xmlns:wps="http://schemas.microsoft.com/office/word/2010/wordprocessingShape" mc:Ignorable="w14 w15 w16se w16cid w16 w16cex w16sdtdh wp14">
+<w:endnotes xmlns:wpc="http://schemas.microsoft.com/office/word/2010/wordprocessingCanvas" xmlns:cx="http://schemas.microsoft.com/office/drawing/2014/chartex" xmlns:cx1="http://schemas.microsoft.com/office/drawing/2015/9/8/chartex" xmlns:cx2="http://schemas.microsoft.com/office/drawing/2015/10/21/chartex" xmlns:cx3="http://schemas.microsoft.com/office/drawing/2016/5/9/chartex" xmlns:cx4="http://schemas.microsoft.com/office/drawing/2016/5/10/chartex" xmlns:cx5="http://schemas.microsoft.com/office/drawing/2016/5/11/chartex" xmlns:cx6="http://schemas.microsoft.com/office/drawing/2016/5/12/chartex" xmlns:cx7="http://schemas.microsoft.com/office/drawing/2016/5/13/chartex" xmlns:cx8="http://schemas.microsoft.com/office/drawing/2016/5/14/chartex" xmlns:mc="http://schemas.openxmlformats.org/markup-compatibility/2006" xmlns:aink="http://schemas.microsoft.com/office/drawing/2016/ink" xmlns:am3d="http://schemas.microsoft.com/office/drawing/2017/model3d" xmlns:o="urn:schemas-microsoft-com:office:office" xmlns:oel="http://schemas.microsoft.com/office/2019/extlst" xmlns:r="http://schemas.openxmlformats.org/officeDocument/2006/relationships" xmlns:m="http://schemas.openxmlformats.org/officeDocument/2006/math" xmlns:v="urn:schemas-microsoft-com:vml" xmlns:wp14="http://schemas.microsoft.com/office/word/2010/wordprocessingDrawing" xmlns:wp="http://schemas.openxmlformats.org/drawingml/2006/wordprocessingDrawing" xmlns:w10="urn:schemas-microsoft-com:office:word" xmlns:w="http://schemas.openxmlformats.org/wordprocessingml/2006/main" xmlns:w14="http://schemas.microsoft.com/office/word/2010/wordml" xmlns:w15="http://schemas.microsoft.com/office/word/2012/wordml" xmlns:w16cex="http://schemas.microsoft.com/office/word/2018/wordml/cex" xmlns:w16cid="http://schemas.microsoft.com/office/word/2016/wordml/cid" xmlns:w16="http://schemas.microsoft.com/office/word/2018/wordml" xmlns:w16du="http://schemas.microsoft.com/office/word/2023/wordml/word16du" xmlns:w16sdtdh="http://schemas.microsoft.com/office/word/2020/wordml/sdtdatahash" xmlns:w16sdtfl="http://schemas.microsoft.com/office/word/2024/wordml/sdtformatlock" xmlns:w16se="http://schemas.microsoft.com/office/word/2015/wordml/symex" xmlns:wpg="http://schemas.microsoft.com/office/word/2010/wordprocessingGroup" xmlns:wpi="http://schemas.microsoft.com/office/word/2010/wordprocessingInk" xmlns:wne="http://schemas.microsoft.com/office/word/2006/wordml" xmlns:wps="http://schemas.microsoft.com/office/word/2010/wordprocessingShape" mc:Ignorable="w14 w15 w16se w16cid w16 w16cex w16sdtdh w16sdtfl w16du wp14">
   <w:endnote w:type="separator" w:id="-1">
     <w:p>
       <w:r>
@@ -10003,7 +12146,7 @@
 </file>
 
 <file path=word/footer1.xml><?xml version="1.0" encoding="utf-8"?>
-<w:ftr xmlns:wpc="http://schemas.microsoft.com/office/word/2010/wordprocessingCanvas" xmlns:cx="http://schemas.microsoft.com/office/drawing/2014/chartex" xmlns:cx1="http://schemas.microsoft.com/office/drawing/2015/9/8/chartex" xmlns:cx2="http://schemas.microsoft.com/office/drawing/2015/10/21/chartex" xmlns:cx3="http://schemas.microsoft.com/office/drawing/2016/5/9/chartex" xmlns:cx4="http://schemas.microsoft.com/office/drawing/2016/5/10/chartex" xmlns:cx5="http://schemas.microsoft.com/office/drawing/2016/5/11/chartex" xmlns:cx6="http://schemas.microsoft.com/office/drawing/2016/5/12/chartex" xmlns:cx7="http://schemas.microsoft.com/office/drawing/2016/5/13/chartex" xmlns:cx8="http://schemas.microsoft.com/office/drawing/2016/5/14/chartex" xmlns:mc="http://schemas.openxmlformats.org/markup-compatibility/2006" xmlns:aink="http://schemas.microsoft.com/office/drawing/2016/ink" xmlns:am3d="http://schemas.microsoft.com/office/drawing/2017/model3d" xmlns:o="urn:schemas-microsoft-com:office:office" xmlns:oel="http://schemas.microsoft.com/office/2019/extlst" xmlns:r="http://schemas.openxmlformats.org/officeDocument/2006/relationships" xmlns:m="http://schemas.openxmlformats.org/officeDocument/2006/math" xmlns:v="urn:schemas-microsoft-com:vml" xmlns:wp14="http://schemas.microsoft.com/office/word/2010/wordprocessingDrawing" xmlns:wp="http://schemas.openxmlformats.org/drawingml/2006/wordprocessingDrawing" xmlns:w10="urn:schemas-microsoft-com:office:word" xmlns:w="http://schemas.openxmlformats.org/wordprocessingml/2006/main" xmlns:w14="http://schemas.microsoft.com/office/word/2010/wordml" xmlns:w15="http://schemas.microsoft.com/office/word/2012/wordml" xmlns:w16cex="http://schemas.microsoft.com/office/word/2018/wordml/cex" xmlns:w16cid="http://schemas.microsoft.com/office/word/2016/wordml/cid" xmlns:w16="http://schemas.microsoft.com/office/word/2018/wordml" xmlns:w16sdtdh="http://schemas.microsoft.com/office/word/2020/wordml/sdtdatahash" xmlns:w16se="http://schemas.microsoft.com/office/word/2015/wordml/symex" xmlns:wpg="http://schemas.microsoft.com/office/word/2010/wordprocessingGroup" xmlns:wpi="http://schemas.microsoft.com/office/word/2010/wordprocessingInk" xmlns:wne="http://schemas.microsoft.com/office/word/2006/wordml" xmlns:wps="http://schemas.microsoft.com/office/word/2010/wordprocessingShape" mc:Ignorable="w14 w15 w16se w16cid w16 w16cex w16sdtdh wp14">
+<w:ftr xmlns:wpc="http://schemas.microsoft.com/office/word/2010/wordprocessingCanvas" xmlns:cx="http://schemas.microsoft.com/office/drawing/2014/chartex" xmlns:cx1="http://schemas.microsoft.com/office/drawing/2015/9/8/chartex" xmlns:cx2="http://schemas.microsoft.com/office/drawing/2015/10/21/chartex" xmlns:cx3="http://schemas.microsoft.com/office/drawing/2016/5/9/chartex" xmlns:cx4="http://schemas.microsoft.com/office/drawing/2016/5/10/chartex" xmlns:cx5="http://schemas.microsoft.com/office/drawing/2016/5/11/chartex" xmlns:cx6="http://schemas.microsoft.com/office/drawing/2016/5/12/chartex" xmlns:cx7="http://schemas.microsoft.com/office/drawing/2016/5/13/chartex" xmlns:cx8="http://schemas.microsoft.com/office/drawing/2016/5/14/chartex" xmlns:mc="http://schemas.openxmlformats.org/markup-compatibility/2006" xmlns:aink="http://schemas.microsoft.com/office/drawing/2016/ink" xmlns:am3d="http://schemas.microsoft.com/office/drawing/2017/model3d" xmlns:o="urn:schemas-microsoft-com:office:office" xmlns:oel="http://schemas.microsoft.com/office/2019/extlst" xmlns:r="http://schemas.openxmlformats.org/officeDocument/2006/relationships" xmlns:m="http://schemas.openxmlformats.org/officeDocument/2006/math" xmlns:v="urn:schemas-microsoft-com:vml" xmlns:wp14="http://schemas.microsoft.com/office/word/2010/wordprocessingDrawing" xmlns:wp="http://schemas.openxmlformats.org/drawingml/2006/wordprocessingDrawing" xmlns:w10="urn:schemas-microsoft-com:office:word" xmlns:w="http://schemas.openxmlformats.org/wordprocessingml/2006/main" xmlns:w14="http://schemas.microsoft.com/office/word/2010/wordml" xmlns:w15="http://schemas.microsoft.com/office/word/2012/wordml" xmlns:w16cex="http://schemas.microsoft.com/office/word/2018/wordml/cex" xmlns:w16cid="http://schemas.microsoft.com/office/word/2016/wordml/cid" xmlns:w16="http://schemas.microsoft.com/office/word/2018/wordml" xmlns:w16du="http://schemas.microsoft.com/office/word/2023/wordml/word16du" xmlns:w16sdtdh="http://schemas.microsoft.com/office/word/2020/wordml/sdtdatahash" xmlns:w16sdtfl="http://schemas.microsoft.com/office/word/2024/wordml/sdtformatlock" xmlns:w16se="http://schemas.microsoft.com/office/word/2015/wordml/symex" xmlns:wpg="http://schemas.microsoft.com/office/word/2010/wordprocessingGroup" xmlns:wpi="http://schemas.microsoft.com/office/word/2010/wordprocessingInk" xmlns:wne="http://schemas.microsoft.com/office/word/2006/wordml" xmlns:wps="http://schemas.microsoft.com/office/word/2010/wordprocessingShape" mc:Ignorable="w14 w15 w16se w16cid w16 w16cex w16sdtdh w16sdtfl w16du wp14">
   <w:sdt>
     <w:sdtPr>
       <w:id w:val="955829706"/>
@@ -10056,7 +12199,7 @@
 </file>
 
 <file path=word/footnotes.xml><?xml version="1.0" encoding="utf-8"?>
-<w:footnotes xmlns:wpc="http://schemas.microsoft.com/office/word/2010/wordprocessingCanvas" xmlns:cx="http://schemas.microsoft.com/office/drawing/2014/chartex" xmlns:cx1="http://schemas.microsoft.com/office/drawing/2015/9/8/chartex" xmlns:cx2="http://schemas.microsoft.com/office/drawing/2015/10/21/chartex" xmlns:cx3="http://schemas.microsoft.com/office/drawing/2016/5/9/chartex" xmlns:cx4="http://schemas.microsoft.com/office/drawing/2016/5/10/chartex" xmlns:cx5="http://schemas.microsoft.com/office/drawing/2016/5/11/chartex" xmlns:cx6="http://schemas.microsoft.com/office/drawing/2016/5/12/chartex" xmlns:cx7="http://schemas.microsoft.com/office/drawing/2016/5/13/chartex" xmlns:cx8="http://schemas.microsoft.com/office/drawing/2016/5/14/chartex" xmlns:mc="http://schemas.openxmlformats.org/markup-compatibility/2006" xmlns:aink="http://schemas.microsoft.com/office/drawing/2016/ink" xmlns:am3d="http://schemas.microsoft.com/office/drawing/2017/model3d" xmlns:o="urn:schemas-microsoft-com:office:office" xmlns:oel="http://schemas.microsoft.com/office/2019/extlst" xmlns:r="http://schemas.openxmlformats.org/officeDocument/2006/relationships" xmlns:m="http://schemas.openxmlformats.org/officeDocument/2006/math" xmlns:v="urn:schemas-microsoft-com:vml" xmlns:wp14="http://schemas.microsoft.com/office/word/2010/wordprocessingDrawing" xmlns:wp="http://schemas.openxmlformats.org/drawingml/2006/wordprocessingDrawing" xmlns:w10="urn:schemas-microsoft-com:office:word" xmlns:w="http://schemas.openxmlformats.org/wordprocessingml/2006/main" xmlns:w14="http://schemas.microsoft.com/office/word/2010/wordml" xmlns:w15="http://schemas.microsoft.com/office/word/2012/wordml" xmlns:w16cex="http://schemas.microsoft.com/office/word/2018/wordml/cex" xmlns:w16cid="http://schemas.microsoft.com/office/word/2016/wordml/cid" xmlns:w16="http://schemas.microsoft.com/office/word/2018/wordml" xmlns:w16sdtdh="http://schemas.microsoft.com/office/word/2020/wordml/sdtdatahash" xmlns:w16se="http://schemas.microsoft.com/office/word/2015/wordml/symex" xmlns:wpg="http://schemas.microsoft.com/office/word/2010/wordprocessingGroup" xmlns:wpi="http://schemas.microsoft.com/office/word/2010/wordprocessingInk" xmlns:wne="http://schemas.microsoft.com/office/word/2006/wordml" xmlns:wps="http://schemas.microsoft.com/office/word/2010/wordprocessingShape" mc:Ignorable="w14 w15 w16se w16cid w16 w16cex w16sdtdh wp14">
+<w:footnotes xmlns:wpc="http://schemas.microsoft.com/office/word/2010/wordprocessingCanvas" xmlns:cx="http://schemas.microsoft.com/office/drawing/2014/chartex" xmlns:cx1="http://schemas.microsoft.com/office/drawing/2015/9/8/chartex" xmlns:cx2="http://schemas.microsoft.com/office/drawing/2015/10/21/chartex" xmlns:cx3="http://schemas.microsoft.com/office/drawing/2016/5/9/chartex" xmlns:cx4="http://schemas.microsoft.com/office/drawing/2016/5/10/chartex" xmlns:cx5="http://schemas.microsoft.com/office/drawing/2016/5/11/chartex" xmlns:cx6="http://schemas.microsoft.com/office/drawing/2016/5/12/chartex" xmlns:cx7="http://schemas.microsoft.com/office/drawing/2016/5/13/chartex" xmlns:cx8="http://schemas.microsoft.com/office/drawing/2016/5/14/chartex" xmlns:mc="http://schemas.openxmlformats.org/markup-compatibility/2006" xmlns:aink="http://schemas.microsoft.com/office/drawing/2016/ink" xmlns:am3d="http://schemas.microsoft.com/office/drawing/2017/model3d" xmlns:o="urn:schemas-microsoft-com:office:office" xmlns:oel="http://schemas.microsoft.com/office/2019/extlst" xmlns:r="http://schemas.openxmlformats.org/officeDocument/2006/relationships" xmlns:m="http://schemas.openxmlformats.org/officeDocument/2006/math" xmlns:v="urn:schemas-microsoft-com:vml" xmlns:wp14="http://schemas.microsoft.com/office/word/2010/wordprocessingDrawing" xmlns:wp="http://schemas.openxmlformats.org/drawingml/2006/wordprocessingDrawing" xmlns:w10="urn:schemas-microsoft-com:office:word" xmlns:w="http://schemas.openxmlformats.org/wordprocessingml/2006/main" xmlns:w14="http://schemas.microsoft.com/office/word/2010/wordml" xmlns:w15="http://schemas.microsoft.com/office/word/2012/wordml" xmlns:w16cex="http://schemas.microsoft.com/office/word/2018/wordml/cex" xmlns:w16cid="http://schemas.microsoft.com/office/word/2016/wordml/cid" xmlns:w16="http://schemas.microsoft.com/office/word/2018/wordml" xmlns:w16du="http://schemas.microsoft.com/office/word/2023/wordml/word16du" xmlns:w16sdtdh="http://schemas.microsoft.com/office/word/2020/wordml/sdtdatahash" xmlns:w16sdtfl="http://schemas.microsoft.com/office/word/2024/wordml/sdtformatlock" xmlns:w16se="http://schemas.microsoft.com/office/word/2015/wordml/symex" xmlns:wpg="http://schemas.microsoft.com/office/word/2010/wordprocessingGroup" xmlns:wpi="http://schemas.microsoft.com/office/word/2010/wordprocessingInk" xmlns:wne="http://schemas.microsoft.com/office/word/2006/wordml" xmlns:wps="http://schemas.microsoft.com/office/word/2010/wordprocessingShape" mc:Ignorable="w14 w15 w16se w16cid w16 w16cex w16sdtdh w16sdtfl w16du wp14">
   <w:footnote w:type="separator" w:id="-1">
     <w:p>
       <w:r>
@@ -10106,7 +12249,7 @@
 </file>
 
 <file path=word/header1.xml><?xml version="1.0" encoding="utf-8"?>
-<w:hdr xmlns:wpc="http://schemas.microsoft.com/office/word/2010/wordprocessingCanvas" xmlns:cx="http://schemas.microsoft.com/office/drawing/2014/chartex" xmlns:cx1="http://schemas.microsoft.com/office/drawing/2015/9/8/chartex" xmlns:cx2="http://schemas.microsoft.com/office/drawing/2015/10/21/chartex" xmlns:cx3="http://schemas.microsoft.com/office/drawing/2016/5/9/chartex" xmlns:cx4="http://schemas.microsoft.com/office/drawing/2016/5/10/chartex" xmlns:cx5="http://schemas.microsoft.com/office/drawing/2016/5/11/chartex" xmlns:cx6="http://schemas.microsoft.com/office/drawing/2016/5/12/chartex" xmlns:cx7="http://schemas.microsoft.com/office/drawing/2016/5/13/chartex" xmlns:cx8="http://schemas.microsoft.com/office/drawing/2016/5/14/chartex" xmlns:mc="http://schemas.openxmlformats.org/markup-compatibility/2006" xmlns:aink="http://schemas.microsoft.com/office/drawing/2016/ink" xmlns:am3d="http://schemas.microsoft.com/office/drawing/2017/model3d" xmlns:o="urn:schemas-microsoft-com:office:office" xmlns:oel="http://schemas.microsoft.com/office/2019/extlst" xmlns:r="http://schemas.openxmlformats.org/officeDocument/2006/relationships" xmlns:m="http://schemas.openxmlformats.org/officeDocument/2006/math" xmlns:v="urn:schemas-microsoft-com:vml" xmlns:wp14="http://schemas.microsoft.com/office/word/2010/wordprocessingDrawing" xmlns:wp="http://schemas.openxmlformats.org/drawingml/2006/wordprocessingDrawing" xmlns:w10="urn:schemas-microsoft-com:office:word" xmlns:w="http://schemas.openxmlformats.org/wordprocessingml/2006/main" xmlns:w14="http://schemas.microsoft.com/office/word/2010/wordml" xmlns:w15="http://schemas.microsoft.com/office/word/2012/wordml" xmlns:w16cex="http://schemas.microsoft.com/office/word/2018/wordml/cex" xmlns:w16cid="http://schemas.microsoft.com/office/word/2016/wordml/cid" xmlns:w16="http://schemas.microsoft.com/office/word/2018/wordml" xmlns:w16sdtdh="http://schemas.microsoft.com/office/word/2020/wordml/sdtdatahash" xmlns:w16se="http://schemas.microsoft.com/office/word/2015/wordml/symex" xmlns:wpg="http://schemas.microsoft.com/office/word/2010/wordprocessingGroup" xmlns:wpi="http://schemas.microsoft.com/office/word/2010/wordprocessingInk" xmlns:wne="http://schemas.microsoft.com/office/word/2006/wordml" xmlns:wps="http://schemas.microsoft.com/office/word/2010/wordprocessingShape" mc:Ignorable="w14 w15 w16se w16cid w16 w16cex w16sdtdh wp14">
+<w:hdr xmlns:wpc="http://schemas.microsoft.com/office/word/2010/wordprocessingCanvas" xmlns:cx="http://schemas.microsoft.com/office/drawing/2014/chartex" xmlns:cx1="http://schemas.microsoft.com/office/drawing/2015/9/8/chartex" xmlns:cx2="http://schemas.microsoft.com/office/drawing/2015/10/21/chartex" xmlns:cx3="http://schemas.microsoft.com/office/drawing/2016/5/9/chartex" xmlns:cx4="http://schemas.microsoft.com/office/drawing/2016/5/10/chartex" xmlns:cx5="http://schemas.microsoft.com/office/drawing/2016/5/11/chartex" xmlns:cx6="http://schemas.microsoft.com/office/drawing/2016/5/12/chartex" xmlns:cx7="http://schemas.microsoft.com/office/drawing/2016/5/13/chartex" xmlns:cx8="http://schemas.microsoft.com/office/drawing/2016/5/14/chartex" xmlns:mc="http://schemas.openxmlformats.org/markup-compatibility/2006" xmlns:aink="http://schemas.microsoft.com/office/drawing/2016/ink" xmlns:am3d="http://schemas.microsoft.com/office/drawing/2017/model3d" xmlns:o="urn:schemas-microsoft-com:office:office" xmlns:oel="http://schemas.microsoft.com/office/2019/extlst" xmlns:r="http://schemas.openxmlformats.org/officeDocument/2006/relationships" xmlns:m="http://schemas.openxmlformats.org/officeDocument/2006/math" xmlns:v="urn:schemas-microsoft-com:vml" xmlns:wp14="http://schemas.microsoft.com/office/word/2010/wordprocessingDrawing" xmlns:wp="http://schemas.openxmlformats.org/drawingml/2006/wordprocessingDrawing" xmlns:w10="urn:schemas-microsoft-com:office:word" xmlns:w="http://schemas.openxmlformats.org/wordprocessingml/2006/main" xmlns:w14="http://schemas.microsoft.com/office/word/2010/wordml" xmlns:w15="http://schemas.microsoft.com/office/word/2012/wordml" xmlns:w16cex="http://schemas.microsoft.com/office/word/2018/wordml/cex" xmlns:w16cid="http://schemas.microsoft.com/office/word/2016/wordml/cid" xmlns:w16="http://schemas.microsoft.com/office/word/2018/wordml" xmlns:w16du="http://schemas.microsoft.com/office/word/2023/wordml/word16du" xmlns:w16sdtdh="http://schemas.microsoft.com/office/word/2020/wordml/sdtdatahash" xmlns:w16sdtfl="http://schemas.microsoft.com/office/word/2024/wordml/sdtformatlock" xmlns:w16se="http://schemas.microsoft.com/office/word/2015/wordml/symex" xmlns:wpg="http://schemas.microsoft.com/office/word/2010/wordprocessingGroup" xmlns:wpi="http://schemas.microsoft.com/office/word/2010/wordprocessingInk" xmlns:wne="http://schemas.microsoft.com/office/word/2006/wordml" xmlns:wps="http://schemas.microsoft.com/office/word/2010/wordprocessingShape" mc:Ignorable="w14 w15 w16se w16cid w16 w16cex w16sdtdh w16sdtfl w16du wp14">
   <w:p>
     <w:pPr>
       <w:pStyle w:val="Header"/>
@@ -10117,7 +12260,7 @@
 </file>
 
 <file path=word/header2.xml><?xml version="1.0" encoding="utf-8"?>
-<w:hdr xmlns:wpc="http://schemas.microsoft.com/office/word/2010/wordprocessingCanvas" xmlns:cx="http://schemas.microsoft.com/office/drawing/2014/chartex" xmlns:cx1="http://schemas.microsoft.com/office/drawing/2015/9/8/chartex" xmlns:cx2="http://schemas.microsoft.com/office/drawing/2015/10/21/chartex" xmlns:cx3="http://schemas.microsoft.com/office/drawing/2016/5/9/chartex" xmlns:cx4="http://schemas.microsoft.com/office/drawing/2016/5/10/chartex" xmlns:cx5="http://schemas.microsoft.com/office/drawing/2016/5/11/chartex" xmlns:cx6="http://schemas.microsoft.com/office/drawing/2016/5/12/chartex" xmlns:cx7="http://schemas.microsoft.com/office/drawing/2016/5/13/chartex" xmlns:cx8="http://schemas.microsoft.com/office/drawing/2016/5/14/chartex" xmlns:mc="http://schemas.openxmlformats.org/markup-compatibility/2006" xmlns:aink="http://schemas.microsoft.com/office/drawing/2016/ink" xmlns:am3d="http://schemas.microsoft.com/office/drawing/2017/model3d" xmlns:o="urn:schemas-microsoft-com:office:office" xmlns:oel="http://schemas.microsoft.com/office/2019/extlst" xmlns:r="http://schemas.openxmlformats.org/officeDocument/2006/relationships" xmlns:m="http://schemas.openxmlformats.org/officeDocument/2006/math" xmlns:v="urn:schemas-microsoft-com:vml" xmlns:wp14="http://schemas.microsoft.com/office/word/2010/wordprocessingDrawing" xmlns:wp="http://schemas.openxmlformats.org/drawingml/2006/wordprocessingDrawing" xmlns:w10="urn:schemas-microsoft-com:office:word" xmlns:w="http://schemas.openxmlformats.org/wordprocessingml/2006/main" xmlns:w14="http://schemas.microsoft.com/office/word/2010/wordml" xmlns:w15="http://schemas.microsoft.com/office/word/2012/wordml" xmlns:w16cex="http://schemas.microsoft.com/office/word/2018/wordml/cex" xmlns:w16cid="http://schemas.microsoft.com/office/word/2016/wordml/cid" xmlns:w16="http://schemas.microsoft.com/office/word/2018/wordml" xmlns:w16sdtdh="http://schemas.microsoft.com/office/word/2020/wordml/sdtdatahash" xmlns:w16se="http://schemas.microsoft.com/office/word/2015/wordml/symex" xmlns:wpg="http://schemas.microsoft.com/office/word/2010/wordprocessingGroup" xmlns:wpi="http://schemas.microsoft.com/office/word/2010/wordprocessingInk" xmlns:wne="http://schemas.microsoft.com/office/word/2006/wordml" xmlns:wps="http://schemas.microsoft.com/office/word/2010/wordprocessingShape" mc:Ignorable="w14 w15 w16se w16cid w16 w16cex w16sdtdh wp14">
+<w:hdr xmlns:wpc="http://schemas.microsoft.com/office/word/2010/wordprocessingCanvas" xmlns:cx="http://schemas.microsoft.com/office/drawing/2014/chartex" xmlns:cx1="http://schemas.microsoft.com/office/drawing/2015/9/8/chartex" xmlns:cx2="http://schemas.microsoft.com/office/drawing/2015/10/21/chartex" xmlns:cx3="http://schemas.microsoft.com/office/drawing/2016/5/9/chartex" xmlns:cx4="http://schemas.microsoft.com/office/drawing/2016/5/10/chartex" xmlns:cx5="http://schemas.microsoft.com/office/drawing/2016/5/11/chartex" xmlns:cx6="http://schemas.microsoft.com/office/drawing/2016/5/12/chartex" xmlns:cx7="http://schemas.microsoft.com/office/drawing/2016/5/13/chartex" xmlns:cx8="http://schemas.microsoft.com/office/drawing/2016/5/14/chartex" xmlns:mc="http://schemas.openxmlformats.org/markup-compatibility/2006" xmlns:aink="http://schemas.microsoft.com/office/drawing/2016/ink" xmlns:am3d="http://schemas.microsoft.com/office/drawing/2017/model3d" xmlns:o="urn:schemas-microsoft-com:office:office" xmlns:oel="http://schemas.microsoft.com/office/2019/extlst" xmlns:r="http://schemas.openxmlformats.org/officeDocument/2006/relationships" xmlns:m="http://schemas.openxmlformats.org/officeDocument/2006/math" xmlns:v="urn:schemas-microsoft-com:vml" xmlns:wp14="http://schemas.microsoft.com/office/word/2010/wordprocessingDrawing" xmlns:wp="http://schemas.openxmlformats.org/drawingml/2006/wordprocessingDrawing" xmlns:w10="urn:schemas-microsoft-com:office:word" xmlns:w="http://schemas.openxmlformats.org/wordprocessingml/2006/main" xmlns:w14="http://schemas.microsoft.com/office/word/2010/wordml" xmlns:w15="http://schemas.microsoft.com/office/word/2012/wordml" xmlns:w16cex="http://schemas.microsoft.com/office/word/2018/wordml/cex" xmlns:w16cid="http://schemas.microsoft.com/office/word/2016/wordml/cid" xmlns:w16="http://schemas.microsoft.com/office/word/2018/wordml" xmlns:w16du="http://schemas.microsoft.com/office/word/2023/wordml/word16du" xmlns:w16sdtdh="http://schemas.microsoft.com/office/word/2020/wordml/sdtdatahash" xmlns:w16sdtfl="http://schemas.microsoft.com/office/word/2024/wordml/sdtformatlock" xmlns:w16se="http://schemas.microsoft.com/office/word/2015/wordml/symex" xmlns:wpg="http://schemas.microsoft.com/office/word/2010/wordprocessingGroup" xmlns:wpi="http://schemas.microsoft.com/office/word/2010/wordprocessingInk" xmlns:wne="http://schemas.microsoft.com/office/word/2006/wordml" xmlns:wps="http://schemas.microsoft.com/office/word/2010/wordprocessingShape" mc:Ignorable="w14 w15 w16se w16cid w16 w16cex w16sdtdh w16sdtfl w16du wp14">
   <w:p>
     <w:pPr>
       <w:pStyle w:val="Header"/>
@@ -10187,8 +12330,97 @@
 </file>
 
 <file path=word/numbering.xml><?xml version="1.0" encoding="utf-8"?>
-<w:numbering xmlns:wpc="http://schemas.microsoft.com/office/word/2010/wordprocessingCanvas" xmlns:cx="http://schemas.microsoft.com/office/drawing/2014/chartex" xmlns:cx1="http://schemas.microsoft.com/office/drawing/2015/9/8/chartex" xmlns:cx2="http://schemas.microsoft.com/office/drawing/2015/10/21/chartex" xmlns:cx3="http://schemas.microsoft.com/office/drawing/2016/5/9/chartex" xmlns:cx4="http://schemas.microsoft.com/office/drawing/2016/5/10/chartex" xmlns:cx5="http://schemas.microsoft.com/office/drawing/2016/5/11/chartex" xmlns:cx6="http://schemas.microsoft.com/office/drawing/2016/5/12/chartex" xmlns:cx7="http://schemas.microsoft.com/office/drawing/2016/5/13/chartex" xmlns:cx8="http://schemas.microsoft.com/office/drawing/2016/5/14/chartex" xmlns:mc="http://schemas.openxmlformats.org/markup-compatibility/2006" xmlns:aink="http://schemas.microsoft.com/office/drawing/2016/ink" xmlns:am3d="http://schemas.microsoft.com/office/drawing/2017/model3d" xmlns:o="urn:schemas-microsoft-com:office:office" xmlns:oel="http://schemas.microsoft.com/office/2019/extlst" xmlns:r="http://schemas.openxmlformats.org/officeDocument/2006/relationships" xmlns:m="http://schemas.openxmlformats.org/officeDocument/2006/math" xmlns:v="urn:schemas-microsoft-com:vml" xmlns:wp14="http://schemas.microsoft.com/office/word/2010/wordprocessingDrawing" xmlns:wp="http://schemas.openxmlformats.org/drawingml/2006/wordprocessingDrawing" xmlns:w10="urn:schemas-microsoft-com:office:word" xmlns:w="http://schemas.openxmlformats.org/wordprocessingml/2006/main" xmlns:w14="http://schemas.microsoft.com/office/word/2010/wordml" xmlns:w15="http://schemas.microsoft.com/office/word/2012/wordml" xmlns:w16cex="http://schemas.microsoft.com/office/word/2018/wordml/cex" xmlns:w16cid="http://schemas.microsoft.com/office/word/2016/wordml/cid" xmlns:w16="http://schemas.microsoft.com/office/word/2018/wordml" xmlns:w16sdtdh="http://schemas.microsoft.com/office/word/2020/wordml/sdtdatahash" xmlns:w16se="http://schemas.microsoft.com/office/word/2015/wordml/symex" xmlns:wpg="http://schemas.microsoft.com/office/word/2010/wordprocessingGroup" xmlns:wpi="http://schemas.microsoft.com/office/word/2010/wordprocessingInk" xmlns:wne="http://schemas.microsoft.com/office/word/2006/wordml" xmlns:wps="http://schemas.microsoft.com/office/word/2010/wordprocessingShape" mc:Ignorable="w14 w15 w16se w16cid w16 w16cex w16sdtdh wp14">
+<w:numbering xmlns:wpc="http://schemas.microsoft.com/office/word/2010/wordprocessingCanvas" xmlns:cx="http://schemas.microsoft.com/office/drawing/2014/chartex" xmlns:cx1="http://schemas.microsoft.com/office/drawing/2015/9/8/chartex" xmlns:cx2="http://schemas.microsoft.com/office/drawing/2015/10/21/chartex" xmlns:cx3="http://schemas.microsoft.com/office/drawing/2016/5/9/chartex" xmlns:cx4="http://schemas.microsoft.com/office/drawing/2016/5/10/chartex" xmlns:cx5="http://schemas.microsoft.com/office/drawing/2016/5/11/chartex" xmlns:cx6="http://schemas.microsoft.com/office/drawing/2016/5/12/chartex" xmlns:cx7="http://schemas.microsoft.com/office/drawing/2016/5/13/chartex" xmlns:cx8="http://schemas.microsoft.com/office/drawing/2016/5/14/chartex" xmlns:mc="http://schemas.openxmlformats.org/markup-compatibility/2006" xmlns:aink="http://schemas.microsoft.com/office/drawing/2016/ink" xmlns:am3d="http://schemas.microsoft.com/office/drawing/2017/model3d" xmlns:o="urn:schemas-microsoft-com:office:office" xmlns:oel="http://schemas.microsoft.com/office/2019/extlst" xmlns:r="http://schemas.openxmlformats.org/officeDocument/2006/relationships" xmlns:m="http://schemas.openxmlformats.org/officeDocument/2006/math" xmlns:v="urn:schemas-microsoft-com:vml" xmlns:wp14="http://schemas.microsoft.com/office/word/2010/wordprocessingDrawing" xmlns:wp="http://schemas.openxmlformats.org/drawingml/2006/wordprocessingDrawing" xmlns:w10="urn:schemas-microsoft-com:office:word" xmlns:w="http://schemas.openxmlformats.org/wordprocessingml/2006/main" xmlns:w14="http://schemas.microsoft.com/office/word/2010/wordml" xmlns:w15="http://schemas.microsoft.com/office/word/2012/wordml" xmlns:w16cex="http://schemas.microsoft.com/office/word/2018/wordml/cex" xmlns:w16cid="http://schemas.microsoft.com/office/word/2016/wordml/cid" xmlns:w16="http://schemas.microsoft.com/office/word/2018/wordml" xmlns:w16du="http://schemas.microsoft.com/office/word/2023/wordml/word16du" xmlns:w16sdtdh="http://schemas.microsoft.com/office/word/2020/wordml/sdtdatahash" xmlns:w16sdtfl="http://schemas.microsoft.com/office/word/2024/wordml/sdtformatlock" xmlns:w16se="http://schemas.microsoft.com/office/word/2015/wordml/symex" xmlns:wpg="http://schemas.microsoft.com/office/word/2010/wordprocessingGroup" xmlns:wpi="http://schemas.microsoft.com/office/word/2010/wordprocessingInk" xmlns:wne="http://schemas.microsoft.com/office/word/2006/wordml" xmlns:wps="http://schemas.microsoft.com/office/word/2010/wordprocessingShape" mc:Ignorable="w14 w15 w16se w16cid w16 w16cex w16sdtdh w16sdtfl w16du wp14">
   <w:abstractNum w:abstractNumId="0" w15:restartNumberingAfterBreak="0">
+    <w:nsid w:val="054E43CE"/>
+    <w:multiLevelType w:val="hybridMultilevel"/>
+    <w:tmpl w:val="CF7A0F60"/>
+    <w:lvl w:ilvl="0" w:tplc="10DE6E26">
+      <w:start w:val="1"/>
+      <w:numFmt w:val="decimal"/>
+      <w:lvlText w:val="%1."/>
+      <w:lvlJc w:val="left"/>
+      <w:pPr>
+        <w:ind w:left="720" w:hanging="360"/>
+      </w:pPr>
+      <w:rPr>
+        <w:rFonts w:hint="default"/>
+      </w:rPr>
+    </w:lvl>
+    <w:lvl w:ilvl="1" w:tplc="1C090019" w:tentative="1">
+      <w:start w:val="1"/>
+      <w:numFmt w:val="lowerLetter"/>
+      <w:lvlText w:val="%2."/>
+      <w:lvlJc w:val="left"/>
+      <w:pPr>
+        <w:ind w:left="1440" w:hanging="360"/>
+      </w:pPr>
+    </w:lvl>
+    <w:lvl w:ilvl="2" w:tplc="1C09001B" w:tentative="1">
+      <w:start w:val="1"/>
+      <w:numFmt w:val="lowerRoman"/>
+      <w:lvlText w:val="%3."/>
+      <w:lvlJc w:val="right"/>
+      <w:pPr>
+        <w:ind w:left="2160" w:hanging="180"/>
+      </w:pPr>
+    </w:lvl>
+    <w:lvl w:ilvl="3" w:tplc="1C09000F" w:tentative="1">
+      <w:start w:val="1"/>
+      <w:numFmt w:val="decimal"/>
+      <w:lvlText w:val="%4."/>
+      <w:lvlJc w:val="left"/>
+      <w:pPr>
+        <w:ind w:left="2880" w:hanging="360"/>
+      </w:pPr>
+    </w:lvl>
+    <w:lvl w:ilvl="4" w:tplc="1C090019" w:tentative="1">
+      <w:start w:val="1"/>
+      <w:numFmt w:val="lowerLetter"/>
+      <w:lvlText w:val="%5."/>
+      <w:lvlJc w:val="left"/>
+      <w:pPr>
+        <w:ind w:left="3600" w:hanging="360"/>
+      </w:pPr>
+    </w:lvl>
+    <w:lvl w:ilvl="5" w:tplc="1C09001B" w:tentative="1">
+      <w:start w:val="1"/>
+      <w:numFmt w:val="lowerRoman"/>
+      <w:lvlText w:val="%6."/>
+      <w:lvlJc w:val="right"/>
+      <w:pPr>
+        <w:ind w:left="4320" w:hanging="180"/>
+      </w:pPr>
+    </w:lvl>
+    <w:lvl w:ilvl="6" w:tplc="1C09000F" w:tentative="1">
+      <w:start w:val="1"/>
+      <w:numFmt w:val="decimal"/>
+      <w:lvlText w:val="%7."/>
+      <w:lvlJc w:val="left"/>
+      <w:pPr>
+        <w:ind w:left="5040" w:hanging="360"/>
+      </w:pPr>
+    </w:lvl>
+    <w:lvl w:ilvl="7" w:tplc="1C090019" w:tentative="1">
+      <w:start w:val="1"/>
+      <w:numFmt w:val="lowerLetter"/>
+      <w:lvlText w:val="%8."/>
+      <w:lvlJc w:val="left"/>
+      <w:pPr>
+        <w:ind w:left="5760" w:hanging="360"/>
+      </w:pPr>
+    </w:lvl>
+    <w:lvl w:ilvl="8" w:tplc="1C09001B" w:tentative="1">
+      <w:start w:val="1"/>
+      <w:numFmt w:val="lowerRoman"/>
+      <w:lvlText w:val="%9."/>
+      <w:lvlJc w:val="right"/>
+      <w:pPr>
+        <w:ind w:left="6480" w:hanging="180"/>
+      </w:pPr>
+    </w:lvl>
+  </w:abstractNum>
+  <w:abstractNum w:abstractNumId="1" w15:restartNumberingAfterBreak="0">
     <w:nsid w:val="221C4F6E"/>
     <w:multiLevelType w:val="hybridMultilevel"/>
     <w:tmpl w:val="2E34D5A2"/>
@@ -10274,7 +12506,7 @@
       </w:pPr>
     </w:lvl>
   </w:abstractNum>
-  <w:abstractNum w:abstractNumId="1" w15:restartNumberingAfterBreak="0">
+  <w:abstractNum w:abstractNumId="2" w15:restartNumberingAfterBreak="0">
     <w:nsid w:val="25625F86"/>
     <w:multiLevelType w:val="hybridMultilevel"/>
     <w:tmpl w:val="C344BF44"/>
@@ -10387,7 +12619,209 @@
       </w:rPr>
     </w:lvl>
   </w:abstractNum>
-  <w:abstractNum w:abstractNumId="2" w15:restartNumberingAfterBreak="0">
+  <w:abstractNum w:abstractNumId="3" w15:restartNumberingAfterBreak="0">
+    <w:nsid w:val="2B1F7983"/>
+    <w:multiLevelType w:val="hybridMultilevel"/>
+    <w:tmpl w:val="5B5A1A98"/>
+    <w:lvl w:ilvl="0" w:tplc="10DE6E26">
+      <w:start w:val="1"/>
+      <w:numFmt w:val="decimal"/>
+      <w:lvlText w:val="%1."/>
+      <w:lvlJc w:val="left"/>
+      <w:pPr>
+        <w:ind w:left="720" w:hanging="360"/>
+      </w:pPr>
+      <w:rPr>
+        <w:rFonts w:hint="default"/>
+      </w:rPr>
+    </w:lvl>
+    <w:lvl w:ilvl="1" w:tplc="1C090019" w:tentative="1">
+      <w:start w:val="1"/>
+      <w:numFmt w:val="lowerLetter"/>
+      <w:lvlText w:val="%2."/>
+      <w:lvlJc w:val="left"/>
+      <w:pPr>
+        <w:ind w:left="1440" w:hanging="360"/>
+      </w:pPr>
+    </w:lvl>
+    <w:lvl w:ilvl="2" w:tplc="1C09001B" w:tentative="1">
+      <w:start w:val="1"/>
+      <w:numFmt w:val="lowerRoman"/>
+      <w:lvlText w:val="%3."/>
+      <w:lvlJc w:val="right"/>
+      <w:pPr>
+        <w:ind w:left="2160" w:hanging="180"/>
+      </w:pPr>
+    </w:lvl>
+    <w:lvl w:ilvl="3" w:tplc="1C09000F" w:tentative="1">
+      <w:start w:val="1"/>
+      <w:numFmt w:val="decimal"/>
+      <w:lvlText w:val="%4."/>
+      <w:lvlJc w:val="left"/>
+      <w:pPr>
+        <w:ind w:left="2880" w:hanging="360"/>
+      </w:pPr>
+    </w:lvl>
+    <w:lvl w:ilvl="4" w:tplc="1C090019" w:tentative="1">
+      <w:start w:val="1"/>
+      <w:numFmt w:val="lowerLetter"/>
+      <w:lvlText w:val="%5."/>
+      <w:lvlJc w:val="left"/>
+      <w:pPr>
+        <w:ind w:left="3600" w:hanging="360"/>
+      </w:pPr>
+    </w:lvl>
+    <w:lvl w:ilvl="5" w:tplc="1C09001B" w:tentative="1">
+      <w:start w:val="1"/>
+      <w:numFmt w:val="lowerRoman"/>
+      <w:lvlText w:val="%6."/>
+      <w:lvlJc w:val="right"/>
+      <w:pPr>
+        <w:ind w:left="4320" w:hanging="180"/>
+      </w:pPr>
+    </w:lvl>
+    <w:lvl w:ilvl="6" w:tplc="1C09000F" w:tentative="1">
+      <w:start w:val="1"/>
+      <w:numFmt w:val="decimal"/>
+      <w:lvlText w:val="%7."/>
+      <w:lvlJc w:val="left"/>
+      <w:pPr>
+        <w:ind w:left="5040" w:hanging="360"/>
+      </w:pPr>
+    </w:lvl>
+    <w:lvl w:ilvl="7" w:tplc="1C090019" w:tentative="1">
+      <w:start w:val="1"/>
+      <w:numFmt w:val="lowerLetter"/>
+      <w:lvlText w:val="%8."/>
+      <w:lvlJc w:val="left"/>
+      <w:pPr>
+        <w:ind w:left="5760" w:hanging="360"/>
+      </w:pPr>
+    </w:lvl>
+    <w:lvl w:ilvl="8" w:tplc="1C09001B" w:tentative="1">
+      <w:start w:val="1"/>
+      <w:numFmt w:val="lowerRoman"/>
+      <w:lvlText w:val="%9."/>
+      <w:lvlJc w:val="right"/>
+      <w:pPr>
+        <w:ind w:left="6480" w:hanging="180"/>
+      </w:pPr>
+    </w:lvl>
+  </w:abstractNum>
+  <w:abstractNum w:abstractNumId="4" w15:restartNumberingAfterBreak="0">
+    <w:nsid w:val="372830FB"/>
+    <w:multiLevelType w:val="hybridMultilevel"/>
+    <w:tmpl w:val="938ABDC6"/>
+    <w:lvl w:ilvl="0" w:tplc="1C090001">
+      <w:start w:val="1"/>
+      <w:numFmt w:val="bullet"/>
+      <w:lvlText w:val=""/>
+      <w:lvlJc w:val="left"/>
+      <w:pPr>
+        <w:ind w:left="720" w:hanging="360"/>
+      </w:pPr>
+      <w:rPr>
+        <w:rFonts w:ascii="Symbol" w:hAnsi="Symbol" w:hint="default"/>
+      </w:rPr>
+    </w:lvl>
+    <w:lvl w:ilvl="1" w:tplc="1C090003" w:tentative="1">
+      <w:start w:val="1"/>
+      <w:numFmt w:val="bullet"/>
+      <w:lvlText w:val="o"/>
+      <w:lvlJc w:val="left"/>
+      <w:pPr>
+        <w:ind w:left="1440" w:hanging="360"/>
+      </w:pPr>
+      <w:rPr>
+        <w:rFonts w:ascii="Courier New" w:hAnsi="Courier New" w:cs="Courier New" w:hint="default"/>
+      </w:rPr>
+    </w:lvl>
+    <w:lvl w:ilvl="2" w:tplc="1C090005" w:tentative="1">
+      <w:start w:val="1"/>
+      <w:numFmt w:val="bullet"/>
+      <w:lvlText w:val=""/>
+      <w:lvlJc w:val="left"/>
+      <w:pPr>
+        <w:ind w:left="2160" w:hanging="360"/>
+      </w:pPr>
+      <w:rPr>
+        <w:rFonts w:ascii="Wingdings" w:hAnsi="Wingdings" w:hint="default"/>
+      </w:rPr>
+    </w:lvl>
+    <w:lvl w:ilvl="3" w:tplc="1C090001" w:tentative="1">
+      <w:start w:val="1"/>
+      <w:numFmt w:val="bullet"/>
+      <w:lvlText w:val=""/>
+      <w:lvlJc w:val="left"/>
+      <w:pPr>
+        <w:ind w:left="2880" w:hanging="360"/>
+      </w:pPr>
+      <w:rPr>
+        <w:rFonts w:ascii="Symbol" w:hAnsi="Symbol" w:hint="default"/>
+      </w:rPr>
+    </w:lvl>
+    <w:lvl w:ilvl="4" w:tplc="1C090003" w:tentative="1">
+      <w:start w:val="1"/>
+      <w:numFmt w:val="bullet"/>
+      <w:lvlText w:val="o"/>
+      <w:lvlJc w:val="left"/>
+      <w:pPr>
+        <w:ind w:left="3600" w:hanging="360"/>
+      </w:pPr>
+      <w:rPr>
+        <w:rFonts w:ascii="Courier New" w:hAnsi="Courier New" w:cs="Courier New" w:hint="default"/>
+      </w:rPr>
+    </w:lvl>
+    <w:lvl w:ilvl="5" w:tplc="1C090005" w:tentative="1">
+      <w:start w:val="1"/>
+      <w:numFmt w:val="bullet"/>
+      <w:lvlText w:val=""/>
+      <w:lvlJc w:val="left"/>
+      <w:pPr>
+        <w:ind w:left="4320" w:hanging="360"/>
+      </w:pPr>
+      <w:rPr>
+        <w:rFonts w:ascii="Wingdings" w:hAnsi="Wingdings" w:hint="default"/>
+      </w:rPr>
+    </w:lvl>
+    <w:lvl w:ilvl="6" w:tplc="1C090001" w:tentative="1">
+      <w:start w:val="1"/>
+      <w:numFmt w:val="bullet"/>
+      <w:lvlText w:val=""/>
+      <w:lvlJc w:val="left"/>
+      <w:pPr>
+        <w:ind w:left="5040" w:hanging="360"/>
+      </w:pPr>
+      <w:rPr>
+        <w:rFonts w:ascii="Symbol" w:hAnsi="Symbol" w:hint="default"/>
+      </w:rPr>
+    </w:lvl>
+    <w:lvl w:ilvl="7" w:tplc="1C090003" w:tentative="1">
+      <w:start w:val="1"/>
+      <w:numFmt w:val="bullet"/>
+      <w:lvlText w:val="o"/>
+      <w:lvlJc w:val="left"/>
+      <w:pPr>
+        <w:ind w:left="5760" w:hanging="360"/>
+      </w:pPr>
+      <w:rPr>
+        <w:rFonts w:ascii="Courier New" w:hAnsi="Courier New" w:cs="Courier New" w:hint="default"/>
+      </w:rPr>
+    </w:lvl>
+    <w:lvl w:ilvl="8" w:tplc="1C090005" w:tentative="1">
+      <w:start w:val="1"/>
+      <w:numFmt w:val="bullet"/>
+      <w:lvlText w:val=""/>
+      <w:lvlJc w:val="left"/>
+      <w:pPr>
+        <w:ind w:left="6480" w:hanging="360"/>
+      </w:pPr>
+      <w:rPr>
+        <w:rFonts w:ascii="Wingdings" w:hAnsi="Wingdings" w:hint="default"/>
+      </w:rPr>
+    </w:lvl>
+  </w:abstractNum>
+  <w:abstractNum w:abstractNumId="5" w15:restartNumberingAfterBreak="0">
     <w:nsid w:val="45840BFE"/>
     <w:multiLevelType w:val="hybridMultilevel"/>
     <w:tmpl w:val="6CA0A4B4"/>
@@ -10473,7 +12907,7 @@
       </w:pPr>
     </w:lvl>
   </w:abstractNum>
-  <w:abstractNum w:abstractNumId="3" w15:restartNumberingAfterBreak="0">
+  <w:abstractNum w:abstractNumId="6" w15:restartNumberingAfterBreak="0">
     <w:nsid w:val="459D4D5E"/>
     <w:multiLevelType w:val="hybridMultilevel"/>
     <w:tmpl w:val="CAAE1AFA"/>
@@ -10559,7 +12993,7 @@
       </w:pPr>
     </w:lvl>
   </w:abstractNum>
-  <w:abstractNum w:abstractNumId="4" w15:restartNumberingAfterBreak="0">
+  <w:abstractNum w:abstractNumId="7" w15:restartNumberingAfterBreak="0">
     <w:nsid w:val="4DF035E8"/>
     <w:multiLevelType w:val="hybridMultilevel"/>
     <w:tmpl w:val="88BE7C5A"/>
@@ -10650,7 +13084,7 @@
       </w:pPr>
     </w:lvl>
   </w:abstractNum>
-  <w:abstractNum w:abstractNumId="5" w15:restartNumberingAfterBreak="0">
+  <w:abstractNum w:abstractNumId="8" w15:restartNumberingAfterBreak="0">
     <w:nsid w:val="56083678"/>
     <w:multiLevelType w:val="hybridMultilevel"/>
     <w:tmpl w:val="D4F0A8E6"/>
@@ -10736,7 +13170,7 @@
       </w:pPr>
     </w:lvl>
   </w:abstractNum>
-  <w:abstractNum w:abstractNumId="6" w15:restartNumberingAfterBreak="0">
+  <w:abstractNum w:abstractNumId="9" w15:restartNumberingAfterBreak="0">
     <w:nsid w:val="5D234AFE"/>
     <w:multiLevelType w:val="hybridMultilevel"/>
     <w:tmpl w:val="95E037AA"/>
@@ -10825,7 +13259,7 @@
       </w:pPr>
     </w:lvl>
   </w:abstractNum>
-  <w:abstractNum w:abstractNumId="7" w15:restartNumberingAfterBreak="0">
+  <w:abstractNum w:abstractNumId="10" w15:restartNumberingAfterBreak="0">
     <w:nsid w:val="5DC47F47"/>
     <w:multiLevelType w:val="hybridMultilevel"/>
     <w:tmpl w:val="2E864AEC"/>
@@ -10915,7 +13349,96 @@
       </w:pPr>
     </w:lvl>
   </w:abstractNum>
-  <w:abstractNum w:abstractNumId="8" w15:restartNumberingAfterBreak="0">
+  <w:abstractNum w:abstractNumId="11" w15:restartNumberingAfterBreak="0">
+    <w:nsid w:val="5DEC0319"/>
+    <w:multiLevelType w:val="hybridMultilevel"/>
+    <w:tmpl w:val="C41E29EA"/>
+    <w:lvl w:ilvl="0" w:tplc="10DE6E26">
+      <w:start w:val="1"/>
+      <w:numFmt w:val="decimal"/>
+      <w:lvlText w:val="%1."/>
+      <w:lvlJc w:val="left"/>
+      <w:pPr>
+        <w:ind w:left="720" w:hanging="360"/>
+      </w:pPr>
+      <w:rPr>
+        <w:rFonts w:hint="default"/>
+      </w:rPr>
+    </w:lvl>
+    <w:lvl w:ilvl="1" w:tplc="1C090019" w:tentative="1">
+      <w:start w:val="1"/>
+      <w:numFmt w:val="lowerLetter"/>
+      <w:lvlText w:val="%2."/>
+      <w:lvlJc w:val="left"/>
+      <w:pPr>
+        <w:ind w:left="1440" w:hanging="360"/>
+      </w:pPr>
+    </w:lvl>
+    <w:lvl w:ilvl="2" w:tplc="1C09001B" w:tentative="1">
+      <w:start w:val="1"/>
+      <w:numFmt w:val="lowerRoman"/>
+      <w:lvlText w:val="%3."/>
+      <w:lvlJc w:val="right"/>
+      <w:pPr>
+        <w:ind w:left="2160" w:hanging="180"/>
+      </w:pPr>
+    </w:lvl>
+    <w:lvl w:ilvl="3" w:tplc="1C09000F" w:tentative="1">
+      <w:start w:val="1"/>
+      <w:numFmt w:val="decimal"/>
+      <w:lvlText w:val="%4."/>
+      <w:lvlJc w:val="left"/>
+      <w:pPr>
+        <w:ind w:left="2880" w:hanging="360"/>
+      </w:pPr>
+    </w:lvl>
+    <w:lvl w:ilvl="4" w:tplc="1C090019" w:tentative="1">
+      <w:start w:val="1"/>
+      <w:numFmt w:val="lowerLetter"/>
+      <w:lvlText w:val="%5."/>
+      <w:lvlJc w:val="left"/>
+      <w:pPr>
+        <w:ind w:left="3600" w:hanging="360"/>
+      </w:pPr>
+    </w:lvl>
+    <w:lvl w:ilvl="5" w:tplc="1C09001B" w:tentative="1">
+      <w:start w:val="1"/>
+      <w:numFmt w:val="lowerRoman"/>
+      <w:lvlText w:val="%6."/>
+      <w:lvlJc w:val="right"/>
+      <w:pPr>
+        <w:ind w:left="4320" w:hanging="180"/>
+      </w:pPr>
+    </w:lvl>
+    <w:lvl w:ilvl="6" w:tplc="1C09000F" w:tentative="1">
+      <w:start w:val="1"/>
+      <w:numFmt w:val="decimal"/>
+      <w:lvlText w:val="%7."/>
+      <w:lvlJc w:val="left"/>
+      <w:pPr>
+        <w:ind w:left="5040" w:hanging="360"/>
+      </w:pPr>
+    </w:lvl>
+    <w:lvl w:ilvl="7" w:tplc="1C090019" w:tentative="1">
+      <w:start w:val="1"/>
+      <w:numFmt w:val="lowerLetter"/>
+      <w:lvlText w:val="%8."/>
+      <w:lvlJc w:val="left"/>
+      <w:pPr>
+        <w:ind w:left="5760" w:hanging="360"/>
+      </w:pPr>
+    </w:lvl>
+    <w:lvl w:ilvl="8" w:tplc="1C09001B" w:tentative="1">
+      <w:start w:val="1"/>
+      <w:numFmt w:val="lowerRoman"/>
+      <w:lvlText w:val="%9."/>
+      <w:lvlJc w:val="right"/>
+      <w:pPr>
+        <w:ind w:left="6480" w:hanging="180"/>
+      </w:pPr>
+    </w:lvl>
+  </w:abstractNum>
+  <w:abstractNum w:abstractNumId="12" w15:restartNumberingAfterBreak="0">
     <w:nsid w:val="62300E95"/>
     <w:multiLevelType w:val="hybridMultilevel"/>
     <w:tmpl w:val="307A3C3E"/>
@@ -11028,7 +13551,7 @@
       </w:rPr>
     </w:lvl>
   </w:abstractNum>
-  <w:abstractNum w:abstractNumId="9" w15:restartNumberingAfterBreak="0">
+  <w:abstractNum w:abstractNumId="13" w15:restartNumberingAfterBreak="0">
     <w:nsid w:val="73607137"/>
     <w:multiLevelType w:val="hybridMultilevel"/>
     <w:tmpl w:val="49A24B18"/>
@@ -11142,40 +13665,52 @@
     </w:lvl>
   </w:abstractNum>
   <w:num w:numId="1" w16cid:durableId="762185233">
+    <w:abstractNumId w:val="2"/>
+  </w:num>
+  <w:num w:numId="2" w16cid:durableId="594167089">
     <w:abstractNumId w:val="1"/>
   </w:num>
-  <w:num w:numId="2" w16cid:durableId="594167089">
+  <w:num w:numId="3" w16cid:durableId="298800243">
+    <w:abstractNumId w:val="12"/>
+  </w:num>
+  <w:num w:numId="4" w16cid:durableId="611594820">
+    <w:abstractNumId w:val="10"/>
+  </w:num>
+  <w:num w:numId="5" w16cid:durableId="1049187053">
+    <w:abstractNumId w:val="7"/>
+  </w:num>
+  <w:num w:numId="6" w16cid:durableId="1314800746">
+    <w:abstractNumId w:val="13"/>
+  </w:num>
+  <w:num w:numId="7" w16cid:durableId="1117019206">
+    <w:abstractNumId w:val="5"/>
+  </w:num>
+  <w:num w:numId="8" w16cid:durableId="1110468299">
+    <w:abstractNumId w:val="6"/>
+  </w:num>
+  <w:num w:numId="9" w16cid:durableId="346904853">
+    <w:abstractNumId w:val="8"/>
+  </w:num>
+  <w:num w:numId="10" w16cid:durableId="303849309">
+    <w:abstractNumId w:val="9"/>
+  </w:num>
+  <w:num w:numId="11" w16cid:durableId="1275746818">
+    <w:abstractNumId w:val="4"/>
+  </w:num>
+  <w:num w:numId="12" w16cid:durableId="593976114">
     <w:abstractNumId w:val="0"/>
   </w:num>
-  <w:num w:numId="3" w16cid:durableId="298800243">
-    <w:abstractNumId w:val="8"/>
+  <w:num w:numId="13" w16cid:durableId="1805929515">
+    <w:abstractNumId w:val="11"/>
   </w:num>
-  <w:num w:numId="4" w16cid:durableId="611594820">
-    <w:abstractNumId w:val="7"/>
-  </w:num>
-  <w:num w:numId="5" w16cid:durableId="1049187053">
-    <w:abstractNumId w:val="4"/>
-  </w:num>
-  <w:num w:numId="6" w16cid:durableId="1314800746">
-    <w:abstractNumId w:val="9"/>
-  </w:num>
-  <w:num w:numId="7" w16cid:durableId="1117019206">
-    <w:abstractNumId w:val="2"/>
-  </w:num>
-  <w:num w:numId="8" w16cid:durableId="1110468299">
+  <w:num w:numId="14" w16cid:durableId="1446386783">
     <w:abstractNumId w:val="3"/>
-  </w:num>
-  <w:num w:numId="9" w16cid:durableId="346904853">
-    <w:abstractNumId w:val="5"/>
-  </w:num>
-  <w:num w:numId="10" w16cid:durableId="303849309">
-    <w:abstractNumId w:val="6"/>
   </w:num>
 </w:numbering>
 </file>
 
 <file path=word/styles.xml><?xml version="1.0" encoding="utf-8"?>
-<w:styles xmlns:mc="http://schemas.openxmlformats.org/markup-compatibility/2006" xmlns:r="http://schemas.openxmlformats.org/officeDocument/2006/relationships" xmlns:w="http://schemas.openxmlformats.org/wordprocessingml/2006/main" xmlns:w14="http://schemas.microsoft.com/office/word/2010/wordml" xmlns:w15="http://schemas.microsoft.com/office/word/2012/wordml" xmlns:w16cex="http://schemas.microsoft.com/office/word/2018/wordml/cex" xmlns:w16cid="http://schemas.microsoft.com/office/word/2016/wordml/cid" xmlns:w16="http://schemas.microsoft.com/office/word/2018/wordml" xmlns:w16sdtdh="http://schemas.microsoft.com/office/word/2020/wordml/sdtdatahash" xmlns:w16se="http://schemas.microsoft.com/office/word/2015/wordml/symex" mc:Ignorable="w14 w15 w16se w16cid w16 w16cex w16sdtdh">
+<w:styles xmlns:mc="http://schemas.openxmlformats.org/markup-compatibility/2006" xmlns:r="http://schemas.openxmlformats.org/officeDocument/2006/relationships" xmlns:w="http://schemas.openxmlformats.org/wordprocessingml/2006/main" xmlns:w14="http://schemas.microsoft.com/office/word/2010/wordml" xmlns:w15="http://schemas.microsoft.com/office/word/2012/wordml" xmlns:w16cex="http://schemas.microsoft.com/office/word/2018/wordml/cex" xmlns:w16cid="http://schemas.microsoft.com/office/word/2016/wordml/cid" xmlns:w16="http://schemas.microsoft.com/office/word/2018/wordml" xmlns:w16du="http://schemas.microsoft.com/office/word/2023/wordml/word16du" xmlns:w16sdtdh="http://schemas.microsoft.com/office/word/2020/wordml/sdtdatahash" xmlns:w16sdtfl="http://schemas.microsoft.com/office/word/2024/wordml/sdtformatlock" xmlns:w16se="http://schemas.microsoft.com/office/word/2015/wordml/symex" mc:Ignorable="w14 w15 w16se w16cid w16 w16cex w16sdtdh w16sdtfl w16du">
   <w:docDefaults>
     <w:rPrDefault>
       <w:rPr>
@@ -11605,6 +14140,28 @@
       <w:szCs w:val="32"/>
     </w:rPr>
   </w:style>
+  <w:style w:type="paragraph" w:styleId="Heading2">
+    <w:name w:val="heading 2"/>
+    <w:basedOn w:val="Normal"/>
+    <w:next w:val="Normal"/>
+    <w:link w:val="Heading2Char"/>
+    <w:uiPriority w:val="9"/>
+    <w:unhideWhenUsed/>
+    <w:qFormat/>
+    <w:rsid w:val="004A6E39"/>
+    <w:pPr>
+      <w:keepNext/>
+      <w:keepLines/>
+      <w:spacing w:before="40"/>
+      <w:outlineLvl w:val="1"/>
+    </w:pPr>
+    <w:rPr>
+      <w:rFonts w:asciiTheme="majorHAnsi" w:eastAsiaTheme="majorEastAsia" w:hAnsiTheme="majorHAnsi" w:cstheme="majorBidi"/>
+      <w:color w:val="2F5496" w:themeColor="accent1" w:themeShade="BF"/>
+      <w:sz w:val="26"/>
+      <w:szCs w:val="26"/>
+    </w:rPr>
+  </w:style>
   <w:style w:type="character" w:default="1" w:styleId="DefaultParagraphFont">
     <w:name w:val="Default Paragraph Font"/>
     <w:uiPriority w:val="1"/>
@@ -11944,6 +14501,20 @@
       <w:color w:val="666666"/>
     </w:rPr>
   </w:style>
+  <w:style w:type="character" w:customStyle="1" w:styleId="Heading2Char">
+    <w:name w:val="Heading 2 Char"/>
+    <w:basedOn w:val="DefaultParagraphFont"/>
+    <w:link w:val="Heading2"/>
+    <w:uiPriority w:val="9"/>
+    <w:rsid w:val="004A6E39"/>
+    <w:rPr>
+      <w:rFonts w:asciiTheme="majorHAnsi" w:eastAsiaTheme="majorEastAsia" w:hAnsiTheme="majorHAnsi" w:cstheme="majorBidi"/>
+      <w:color w:val="2F5496" w:themeColor="accent1" w:themeShade="BF"/>
+      <w:sz w:val="26"/>
+      <w:szCs w:val="26"/>
+      <w:lang w:eastAsia="en-ZA"/>
+    </w:rPr>
+  </w:style>
 </w:styles>
 </file>
 
@@ -12243,6 +14814,15 @@
 </file>
 
 <file path=customXml/item1.xml><?xml version="1.0" encoding="utf-8"?>
+<?mso-contentType ?>
+<FormTemplates xmlns="http://schemas.microsoft.com/sharepoint/v3/contenttype/forms">
+  <Display>DocumentLibraryForm</Display>
+  <Edit>DocumentLibraryForm</Edit>
+  <New>DocumentLibraryForm</New>
+</FormTemplates>
+</file>
+
+<file path=customXml/item2.xml><?xml version="1.0" encoding="utf-8"?>
 <ct:contentTypeSchema xmlns:ct="http://schemas.microsoft.com/office/2006/metadata/contentType" xmlns:ma="http://schemas.microsoft.com/office/2006/metadata/properties/metaAttributes" ct:_="" ma:_="" ma:contentTypeName="Document" ma:contentTypeID="0x010100663712DCE29D0945B25F4C5A40C282BF" ma:contentTypeVersion="12" ma:contentTypeDescription="Create a new document." ma:contentTypeScope="" ma:versionID="fcfa37499a7459845d01f12cf1c09b9b">
   <xsd:schema xmlns:xsd="http://www.w3.org/2001/XMLSchema" xmlns:xs="http://www.w3.org/2001/XMLSchema" xmlns:p="http://schemas.microsoft.com/office/2006/metadata/properties" xmlns:ns2="49b67118-50a5-4d3e-89b7-9848e8a6257b" xmlns:ns3="876e04ec-c44d-45fb-a45b-87644b3a9fdd" targetNamespace="http://schemas.microsoft.com/office/2006/metadata/properties" ma:root="true" ma:fieldsID="4a0dc762b5d20e9128f6e5959d8fc2f5" ns2:_="" ns3:_="">
     <xsd:import namespace="49b67118-50a5-4d3e-89b7-9848e8a6257b"/>
@@ -12437,11 +15017,11 @@
 </ct:contentTypeSchema>
 </file>
 
-<file path=customXml/item2.xml><?xml version="1.0" encoding="utf-8"?>
+<file path=customXml/item3.xml><?xml version="1.0" encoding="utf-8"?>
 <b:Sources xmlns:b="http://schemas.openxmlformats.org/officeDocument/2006/bibliography" xmlns="http://schemas.openxmlformats.org/officeDocument/2006/bibliography" SelectedStyle="\APASixthEditionOfficeOnline.xsl" StyleName="APA" Version="6"/>
 </file>
 
-<file path=customXml/item3.xml><?xml version="1.0" encoding="utf-8"?>
+<file path=customXml/item4.xml><?xml version="1.0" encoding="utf-8"?>
 <p:properties xmlns:p="http://schemas.microsoft.com/office/2006/metadata/properties" xmlns:xsi="http://www.w3.org/2001/XMLSchema-instance" xmlns:pc="http://schemas.microsoft.com/office/infopath/2007/PartnerControls">
   <documentManagement>
     <lcf76f155ced4ddcb4097134ff3c332f xmlns="49b67118-50a5-4d3e-89b7-9848e8a6257b">
@@ -12452,16 +15032,15 @@
 </p:properties>
 </file>
 
-<file path=customXml/item4.xml><?xml version="1.0" encoding="utf-8"?>
-<?mso-contentType ?>
-<FormTemplates xmlns="http://schemas.microsoft.com/sharepoint/v3/contenttype/forms">
-  <Display>DocumentLibraryForm</Display>
-  <Edit>DocumentLibraryForm</Edit>
-  <New>DocumentLibraryForm</New>
-</FormTemplates>
+<file path=customXml/itemProps1.xml><?xml version="1.0" encoding="utf-8"?>
+<ds:datastoreItem xmlns:ds="http://schemas.openxmlformats.org/officeDocument/2006/customXml" ds:itemID="{A0C1A221-436E-42DA-97DA-47502C48A139}">
+  <ds:schemaRefs>
+    <ds:schemaRef ds:uri="http://schemas.microsoft.com/sharepoint/v3/contenttype/forms"/>
+  </ds:schemaRefs>
+</ds:datastoreItem>
 </file>
 
-<file path=customXml/itemProps1.xml><?xml version="1.0" encoding="utf-8"?>
+<file path=customXml/itemProps2.xml><?xml version="1.0" encoding="utf-8"?>
 <ds:datastoreItem xmlns:ds="http://schemas.openxmlformats.org/officeDocument/2006/customXml" ds:itemID="{EE464A99-880F-4ABD-8281-73BDBD33F722}">
   <ds:schemaRefs>
     <ds:schemaRef ds:uri="http://schemas.microsoft.com/office/2006/metadata/contentType"/>
@@ -12480,7 +15059,7 @@
 </ds:datastoreItem>
 </file>
 
-<file path=customXml/itemProps2.xml><?xml version="1.0" encoding="utf-8"?>
+<file path=customXml/itemProps3.xml><?xml version="1.0" encoding="utf-8"?>
 <ds:datastoreItem xmlns:ds="http://schemas.openxmlformats.org/officeDocument/2006/customXml" ds:itemID="{35695F99-B626-4191-B469-724B0EB6D6EA}">
   <ds:schemaRefs>
     <ds:schemaRef ds:uri="http://schemas.openxmlformats.org/officeDocument/2006/bibliography"/>
@@ -12488,27 +15067,13 @@
 </ds:datastoreItem>
 </file>
 
-<file path=customXml/itemProps3.xml><?xml version="1.0" encoding="utf-8"?>
+<file path=customXml/itemProps4.xml><?xml version="1.0" encoding="utf-8"?>
 <ds:datastoreItem xmlns:ds="http://schemas.openxmlformats.org/officeDocument/2006/customXml" ds:itemID="{F0FA16F4-B3B5-4912-B9B6-0EFF6DB2AB2E}">
   <ds:schemaRefs>
-    <ds:schemaRef ds:uri="http://schemas.microsoft.com/office/2006/documentManagement/types"/>
-    <ds:schemaRef ds:uri="http://purl.org/dc/dcmitype/"/>
-    <ds:schemaRef ds:uri="http://purl.org/dc/terms/"/>
-    <ds:schemaRef ds:uri="http://schemas.openxmlformats.org/package/2006/metadata/core-properties"/>
+    <ds:schemaRef ds:uri="http://schemas.microsoft.com/office/2006/metadata/properties"/>
+    <ds:schemaRef ds:uri="http://schemas.microsoft.com/office/infopath/2007/PartnerControls"/>
     <ds:schemaRef ds:uri="49b67118-50a5-4d3e-89b7-9848e8a6257b"/>
-    <ds:schemaRef ds:uri="http://schemas.microsoft.com/office/2006/metadata/properties"/>
-    <ds:schemaRef ds:uri="http://purl.org/dc/elements/1.1/"/>
-    <ds:schemaRef ds:uri="http://www.w3.org/XML/1998/namespace"/>
     <ds:schemaRef ds:uri="876e04ec-c44d-45fb-a45b-87644b3a9fdd"/>
-    <ds:schemaRef ds:uri="http://schemas.microsoft.com/office/infopath/2007/PartnerControls"/>
-  </ds:schemaRefs>
-</ds:datastoreItem>
-</file>
-
-<file path=customXml/itemProps4.xml><?xml version="1.0" encoding="utf-8"?>
-<ds:datastoreItem xmlns:ds="http://schemas.openxmlformats.org/officeDocument/2006/customXml" ds:itemID="{A0C1A221-436E-42DA-97DA-47502C48A139}">
-  <ds:schemaRefs>
-    <ds:schemaRef ds:uri="http://schemas.microsoft.com/sharepoint/v3/contenttype/forms"/>
   </ds:schemaRefs>
 </ds:datastoreItem>
 </file>
</xml_diff>